<commit_message>
Implement numbering into para style resolve but wait for override levels implement
</commit_message>
<xml_diff>
--- a/tests/examples/List.docx
+++ b/tests/examples/List.docx
@@ -6,12 +6,14 @@
       <w:pPr>
         <w:pStyle w:val="Num2"/>
       </w:pPr>
+      <w:proofErr w:type="spellStart"/>
       <w:r>
         <w:rPr>
           <w:lang w:val="en-US"/>
         </w:rPr>
         <w:t>fd</w:t>
       </w:r>
+      <w:proofErr w:type="spellEnd"/>
     </w:p>
     <w:p>
       <w:pPr>
@@ -21,7 +23,15 @@
         <w:rPr>
           <w:lang w:val="en-US"/>
         </w:rPr>
-        <w:t>Low</w:t>
+        <w:t>Lo</w:t>
+      </w:r>
+      <w:bookmarkStart w:id="0" w:name="_GoBack"/>
+      <w:bookmarkEnd w:id="0"/>
+      <w:r>
+        <w:rPr>
+          <w:lang w:val="en-US"/>
+        </w:rPr>
+        <w:t>w</w:t>
       </w:r>
     </w:p>
     <w:p>
@@ -32,14 +42,14 @@
           <w:numId w:val="6"/>
         </w:numPr>
       </w:pPr>
+      <w:proofErr w:type="spellStart"/>
       <w:r>
         <w:rPr>
           <w:lang w:val="en-US"/>
         </w:rPr>
         <w:t>HaHa</w:t>
       </w:r>
-      <w:bookmarkStart w:id="0" w:name="_GoBack"/>
-      <w:bookmarkEnd w:id="0"/>
+      <w:proofErr w:type="spellEnd"/>
     </w:p>
     <w:sectPr>
       <w:pgSz w:w="11906" w:h="16838"/>
@@ -912,12 +922,15 @@
     <w:name w:val="NumberedParaStyle"/>
     <w:basedOn w:val="a"/>
     <w:qFormat/>
-    <w:rsid w:val="00784CE5"/>
+    <w:rsid w:val="00CA4F12"/>
     <w:pPr>
       <w:numPr>
         <w:numId w:val="3"/>
       </w:numPr>
     </w:pPr>
+    <w:rPr>
+      <w:i/>
+    </w:rPr>
   </w:style>
   <w:style w:type="numbering" w:customStyle="1" w:styleId="NumStylishHidden">
     <w:name w:val="NumStylishHidden"/>

</xml_diff>

<commit_message>
Add header level and display method for paragraph
</commit_message>
<xml_diff>
--- a/tests/examples/List.docx
+++ b/tests/examples/List.docx
@@ -23,7 +23,15 @@
         <w:rPr>
           <w:lang w:val="en-US"/>
         </w:rPr>
-        <w:t>Low</w:t>
+        <w:t>Lo</w:t>
+      </w:r>
+      <w:bookmarkStart w:id="0" w:name="_GoBack"/>
+      <w:bookmarkEnd w:id="0"/>
+      <w:r>
+        <w:rPr>
+          <w:lang w:val="en-US"/>
+        </w:rPr>
+        <w:t>w</w:t>
       </w:r>
     </w:p>
     <w:p>
@@ -56,8 +64,6 @@
         </w:rPr>
         <w:t>Override</w:t>
       </w:r>
-      <w:bookmarkStart w:id="0" w:name="_GoBack"/>
-      <w:bookmarkEnd w:id="0"/>
     </w:p>
     <w:sectPr>
       <w:pgSz w:w="11906" w:h="16838"/>
@@ -585,12 +591,13 @@
     <w:lvlOverride w:ilvl="0">
       <w:lvl w:ilvl="0">
         <w:start w:val="4"/>
-        <w:lvlText w:val="%1)"/>
-        <w:lvlJc w:val="start"/>
+        <w:numFmt w:val="decimal"/>
         <w:pStyle w:val="NumberedParaStyle"/>
         <w:isLgl/>
+        <w:lvlText w:val="%1)"/>
+        <w:lvlJc w:val="left"/>
         <w:pPr>
-          <w:ind w:start="360" w:hanging="360"/>
+          <w:ind w:left="360" w:hanging="360"/>
         </w:pPr>
       </w:lvl>
     </w:lvlOverride>
@@ -1062,11 +1069,14 @@
     <w:name w:val="NumberedParaStyle"/>
     <w:basedOn w:val="a"/>
     <w:qFormat/>
-    <w:rsid w:val="00CA4F12"/>
+    <w:rsid w:val="00EC6B61"/>
     <w:pPr>
       <w:numPr>
         <w:numId w:val="7"/>
       </w:numPr>
+      <w:spacing w:line="257" w:lineRule="auto"/>
+      <w:ind w:left="357" w:hanging="357"/>
+      <w:outlineLvl w:val="4"/>
     </w:pPr>
     <w:rPr>
       <w:i/>

</xml_diff>

<commit_message>
Fix resolving for paragraph
</commit_message>
<xml_diff>
--- a/tests/examples/List.docx
+++ b/tests/examples/List.docx
@@ -588,19 +588,6 @@
   </w:num>
   <w:num w:numId="7">
     <w:abstractNumId w:val="0"/>
-    <w:lvlOverride w:ilvl="0">
-      <w:lvl w:ilvl="0">
-        <w:start w:val="4"/>
-        <w:numFmt w:val="decimal"/>
-        <w:pStyle w:val="NumberedParaStyle"/>
-        <w:isLgl/>
-        <w:lvlText w:val="%1)"/>
-        <w:lvlJc w:val="left"/>
-        <w:pPr>
-          <w:ind w:left="360" w:hanging="360"/>
-        </w:pPr>
-      </w:lvl>
-    </w:lvlOverride>
   </w:num>
 </w:numbering>
 </file>

</xml_diff>

<commit_message>
refac and add jc
</commit_message>
<xml_diff>
--- a/tests/examples/List.docx
+++ b/tests/examples/List.docx
@@ -17,10 +17,8 @@
         </w:rPr>
         <w:t>fd</w:t>
       </w:r>
-      <w:bookmarkStart w:id="0" w:name="_GoBack"/>
       <w:proofErr w:type="spellEnd"/>
     </w:p>
-    <w:bookmarkEnd w:id="0"/>
     <w:p>
       <w:pPr>
         <w:pStyle w:val="NumberedParaStyle"/>
@@ -40,13 +38,22 @@
           <w:ilvl w:val="0"/>
           <w:numId w:val="6"/>
         </w:numPr>
+        <w:jc w:val="right"/>
       </w:pPr>
       <w:proofErr w:type="spellStart"/>
       <w:r>
         <w:rPr>
           <w:lang w:val="en-US"/>
         </w:rPr>
-        <w:t>HaHa</w:t>
+        <w:t>HaH</w:t>
+      </w:r>
+      <w:bookmarkStart w:id="0" w:name="_GoBack"/>
+      <w:bookmarkEnd w:id="0"/>
+      <w:r>
+        <w:rPr>
+          <w:lang w:val="en-US"/>
+        </w:rPr>
+        <w:t>a</w:t>
       </w:r>
       <w:proofErr w:type="spellEnd"/>
     </w:p>
@@ -230,12 +237,6 @@
     </w:lvl>
   </w:abstractNum>
   <w:abstractNum w:abstractNumId="1" w15:restartNumberingAfterBreak="0">
-    <w:nsid w:val="04A01843"/>
-    <w:multiLevelType w:val="multilevel"/>
-    <w:tmpl w:val="51989446"/>
-    <w:numStyleLink w:val="NumStylishHidden"/>
-  </w:abstractNum>
-  <w:abstractNum w:abstractNumId="2" w15:restartNumberingAfterBreak="0">
     <w:nsid w:val="1F566D18"/>
     <w:multiLevelType w:val="multilevel"/>
     <w:tmpl w:val="51989446"/>
@@ -326,7 +327,7 @@
       </w:pPr>
     </w:lvl>
   </w:abstractNum>
-  <w:abstractNum w:abstractNumId="3" w15:restartNumberingAfterBreak="0">
+  <w:abstractNum w:abstractNumId="2" w15:restartNumberingAfterBreak="0">
     <w:nsid w:val="3A0505E3"/>
     <w:multiLevelType w:val="multilevel"/>
     <w:tmpl w:val="0419001D"/>
@@ -417,11 +418,29 @@
       </w:pPr>
     </w:lvl>
   </w:abstractNum>
+  <w:abstractNum w:abstractNumId="3" w15:restartNumberingAfterBreak="0">
+    <w:nsid w:val="6FEC0537"/>
+    <w:multiLevelType w:val="singleLevel"/>
+    <w:tmpl w:val="B89E20F0"/>
+    <w:lvl w:ilvl="0">
+      <w:start w:val="1"/>
+      <w:numFmt w:val="decimal"/>
+      <w:lvlText w:val="%1."/>
+      <w:lvlJc w:val="right"/>
+      <w:pPr>
+        <w:ind w:left="720" w:hanging="360"/>
+      </w:pPr>
+      <w:rPr>
+        <w:rFonts w:hint="default"/>
+        <w:b/>
+      </w:rPr>
+    </w:lvl>
+  </w:abstractNum>
   <w:abstractNum w:abstractNumId="4" w15:restartNumberingAfterBreak="0">
     <w:nsid w:val="781C147C"/>
     <w:multiLevelType w:val="hybridMultilevel"/>
     <w:tmpl w:val="8880048C"/>
-    <w:lvl w:ilvl="0" w:tplc="B7C2235E">
+    <w:lvl w:ilvl="0">
       <w:start w:val="1"/>
       <w:numFmt w:val="lowerRoman"/>
       <w:lvlText w:val="%1.Hello"/>
@@ -433,7 +452,7 @@
         <w:rFonts w:hint="default"/>
       </w:rPr>
     </w:lvl>
-    <w:lvl w:ilvl="1" w:tplc="04190019" w:tentative="1">
+    <w:lvl w:ilvl="1" w:tentative="1">
       <w:start w:val="1"/>
       <w:numFmt w:val="lowerLetter"/>
       <w:lvlText w:val="%2."/>
@@ -442,7 +461,7 @@
         <w:ind w:left="1440" w:hanging="360"/>
       </w:pPr>
     </w:lvl>
-    <w:lvl w:ilvl="2" w:tplc="0419001B" w:tentative="1">
+    <w:lvl w:ilvl="2" w:tentative="1">
       <w:start w:val="1"/>
       <w:numFmt w:val="lowerRoman"/>
       <w:lvlText w:val="%3."/>
@@ -451,7 +470,7 @@
         <w:ind w:left="2160" w:hanging="180"/>
       </w:pPr>
     </w:lvl>
-    <w:lvl w:ilvl="3" w:tplc="0419000F" w:tentative="1">
+    <w:lvl w:ilvl="3" w:tentative="1">
       <w:start w:val="1"/>
       <w:numFmt w:val="decimal"/>
       <w:lvlText w:val="%4."/>
@@ -460,7 +479,7 @@
         <w:ind w:left="2880" w:hanging="360"/>
       </w:pPr>
     </w:lvl>
-    <w:lvl w:ilvl="4" w:tplc="04190019" w:tentative="1">
+    <w:lvl w:ilvl="4" w:tentative="1">
       <w:start w:val="1"/>
       <w:numFmt w:val="lowerLetter"/>
       <w:lvlText w:val="%5."/>
@@ -469,7 +488,7 @@
         <w:ind w:left="3600" w:hanging="360"/>
       </w:pPr>
     </w:lvl>
-    <w:lvl w:ilvl="5" w:tplc="0419001B" w:tentative="1">
+    <w:lvl w:ilvl="5" w:tentative="1">
       <w:start w:val="1"/>
       <w:numFmt w:val="lowerRoman"/>
       <w:lvlText w:val="%6."/>
@@ -478,7 +497,7 @@
         <w:ind w:left="4320" w:hanging="180"/>
       </w:pPr>
     </w:lvl>
-    <w:lvl w:ilvl="6" w:tplc="0419000F" w:tentative="1">
+    <w:lvl w:ilvl="6" w:tentative="1">
       <w:start w:val="1"/>
       <w:numFmt w:val="decimal"/>
       <w:lvlText w:val="%7."/>
@@ -487,7 +506,7 @@
         <w:ind w:left="5040" w:hanging="360"/>
       </w:pPr>
     </w:lvl>
-    <w:lvl w:ilvl="7" w:tplc="04190019" w:tentative="1">
+    <w:lvl w:ilvl="7" w:tentative="1">
       <w:start w:val="1"/>
       <w:numFmt w:val="lowerLetter"/>
       <w:lvlText w:val="%8."/>
@@ -496,7 +515,7 @@
         <w:ind w:left="5760" w:hanging="360"/>
       </w:pPr>
     </w:lvl>
-    <w:lvl w:ilvl="8" w:tplc="0419001B" w:tentative="1">
+    <w:lvl w:ilvl="8" w:tentative="1">
       <w:start w:val="1"/>
       <w:numFmt w:val="lowerRoman"/>
       <w:lvlText w:val="%9."/>
@@ -516,7 +535,7 @@
     <w:nsid w:val="79906D31"/>
     <w:multiLevelType w:val="hybridMultilevel"/>
     <w:tmpl w:val="7D025886"/>
-    <w:lvl w:ilvl="0" w:tplc="7542E44C">
+    <w:lvl w:ilvl="0">
       <w:start w:val="1"/>
       <w:numFmt w:val="ordinal"/>
       <w:pStyle w:val="Num"/>
@@ -529,7 +548,7 @@
         <w:rFonts w:hint="default"/>
       </w:rPr>
     </w:lvl>
-    <w:lvl w:ilvl="1" w:tplc="04190019" w:tentative="1">
+    <w:lvl w:ilvl="1" w:tentative="1">
       <w:start w:val="1"/>
       <w:numFmt w:val="lowerLetter"/>
       <w:lvlText w:val="%2."/>
@@ -538,7 +557,7 @@
         <w:ind w:left="1440" w:hanging="360"/>
       </w:pPr>
     </w:lvl>
-    <w:lvl w:ilvl="2" w:tplc="0419001B" w:tentative="1">
+    <w:lvl w:ilvl="2" w:tentative="1">
       <w:start w:val="1"/>
       <w:numFmt w:val="lowerRoman"/>
       <w:lvlText w:val="%3."/>
@@ -547,7 +566,7 @@
         <w:ind w:left="2160" w:hanging="180"/>
       </w:pPr>
     </w:lvl>
-    <w:lvl w:ilvl="3" w:tplc="0419000F" w:tentative="1">
+    <w:lvl w:ilvl="3" w:tentative="1">
       <w:start w:val="1"/>
       <w:numFmt w:val="decimal"/>
       <w:lvlText w:val="%4."/>
@@ -556,7 +575,7 @@
         <w:ind w:left="2880" w:hanging="360"/>
       </w:pPr>
     </w:lvl>
-    <w:lvl w:ilvl="4" w:tplc="04190019" w:tentative="1">
+    <w:lvl w:ilvl="4" w:tentative="1">
       <w:start w:val="1"/>
       <w:numFmt w:val="lowerLetter"/>
       <w:lvlText w:val="%5."/>
@@ -565,7 +584,7 @@
         <w:ind w:left="3600" w:hanging="360"/>
       </w:pPr>
     </w:lvl>
-    <w:lvl w:ilvl="5" w:tplc="0419001B" w:tentative="1">
+    <w:lvl w:ilvl="5" w:tentative="1">
       <w:start w:val="1"/>
       <w:numFmt w:val="lowerRoman"/>
       <w:lvlText w:val="%6."/>
@@ -574,7 +593,7 @@
         <w:ind w:left="4320" w:hanging="180"/>
       </w:pPr>
     </w:lvl>
-    <w:lvl w:ilvl="6" w:tplc="0419000F" w:tentative="1">
+    <w:lvl w:ilvl="6" w:tentative="1">
       <w:start w:val="1"/>
       <w:numFmt w:val="decimal"/>
       <w:lvlText w:val="%7."/>
@@ -583,7 +602,7 @@
         <w:ind w:left="5040" w:hanging="360"/>
       </w:pPr>
     </w:lvl>
-    <w:lvl w:ilvl="7" w:tplc="04190019" w:tentative="1">
+    <w:lvl w:ilvl="7" w:tentative="1">
       <w:start w:val="1"/>
       <w:numFmt w:val="lowerLetter"/>
       <w:lvlText w:val="%8."/>
@@ -592,7 +611,7 @@
         <w:ind w:left="5760" w:hanging="360"/>
       </w:pPr>
     </w:lvl>
-    <w:lvl w:ilvl="8" w:tplc="0419001B" w:tentative="1">
+    <w:lvl w:ilvl="8" w:tentative="1">
       <w:start w:val="1"/>
       <w:numFmt w:val="lowerRoman"/>
       <w:lvlText w:val="%9."/>
@@ -603,7 +622,7 @@
     </w:lvl>
   </w:abstractNum>
   <w:num w:numId="1">
-    <w:abstractNumId w:val="3"/>
+    <w:abstractNumId w:val="2"/>
   </w:num>
   <w:num w:numId="2">
     <w:abstractNumId w:val="6"/>
@@ -612,13 +631,13 @@
     <w:abstractNumId w:val="4"/>
   </w:num>
   <w:num w:numId="4">
-    <w:abstractNumId w:val="2"/>
+    <w:abstractNumId w:val="1"/>
   </w:num>
   <w:num w:numId="5">
     <w:abstractNumId w:val="5"/>
   </w:num>
   <w:num w:numId="6">
-    <w:abstractNumId w:val="1"/>
+    <w:abstractNumId w:val="3"/>
   </w:num>
   <w:num w:numId="7">
     <w:abstractNumId w:val="0"/>
@@ -1446,7 +1465,7 @@
 </file>
 
 <file path=customXml/itemProps1.xml><?xml version="1.0" encoding="utf-8"?>
-<ds:datastoreItem xmlns:ds="http://schemas.openxmlformats.org/officeDocument/2006/customXml" ds:itemID="{A14CBC2E-9B0A-43E1-9BBA-3A5EDAED74A6}">
+<ds:datastoreItem xmlns:ds="http://schemas.openxmlformats.org/officeDocument/2006/customXml" ds:itemID="{714A8EE3-4AE5-4B7F-830A-2DE1F1D1DEBE}">
   <ds:schemaRefs>
     <ds:schemaRef ds:uri="http://schemas.openxmlformats.org/officeDocument/2006/bibliography"/>
   </ds:schemaRefs>

</xml_diff>

<commit_message>
Prepare for numbering formatting 2
</commit_message>
<xml_diff>
--- a/tests/examples/List.docx
+++ b/tests/examples/List.docx
@@ -10,14 +10,47 @@
         <w:ind w:left="714" w:hanging="357"/>
         <w:contextualSpacing/>
       </w:pPr>
-      <w:proofErr w:type="spellStart"/>
       <w:r>
         <w:rPr>
           <w:lang w:val="en-US"/>
         </w:rPr>
         <w:t>fd</w:t>
       </w:r>
-      <w:proofErr w:type="spellEnd"/>
+    </w:p>
+    <w:p>
+      <w:pPr>
+        <w:pStyle w:val="Num2"/>
+        <w:widowControl w:val="0"/>
+        <w:spacing w:line="257" w:lineRule="auto"/>
+        <w:ind w:left="714" w:hanging="357"/>
+        <w:contextualSpacing/>
+      </w:pPr>
+      <w:r>
+        <w:rPr>
+          <w:lang w:val="en-US"/>
+        </w:rPr>
+        <w:t>Next</w:t>
+      </w:r>
+    </w:p>
+    <w:p>
+      <w:pPr>
+        <w:pStyle w:val="Num2"/>
+        <w:widowControl w:val="0"/>
+        <w:numPr>
+          <w:ilvl w:val="1"/>
+          <w:numId w:val="2"/>
+        </w:numPr>
+        <w:spacing w:line="257" w:lineRule="auto"/>
+        <w:contextualSpacing/>
+      </w:pPr>
+      <w:r>
+        <w:rPr>
+          <w:lang w:val="en-US"/>
+        </w:rPr>
+        <w:t>next ilvl</w:t>
+      </w:r>
+      <w:bookmarkStart w:id="0" w:name="_GoBack"/>
+      <w:bookmarkEnd w:id="0"/>
     </w:p>
     <w:p>
       <w:pPr>
@@ -40,22 +73,12 @@
         </w:numPr>
         <w:jc w:val="right"/>
       </w:pPr>
-      <w:proofErr w:type="spellStart"/>
       <w:r>
         <w:rPr>
           <w:lang w:val="en-US"/>
         </w:rPr>
-        <w:t>HaH</w:t>
+        <w:t>HaHa</w:t>
       </w:r>
-      <w:bookmarkStart w:id="0" w:name="_GoBack"/>
-      <w:bookmarkEnd w:id="0"/>
-      <w:r>
-        <w:rPr>
-          <w:lang w:val="en-US"/>
-        </w:rPr>
-        <w:t>a</w:t>
-      </w:r>
-      <w:proofErr w:type="spellEnd"/>
     </w:p>
     <w:p>
       <w:pPr>
@@ -96,11 +119,9 @@
               <w:ind w:left="113" w:right="113"/>
               <w:jc w:val="right"/>
             </w:pPr>
-            <w:proofErr w:type="spellStart"/>
             <w:r>
               <w:t>ааа</w:t>
             </w:r>
-            <w:proofErr w:type="spellEnd"/>
           </w:p>
         </w:tc>
       </w:tr>
@@ -440,7 +461,7 @@
     <w:nsid w:val="781C147C"/>
     <w:multiLevelType w:val="hybridMultilevel"/>
     <w:tmpl w:val="8880048C"/>
-    <w:lvl w:ilvl="0">
+    <w:lvl w:ilvl="0" w:tplc="BAA83CD6">
       <w:start w:val="1"/>
       <w:numFmt w:val="lowerRoman"/>
       <w:lvlText w:val="%1.Hello"/>
@@ -452,7 +473,7 @@
         <w:rFonts w:hint="default"/>
       </w:rPr>
     </w:lvl>
-    <w:lvl w:ilvl="1" w:tentative="1">
+    <w:lvl w:ilvl="1" w:tplc="30CC908C" w:tentative="1">
       <w:start w:val="1"/>
       <w:numFmt w:val="lowerLetter"/>
       <w:lvlText w:val="%2."/>
@@ -461,7 +482,7 @@
         <w:ind w:left="1440" w:hanging="360"/>
       </w:pPr>
     </w:lvl>
-    <w:lvl w:ilvl="2" w:tentative="1">
+    <w:lvl w:ilvl="2" w:tplc="ADFE6418" w:tentative="1">
       <w:start w:val="1"/>
       <w:numFmt w:val="lowerRoman"/>
       <w:lvlText w:val="%3."/>
@@ -470,7 +491,7 @@
         <w:ind w:left="2160" w:hanging="180"/>
       </w:pPr>
     </w:lvl>
-    <w:lvl w:ilvl="3" w:tentative="1">
+    <w:lvl w:ilvl="3" w:tplc="56FC5AE6" w:tentative="1">
       <w:start w:val="1"/>
       <w:numFmt w:val="decimal"/>
       <w:lvlText w:val="%4."/>
@@ -479,7 +500,7 @@
         <w:ind w:left="2880" w:hanging="360"/>
       </w:pPr>
     </w:lvl>
-    <w:lvl w:ilvl="4" w:tentative="1">
+    <w:lvl w:ilvl="4" w:tplc="C7269068" w:tentative="1">
       <w:start w:val="1"/>
       <w:numFmt w:val="lowerLetter"/>
       <w:lvlText w:val="%5."/>
@@ -488,7 +509,7 @@
         <w:ind w:left="3600" w:hanging="360"/>
       </w:pPr>
     </w:lvl>
-    <w:lvl w:ilvl="5" w:tentative="1">
+    <w:lvl w:ilvl="5" w:tplc="6890BCAC" w:tentative="1">
       <w:start w:val="1"/>
       <w:numFmt w:val="lowerRoman"/>
       <w:lvlText w:val="%6."/>
@@ -497,7 +518,7 @@
         <w:ind w:left="4320" w:hanging="180"/>
       </w:pPr>
     </w:lvl>
-    <w:lvl w:ilvl="6" w:tentative="1">
+    <w:lvl w:ilvl="6" w:tplc="BD0C083C" w:tentative="1">
       <w:start w:val="1"/>
       <w:numFmt w:val="decimal"/>
       <w:lvlText w:val="%7."/>
@@ -506,7 +527,7 @@
         <w:ind w:left="5040" w:hanging="360"/>
       </w:pPr>
     </w:lvl>
-    <w:lvl w:ilvl="7" w:tentative="1">
+    <w:lvl w:ilvl="7" w:tplc="37CCF648" w:tentative="1">
       <w:start w:val="1"/>
       <w:numFmt w:val="lowerLetter"/>
       <w:lvlText w:val="%8."/>
@@ -515,7 +536,7 @@
         <w:ind w:left="5760" w:hanging="360"/>
       </w:pPr>
     </w:lvl>
-    <w:lvl w:ilvl="8" w:tentative="1">
+    <w:lvl w:ilvl="8" w:tplc="F2AC3880" w:tentative="1">
       <w:start w:val="1"/>
       <w:numFmt w:val="lowerRoman"/>
       <w:lvlText w:val="%9."/>
@@ -535,7 +556,7 @@
     <w:nsid w:val="79906D31"/>
     <w:multiLevelType w:val="hybridMultilevel"/>
     <w:tmpl w:val="7D025886"/>
-    <w:lvl w:ilvl="0">
+    <w:lvl w:ilvl="0" w:tplc="D3C848F8">
       <w:start w:val="1"/>
       <w:numFmt w:val="ordinal"/>
       <w:pStyle w:val="Num"/>
@@ -548,7 +569,7 @@
         <w:rFonts w:hint="default"/>
       </w:rPr>
     </w:lvl>
-    <w:lvl w:ilvl="1" w:tentative="1">
+    <w:lvl w:ilvl="1" w:tplc="AB00C47C">
       <w:start w:val="1"/>
       <w:numFmt w:val="lowerLetter"/>
       <w:lvlText w:val="%2."/>
@@ -557,7 +578,7 @@
         <w:ind w:left="1440" w:hanging="360"/>
       </w:pPr>
     </w:lvl>
-    <w:lvl w:ilvl="2" w:tentative="1">
+    <w:lvl w:ilvl="2" w:tplc="3C607F76" w:tentative="1">
       <w:start w:val="1"/>
       <w:numFmt w:val="lowerRoman"/>
       <w:lvlText w:val="%3."/>
@@ -566,7 +587,7 @@
         <w:ind w:left="2160" w:hanging="180"/>
       </w:pPr>
     </w:lvl>
-    <w:lvl w:ilvl="3" w:tentative="1">
+    <w:lvl w:ilvl="3" w:tplc="5F8E453A" w:tentative="1">
       <w:start w:val="1"/>
       <w:numFmt w:val="decimal"/>
       <w:lvlText w:val="%4."/>
@@ -575,7 +596,7 @@
         <w:ind w:left="2880" w:hanging="360"/>
       </w:pPr>
     </w:lvl>
-    <w:lvl w:ilvl="4" w:tentative="1">
+    <w:lvl w:ilvl="4" w:tplc="19BCB6C0" w:tentative="1">
       <w:start w:val="1"/>
       <w:numFmt w:val="lowerLetter"/>
       <w:lvlText w:val="%5."/>
@@ -584,7 +605,7 @@
         <w:ind w:left="3600" w:hanging="360"/>
       </w:pPr>
     </w:lvl>
-    <w:lvl w:ilvl="5" w:tentative="1">
+    <w:lvl w:ilvl="5" w:tplc="91AA924A" w:tentative="1">
       <w:start w:val="1"/>
       <w:numFmt w:val="lowerRoman"/>
       <w:lvlText w:val="%6."/>
@@ -593,7 +614,7 @@
         <w:ind w:left="4320" w:hanging="180"/>
       </w:pPr>
     </w:lvl>
-    <w:lvl w:ilvl="6" w:tentative="1">
+    <w:lvl w:ilvl="6" w:tplc="CDA26802" w:tentative="1">
       <w:start w:val="1"/>
       <w:numFmt w:val="decimal"/>
       <w:lvlText w:val="%7."/>
@@ -602,7 +623,7 @@
         <w:ind w:left="5040" w:hanging="360"/>
       </w:pPr>
     </w:lvl>
-    <w:lvl w:ilvl="7" w:tentative="1">
+    <w:lvl w:ilvl="7" w:tplc="9FB0BAB6" w:tentative="1">
       <w:start w:val="1"/>
       <w:numFmt w:val="lowerLetter"/>
       <w:lvlText w:val="%8."/>
@@ -611,7 +632,7 @@
         <w:ind w:left="5760" w:hanging="360"/>
       </w:pPr>
     </w:lvl>
-    <w:lvl w:ilvl="8" w:tentative="1">
+    <w:lvl w:ilvl="8" w:tplc="66C8A47C" w:tentative="1">
       <w:start w:val="1"/>
       <w:numFmt w:val="lowerRoman"/>
       <w:lvlText w:val="%9."/>
@@ -1465,7 +1486,7 @@
 </file>
 
 <file path=customXml/itemProps1.xml><?xml version="1.0" encoding="utf-8"?>
-<ds:datastoreItem xmlns:ds="http://schemas.openxmlformats.org/officeDocument/2006/customXml" ds:itemID="{714A8EE3-4AE5-4B7F-830A-2DE1F1D1DEBE}">
+<ds:datastoreItem xmlns:ds="http://schemas.openxmlformats.org/officeDocument/2006/customXml" ds:itemID="{1E2DDD11-B9C5-4CEC-99C7-9B1BE5DED4ED}">
   <ds:schemaRefs>
     <ds:schemaRef ds:uri="http://schemas.openxmlformats.org/officeDocument/2006/bibliography"/>
   </ds:schemaRefs>

</xml_diff>

<commit_message>
final save tempo for numerals
</commit_message>
<xml_diff>
--- a/tests/examples/List.docx
+++ b/tests/examples/List.docx
@@ -120,6 +120,168 @@
           <w:lang w:val="en-US"/>
         </w:rPr>
         <w:t>fdfd</w:t>
+      </w:r>
+    </w:p>
+    <w:p>
+      <w:pPr>
+        <w:pStyle w:val="Num2"/>
+        <w:widowControl w:val="0"/>
+        <w:numPr>
+          <w:ilvl w:val="0"/>
+          <w:numId w:val="9"/>
+        </w:numPr>
+        <w:spacing w:line="257" w:lineRule="auto"/>
+        <w:contextualSpacing/>
+      </w:pPr>
+      <w:r>
+        <w:rPr>
+          <w:lang w:val="en-US"/>
+        </w:rPr>
+        <w:t>f</w:t>
+      </w:r>
+    </w:p>
+    <w:p>
+      <w:pPr>
+        <w:pStyle w:val="Num2"/>
+        <w:widowControl w:val="0"/>
+        <w:numPr>
+          <w:ilvl w:val="1"/>
+          <w:numId w:val="9"/>
+        </w:numPr>
+        <w:spacing w:line="257" w:lineRule="auto"/>
+        <w:contextualSpacing/>
+      </w:pPr>
+      <w:r>
+        <w:rPr>
+          <w:lang w:val="en-US"/>
+        </w:rPr>
+        <w:t>f</w:t>
+      </w:r>
+    </w:p>
+    <w:p>
+      <w:pPr>
+        <w:pStyle w:val="Num2"/>
+        <w:widowControl w:val="0"/>
+        <w:numPr>
+          <w:ilvl w:val="2"/>
+          <w:numId w:val="9"/>
+        </w:numPr>
+        <w:spacing w:line="257" w:lineRule="auto"/>
+        <w:contextualSpacing/>
+      </w:pPr>
+      <w:r>
+        <w:rPr>
+          <w:lang w:val="en-US"/>
+        </w:rPr>
+        <w:t>f</w:t>
+      </w:r>
+    </w:p>
+    <w:p>
+      <w:pPr>
+        <w:pStyle w:val="Num2"/>
+        <w:widowControl w:val="0"/>
+        <w:numPr>
+          <w:ilvl w:val="3"/>
+          <w:numId w:val="9"/>
+        </w:numPr>
+        <w:spacing w:line="257" w:lineRule="auto"/>
+        <w:contextualSpacing/>
+      </w:pPr>
+      <w:r>
+        <w:rPr>
+          <w:lang w:val="en-US"/>
+        </w:rPr>
+        <w:t>f</w:t>
+      </w:r>
+    </w:p>
+    <w:p>
+      <w:pPr>
+        <w:pStyle w:val="Num2"/>
+        <w:widowControl w:val="0"/>
+        <w:numPr>
+          <w:ilvl w:val="4"/>
+          <w:numId w:val="9"/>
+        </w:numPr>
+        <w:spacing w:line="257" w:lineRule="auto"/>
+        <w:contextualSpacing/>
+      </w:pPr>
+      <w:r>
+        <w:rPr>
+          <w:lang w:val="en-US"/>
+        </w:rPr>
+        <w:t>f</w:t>
+      </w:r>
+    </w:p>
+    <w:p>
+      <w:pPr>
+        <w:pStyle w:val="Num2"/>
+        <w:widowControl w:val="0"/>
+        <w:numPr>
+          <w:ilvl w:val="5"/>
+          <w:numId w:val="9"/>
+        </w:numPr>
+        <w:spacing w:line="257" w:lineRule="auto"/>
+        <w:contextualSpacing/>
+      </w:pPr>
+      <w:r>
+        <w:rPr>
+          <w:lang w:val="en-US"/>
+        </w:rPr>
+        <w:t>f</w:t>
+      </w:r>
+    </w:p>
+    <w:p>
+      <w:pPr>
+        <w:pStyle w:val="Num2"/>
+        <w:widowControl w:val="0"/>
+        <w:numPr>
+          <w:ilvl w:val="6"/>
+          <w:numId w:val="9"/>
+        </w:numPr>
+        <w:spacing w:line="257" w:lineRule="auto"/>
+        <w:contextualSpacing/>
+      </w:pPr>
+      <w:r>
+        <w:rPr>
+          <w:lang w:val="en-US"/>
+        </w:rPr>
+        <w:t>f</w:t>
+      </w:r>
+    </w:p>
+    <w:p>
+      <w:pPr>
+        <w:pStyle w:val="Num2"/>
+        <w:widowControl w:val="0"/>
+        <w:numPr>
+          <w:ilvl w:val="7"/>
+          <w:numId w:val="9"/>
+        </w:numPr>
+        <w:spacing w:line="257" w:lineRule="auto"/>
+        <w:contextualSpacing/>
+      </w:pPr>
+      <w:r>
+        <w:rPr>
+          <w:lang w:val="en-US"/>
+        </w:rPr>
+        <w:t>f</w:t>
+      </w:r>
+    </w:p>
+    <w:p>
+      <w:pPr>
+        <w:pStyle w:val="Num2"/>
+        <w:widowControl w:val="0"/>
+        <w:numPr>
+          <w:ilvl w:val="8"/>
+          <w:numId w:val="9"/>
+        </w:numPr>
+        <w:spacing w:line="257" w:lineRule="auto"/>
+        <w:contextualSpacing/>
+      </w:pPr>
+      <w:r>
+        <w:rPr>
+          <w:lang w:val="en-US"/>
+        </w:rPr>
+        <w:t>f</w:t>
       </w:r>
     </w:p>
     <w:p>
@@ -328,6 +490,119 @@
     </w:lvl>
   </w:abstractNum>
   <w:abstractNum w:abstractNumId="1" w15:restartNumberingAfterBreak="0">
+    <w:nsid w:val="183E357D"/>
+    <w:multiLevelType w:val="hybridMultilevel"/>
+    <w:tmpl w:val="64709532"/>
+    <w:lvl w:ilvl="0" w:tplc="04190001">
+      <w:start w:val="1"/>
+      <w:numFmt w:val="bullet"/>
+      <w:lvlText w:val=""/>
+      <w:lvlJc w:val="left"/>
+      <w:pPr>
+        <w:ind w:left="720" w:hanging="360"/>
+      </w:pPr>
+      <w:rPr>
+        <w:rFonts w:ascii="Symbol" w:hAnsi="Symbol" w:hint="default"/>
+      </w:rPr>
+    </w:lvl>
+    <w:lvl w:ilvl="1" w:tplc="04190003">
+      <w:start w:val="1"/>
+      <w:numFmt w:val="bullet"/>
+      <w:lvlText w:val="o"/>
+      <w:lvlJc w:val="left"/>
+      <w:pPr>
+        <w:ind w:left="1440" w:hanging="360"/>
+      </w:pPr>
+      <w:rPr>
+        <w:rFonts w:ascii="Courier New" w:hAnsi="Courier New" w:cs="Courier New" w:hint="default"/>
+      </w:rPr>
+    </w:lvl>
+    <w:lvl w:ilvl="2" w:tplc="04190005">
+      <w:start w:val="1"/>
+      <w:numFmt w:val="bullet"/>
+      <w:lvlText w:val=""/>
+      <w:lvlJc w:val="left"/>
+      <w:pPr>
+        <w:ind w:left="2160" w:hanging="360"/>
+      </w:pPr>
+      <w:rPr>
+        <w:rFonts w:ascii="Wingdings" w:hAnsi="Wingdings" w:hint="default"/>
+      </w:rPr>
+    </w:lvl>
+    <w:lvl w:ilvl="3" w:tplc="04190001">
+      <w:start w:val="1"/>
+      <w:numFmt w:val="bullet"/>
+      <w:lvlText w:val=""/>
+      <w:lvlJc w:val="left"/>
+      <w:pPr>
+        <w:ind w:left="2880" w:hanging="360"/>
+      </w:pPr>
+      <w:rPr>
+        <w:rFonts w:ascii="Symbol" w:hAnsi="Symbol" w:hint="default"/>
+      </w:rPr>
+    </w:lvl>
+    <w:lvl w:ilvl="4" w:tplc="04190003">
+      <w:start w:val="1"/>
+      <w:numFmt w:val="bullet"/>
+      <w:lvlText w:val="o"/>
+      <w:lvlJc w:val="left"/>
+      <w:pPr>
+        <w:ind w:left="3600" w:hanging="360"/>
+      </w:pPr>
+      <w:rPr>
+        <w:rFonts w:ascii="Courier New" w:hAnsi="Courier New" w:cs="Courier New" w:hint="default"/>
+      </w:rPr>
+    </w:lvl>
+    <w:lvl w:ilvl="5" w:tplc="04190005">
+      <w:start w:val="1"/>
+      <w:numFmt w:val="bullet"/>
+      <w:lvlText w:val=""/>
+      <w:lvlJc w:val="left"/>
+      <w:pPr>
+        <w:ind w:left="4320" w:hanging="360"/>
+      </w:pPr>
+      <w:rPr>
+        <w:rFonts w:ascii="Wingdings" w:hAnsi="Wingdings" w:hint="default"/>
+      </w:rPr>
+    </w:lvl>
+    <w:lvl w:ilvl="6" w:tplc="04190001">
+      <w:start w:val="1"/>
+      <w:numFmt w:val="bullet"/>
+      <w:lvlText w:val=""/>
+      <w:lvlJc w:val="left"/>
+      <w:pPr>
+        <w:ind w:left="5040" w:hanging="360"/>
+      </w:pPr>
+      <w:rPr>
+        <w:rFonts w:ascii="Symbol" w:hAnsi="Symbol" w:hint="default"/>
+      </w:rPr>
+    </w:lvl>
+    <w:lvl w:ilvl="7" w:tplc="04190003">
+      <w:start w:val="1"/>
+      <w:numFmt w:val="bullet"/>
+      <w:lvlText w:val="o"/>
+      <w:lvlJc w:val="left"/>
+      <w:pPr>
+        <w:ind w:left="5760" w:hanging="360"/>
+      </w:pPr>
+      <w:rPr>
+        <w:rFonts w:ascii="Courier New" w:hAnsi="Courier New" w:cs="Courier New" w:hint="default"/>
+      </w:rPr>
+    </w:lvl>
+    <w:lvl w:ilvl="8" w:tplc="04190005">
+      <w:start w:val="1"/>
+      <w:numFmt w:val="bullet"/>
+      <w:lvlText w:val=""/>
+      <w:lvlJc w:val="left"/>
+      <w:pPr>
+        <w:ind w:left="6480" w:hanging="360"/>
+      </w:pPr>
+      <w:rPr>
+        <w:rFonts w:ascii="Wingdings" w:hAnsi="Wingdings" w:hint="default"/>
+      </w:rPr>
+    </w:lvl>
+  </w:abstractNum>
+  <w:abstractNum w:abstractNumId="2" w15:restartNumberingAfterBreak="0">
     <w:nsid w:val="1F566D18"/>
     <w:multiLevelType w:val="multilevel"/>
     <w:tmpl w:val="51989446"/>
@@ -418,7 +693,7 @@
       </w:pPr>
     </w:lvl>
   </w:abstractNum>
-  <w:abstractNum w:abstractNumId="2" w15:restartNumberingAfterBreak="0">
+  <w:abstractNum w:abstractNumId="3" w15:restartNumberingAfterBreak="0">
     <w:nsid w:val="3A0505E3"/>
     <w:multiLevelType w:val="multilevel"/>
     <w:tmpl w:val="0419001D"/>
@@ -509,7 +784,7 @@
       </w:pPr>
     </w:lvl>
   </w:abstractNum>
-  <w:abstractNum w:abstractNumId="3" w15:restartNumberingAfterBreak="0">
+  <w:abstractNum w:abstractNumId="4" w15:restartNumberingAfterBreak="0">
     <w:nsid w:val="56677EB9"/>
     <w:multiLevelType w:val="multilevel"/>
     <w:tmpl w:val="0419001F"/>
@@ -595,7 +870,7 @@
       </w:pPr>
     </w:lvl>
   </w:abstractNum>
-  <w:abstractNum w:abstractNumId="4" w15:restartNumberingAfterBreak="0">
+  <w:abstractNum w:abstractNumId="5" w15:restartNumberingAfterBreak="0">
     <w:nsid w:val="6FEC0537"/>
     <w:multiLevelType w:val="singleLevel"/>
     <w:tmpl w:val="B89E20F0"/>
@@ -613,7 +888,7 @@
       </w:rPr>
     </w:lvl>
   </w:abstractNum>
-  <w:abstractNum w:abstractNumId="5" w15:restartNumberingAfterBreak="0">
+  <w:abstractNum w:abstractNumId="6" w15:restartNumberingAfterBreak="0">
     <w:nsid w:val="781C147C"/>
     <w:multiLevelType w:val="hybridMultilevel"/>
     <w:tmpl w:val="8880048C"/>
@@ -702,13 +977,13 @@
       </w:pPr>
     </w:lvl>
   </w:abstractNum>
-  <w:abstractNum w:abstractNumId="6" w15:restartNumberingAfterBreak="0">
+  <w:abstractNum w:abstractNumId="7" w15:restartNumberingAfterBreak="0">
     <w:nsid w:val="792C5740"/>
     <w:multiLevelType w:val="multilevel"/>
     <w:tmpl w:val="51989446"/>
     <w:numStyleLink w:val="NumStylishHidden"/>
   </w:abstractNum>
-  <w:abstractNum w:abstractNumId="7" w15:restartNumberingAfterBreak="0">
+  <w:abstractNum w:abstractNumId="8" w15:restartNumberingAfterBreak="0">
     <w:nsid w:val="79906D31"/>
     <w:multiLevelType w:val="hybridMultilevel"/>
     <w:tmpl w:val="7D025886"/>
@@ -799,28 +1074,31 @@
     </w:lvl>
   </w:abstractNum>
   <w:num w:numId="1">
+    <w:abstractNumId w:val="3"/>
+  </w:num>
+  <w:num w:numId="2">
+    <w:abstractNumId w:val="8"/>
+  </w:num>
+  <w:num w:numId="3">
+    <w:abstractNumId w:val="6"/>
+  </w:num>
+  <w:num w:numId="4">
     <w:abstractNumId w:val="2"/>
   </w:num>
-  <w:num w:numId="2">
+  <w:num w:numId="5">
     <w:abstractNumId w:val="7"/>
   </w:num>
-  <w:num w:numId="3">
+  <w:num w:numId="6">
     <w:abstractNumId w:val="5"/>
-  </w:num>
-  <w:num w:numId="4">
-    <w:abstractNumId w:val="1"/>
-  </w:num>
-  <w:num w:numId="5">
-    <w:abstractNumId w:val="6"/>
-  </w:num>
-  <w:num w:numId="6">
-    <w:abstractNumId w:val="4"/>
   </w:num>
   <w:num w:numId="7">
     <w:abstractNumId w:val="0"/>
   </w:num>
   <w:num w:numId="8">
-    <w:abstractNumId w:val="3"/>
+    <w:abstractNumId w:val="4"/>
+  </w:num>
+  <w:num w:numId="9">
+    <w:abstractNumId w:val="1"/>
   </w:num>
 </w:numbering>
 </file>

</xml_diff>

<commit_message>
add separator and other for numbering
</commit_message>
<xml_diff>
--- a/tests/examples/List.docx
+++ b/tests/examples/List.docx
@@ -6,23 +6,33 @@
       <w:pPr>
         <w:pStyle w:val="Num2"/>
         <w:widowControl w:val="0"/>
+        <w:numPr>
+          <w:ilvl w:val="0"/>
+          <w:numId w:val="2"/>
+        </w:numPr>
         <w:spacing w:line="257" w:lineRule="auto"/>
-        <w:ind w:left="714" w:hanging="357"/>
         <w:contextualSpacing/>
       </w:pPr>
+      <w:bookmarkStart w:id="0" w:name="_GoBack"/>
+      <w:bookmarkEnd w:id="0"/>
+      <w:proofErr w:type="spellStart"/>
       <w:r>
         <w:rPr>
           <w:lang w:val="en-US"/>
         </w:rPr>
         <w:t>fd</w:t>
       </w:r>
+      <w:proofErr w:type="spellEnd"/>
     </w:p>
     <w:p>
       <w:pPr>
         <w:pStyle w:val="Num2"/>
         <w:widowControl w:val="0"/>
+        <w:numPr>
+          <w:ilvl w:val="0"/>
+          <w:numId w:val="2"/>
+        </w:numPr>
         <w:spacing w:line="257" w:lineRule="auto"/>
-        <w:ind w:left="714" w:hanging="357"/>
         <w:contextualSpacing/>
       </w:pPr>
       <w:r>
@@ -47,8 +57,109 @@
         <w:rPr>
           <w:lang w:val="en-US"/>
         </w:rPr>
-        <w:t>next ilvl</w:t>
-      </w:r>
+        <w:t xml:space="preserve">next </w:t>
+      </w:r>
+      <w:proofErr w:type="spellStart"/>
+      <w:r>
+        <w:rPr>
+          <w:lang w:val="en-US"/>
+        </w:rPr>
+        <w:t>ilvl</w:t>
+      </w:r>
+      <w:proofErr w:type="spellEnd"/>
+      <w:r>
+        <w:rPr>
+          <w:lang w:val="en-US"/>
+        </w:rPr>
+        <w:tab/>
+      </w:r>
+      <w:r>
+        <w:rPr>
+          <w:lang w:val="en-US"/>
+        </w:rPr>
+        <w:tab/>
+      </w:r>
+      <w:r>
+        <w:rPr>
+          <w:lang w:val="en-US"/>
+        </w:rPr>
+        <w:tab/>
+      </w:r>
+      <w:r>
+        <w:rPr>
+          <w:lang w:val="en-US"/>
+        </w:rPr>
+        <w:tab/>
+      </w:r>
+      <w:r>
+        <w:rPr>
+          <w:lang w:val="en-US"/>
+        </w:rPr>
+        <w:tab/>
+      </w:r>
+      <w:r>
+        <w:rPr>
+          <w:lang w:val="en-US"/>
+        </w:rPr>
+        <w:tab/>
+      </w:r>
+      <w:r>
+        <w:rPr>
+          <w:lang w:val="en-US"/>
+        </w:rPr>
+        <w:tab/>
+      </w:r>
+      <w:r>
+        <w:rPr>
+          <w:lang w:val="en-US"/>
+        </w:rPr>
+        <w:tab/>
+        <w:t>f</w:t>
+      </w:r>
+    </w:p>
+    <w:p>
+      <w:pPr>
+        <w:pStyle w:val="Num2"/>
+        <w:widowControl w:val="0"/>
+        <w:numPr>
+          <w:ilvl w:val="0"/>
+          <w:numId w:val="2"/>
+        </w:numPr>
+        <w:spacing w:line="257" w:lineRule="auto"/>
+        <w:contextualSpacing/>
+      </w:pPr>
+      <w:r>
+        <w:rPr>
+          <w:lang w:val="en-US"/>
+        </w:rPr>
+        <w:t>Next</w:t>
+      </w:r>
+    </w:p>
+    <w:p>
+      <w:pPr>
+        <w:pStyle w:val="Num2"/>
+        <w:widowControl w:val="0"/>
+        <w:numPr>
+          <w:ilvl w:val="1"/>
+          <w:numId w:val="2"/>
+        </w:numPr>
+        <w:spacing w:line="257" w:lineRule="auto"/>
+        <w:contextualSpacing/>
+      </w:pPr>
+      <w:r>
+        <w:rPr>
+          <w:lang w:val="en-US"/>
+        </w:rPr>
+        <w:t xml:space="preserve">next </w:t>
+      </w:r>
+      <w:proofErr w:type="spellStart"/>
+      <w:r>
+        <w:rPr>
+          <w:lang w:val="en-US"/>
+        </w:rPr>
+        <w:t>ilvl</w:t>
+      </w:r>
+      <w:proofErr w:type="spellEnd"/>
     </w:p>
     <w:p>
       <w:pPr>
@@ -61,12 +172,14 @@
         <w:spacing w:line="257" w:lineRule="auto"/>
         <w:contextualSpacing/>
       </w:pPr>
+      <w:proofErr w:type="spellStart"/>
       <w:r>
         <w:rPr>
           <w:lang w:val="en-US"/>
         </w:rPr>
         <w:t>fdf</w:t>
       </w:r>
+      <w:proofErr w:type="spellEnd"/>
     </w:p>
     <w:p>
       <w:pPr>
@@ -79,12 +192,14 @@
         <w:spacing w:line="257" w:lineRule="auto"/>
         <w:contextualSpacing/>
       </w:pPr>
+      <w:proofErr w:type="spellStart"/>
       <w:r>
         <w:rPr>
           <w:lang w:val="en-US"/>
         </w:rPr>
         <w:t>fdf</w:t>
       </w:r>
+      <w:proofErr w:type="spellEnd"/>
     </w:p>
     <w:p>
       <w:pPr>
@@ -97,12 +212,14 @@
         <w:spacing w:line="257" w:lineRule="auto"/>
         <w:contextualSpacing/>
       </w:pPr>
+      <w:proofErr w:type="spellStart"/>
       <w:r>
         <w:rPr>
           <w:lang w:val="en-US"/>
         </w:rPr>
         <w:t>fd</w:t>
       </w:r>
+      <w:proofErr w:type="spellEnd"/>
     </w:p>
     <w:p>
       <w:pPr>
@@ -115,9 +232,11 @@
         <w:spacing w:line="257" w:lineRule="auto"/>
         <w:contextualSpacing/>
       </w:pPr>
+      <w:proofErr w:type="spellStart"/>
       <w:r>
         <w:t>ав</w:t>
       </w:r>
+      <w:proofErr w:type="spellEnd"/>
     </w:p>
     <w:p>
       <w:pPr>
@@ -142,12 +261,14 @@
         <w:spacing w:line="257" w:lineRule="auto"/>
         <w:contextualSpacing/>
       </w:pPr>
+      <w:proofErr w:type="spellStart"/>
       <w:r>
         <w:rPr>
           <w:lang w:val="en-US"/>
         </w:rPr>
         <w:t>fdfd</w:t>
       </w:r>
+      <w:proofErr w:type="spellEnd"/>
     </w:p>
     <w:p>
       <w:pPr>
@@ -178,8 +299,6 @@
       <w:r>
         <w:t>а</w:t>
       </w:r>
-      <w:bookmarkStart w:id="0" w:name="_GoBack"/>
-      <w:bookmarkEnd w:id="0"/>
     </w:p>
     <w:p>
       <w:pPr>
@@ -274,12 +393,14 @@
         </w:numPr>
         <w:jc w:val="right"/>
       </w:pPr>
+      <w:proofErr w:type="spellStart"/>
       <w:r>
         <w:rPr>
           <w:lang w:val="en-US"/>
         </w:rPr>
         <w:t>HaHa</w:t>
       </w:r>
+      <w:proofErr w:type="spellEnd"/>
     </w:p>
     <w:p>
       <w:pPr>
@@ -320,9 +441,11 @@
               <w:ind w:left="113" w:right="113"/>
               <w:jc w:val="right"/>
             </w:pPr>
+            <w:proofErr w:type="spellStart"/>
             <w:r>
               <w:t>ааа</w:t>
             </w:r>
+            <w:proofErr w:type="spellEnd"/>
           </w:p>
         </w:tc>
       </w:tr>
@@ -340,6 +463,32 @@
 
 <file path=word/numbering.xml><?xml version="1.0" encoding="utf-8"?>
 <w:numbering xmlns:wpc="http://schemas.microsoft.com/office/word/2010/wordprocessingCanvas" xmlns:cx="http://schemas.microsoft.com/office/drawing/2014/chartex" xmlns:cx1="http://schemas.microsoft.com/office/drawing/2015/9/8/chartex" xmlns:cx2="http://schemas.microsoft.com/office/drawing/2015/10/21/chartex" xmlns:cx3="http://schemas.microsoft.com/office/drawing/2016/5/9/chartex" xmlns:cx4="http://schemas.microsoft.com/office/drawing/2016/5/10/chartex" xmlns:cx5="http://schemas.microsoft.com/office/drawing/2016/5/11/chartex" xmlns:cx6="http://schemas.microsoft.com/office/drawing/2016/5/12/chartex" xmlns:cx7="http://schemas.microsoft.com/office/drawing/2016/5/13/chartex" xmlns:cx8="http://schemas.microsoft.com/office/drawing/2016/5/14/chartex" xmlns:mc="http://schemas.openxmlformats.org/markup-compatibility/2006" xmlns:aink="http://schemas.microsoft.com/office/drawing/2016/ink" xmlns:am3d="http://schemas.microsoft.com/office/drawing/2017/model3d" xmlns:o="urn:schemas-microsoft-com:office:office" xmlns:r="http://schemas.openxmlformats.org/officeDocument/2006/relationships" xmlns:m="http://schemas.openxmlformats.org/officeDocument/2006/math" xmlns:v="urn:schemas-microsoft-com:vml" xmlns:wp14="http://schemas.microsoft.com/office/word/2010/wordprocessingDrawing" xmlns:wp="http://schemas.openxmlformats.org/drawingml/2006/wordprocessingDrawing" xmlns:w10="urn:schemas-microsoft-com:office:word" xmlns:w="http://schemas.openxmlformats.org/wordprocessingml/2006/main" xmlns:w14="http://schemas.microsoft.com/office/word/2010/wordml" xmlns:w15="http://schemas.microsoft.com/office/word/2012/wordml" xmlns:w16cex="http://schemas.microsoft.com/office/word/2018/wordml/cex" xmlns:w16cid="http://schemas.microsoft.com/office/word/2016/wordml/cid" xmlns:w16="http://schemas.microsoft.com/office/word/2018/wordml" xmlns:w16se="http://schemas.microsoft.com/office/word/2015/wordml/symex" xmlns:wpg="http://schemas.microsoft.com/office/word/2010/wordprocessingGroup" xmlns:wpi="http://schemas.microsoft.com/office/word/2010/wordprocessingInk" xmlns:wne="http://schemas.microsoft.com/office/word/2006/wordml" xmlns:wps="http://schemas.microsoft.com/office/word/2010/wordprocessingShape" mc:Ignorable="w14 w15 w16se w16cid w16 w16cex wp14">
+  <w:numPicBullet w:numPicBulletId="0">
+    <w:pict>
+      <v:shapetype id="_x0000_t75" coordsize="21600,21600" o:spt="75" o:preferrelative="t" path="m@4@5l@4@11@9@11@9@5xe" filled="f" stroked="f">
+        <v:stroke joinstyle="miter"/>
+        <v:formulas>
+          <v:f eqn="if lineDrawn pixelLineWidth 0"/>
+          <v:f eqn="sum @0 1 0"/>
+          <v:f eqn="sum 0 0 @1"/>
+          <v:f eqn="prod @2 1 2"/>
+          <v:f eqn="prod @3 21600 pixelWidth"/>
+          <v:f eqn="prod @3 21600 pixelHeight"/>
+          <v:f eqn="sum @0 0 1"/>
+          <v:f eqn="prod @6 1 2"/>
+          <v:f eqn="prod @7 21600 pixelWidth"/>
+          <v:f eqn="sum @8 21600 0"/>
+          <v:f eqn="prod @7 21600 pixelHeight"/>
+          <v:f eqn="sum @10 21600 0"/>
+        </v:formulas>
+        <v:path o:extrusionok="f" gradientshapeok="t" o:connecttype="rect"/>
+        <o:lock v:ext="edit" aspectratio="t"/>
+      </v:shapetype>
+      <v:shape id="_x0000_i1030" type="#_x0000_t75" style="width:483.75pt;height:438.75pt" o:bullet="t">
+        <v:imagedata r:id="rId1" o:title="Red_Apple[1]"/>
+      </v:shape>
+    </w:pict>
+  </w:numPicBullet>
   <w:abstractNum w:abstractNumId="0" w15:restartNumberingAfterBreak="0">
     <w:nsid w:val="01EB4AE2"/>
     <w:multiLevelType w:val="multilevel"/>
@@ -460,7 +609,7 @@
   <w:abstractNum w:abstractNumId="1" w15:restartNumberingAfterBreak="0">
     <w:nsid w:val="183E357D"/>
     <w:multiLevelType w:val="hybridMultilevel"/>
-    <w:tmpl w:val="64709532"/>
+    <w:tmpl w:val="F716B9E8"/>
     <w:lvl w:ilvl="0" w:tplc="04190001">
       <w:start w:val="1"/>
       <w:numFmt w:val="bullet"/>
@@ -485,16 +634,18 @@
         <w:rFonts w:ascii="Courier New" w:hAnsi="Courier New" w:cs="Courier New" w:hint="default"/>
       </w:rPr>
     </w:lvl>
-    <w:lvl w:ilvl="2" w:tplc="04190005">
+    <w:lvl w:ilvl="2" w:tplc="DAF6B654">
       <w:start w:val="1"/>
       <w:numFmt w:val="bullet"/>
-      <w:lvlText w:val=""/>
-      <w:lvlJc w:val="left"/>
+      <w:lvlText w:val=""/>
+      <w:lvlPicBulletId w:val="0"/>
+      <w:lvlJc w:val="right"/>
       <w:pPr>
         <w:ind w:left="2160" w:hanging="360"/>
       </w:pPr>
       <w:rPr>
-        <w:rFonts w:ascii="Wingdings" w:hAnsi="Wingdings" w:hint="default"/>
+        <w:rFonts w:ascii="Symbol" w:hAnsi="Symbol" w:hint="default"/>
+        <w:color w:val="auto"/>
       </w:rPr>
     </w:lvl>
     <w:lvl w:ilvl="3" w:tplc="04190001">
@@ -1234,22 +1385,22 @@
   </w:abstractNum>
   <w:abstractNum w:abstractNumId="10" w15:restartNumberingAfterBreak="0">
     <w:nsid w:val="79906D31"/>
-    <w:multiLevelType w:val="hybridMultilevel"/>
-    <w:tmpl w:val="7D025886"/>
-    <w:lvl w:ilvl="0" w:tplc="B53078DC">
+    <w:multiLevelType w:val="multilevel"/>
+    <w:tmpl w:val="76007728"/>
+    <w:lvl w:ilvl="0">
       <w:start w:val="1"/>
       <w:numFmt w:val="ordinal"/>
-      <w:pStyle w:val="Num"/>
+      <w:suff w:val="space"/>
       <w:lvlText w:val="%1."/>
-      <w:lvlJc w:val="left"/>
-      <w:pPr>
-        <w:ind w:left="720" w:hanging="360"/>
-      </w:pPr>
-      <w:rPr>
-        <w:rFonts w:hint="default"/>
-      </w:rPr>
-    </w:lvl>
-    <w:lvl w:ilvl="1" w:tplc="01AEAB24">
+      <w:lvlJc w:val="right"/>
+      <w:pPr>
+        <w:ind w:left="851" w:hanging="284"/>
+      </w:pPr>
+      <w:rPr>
+        <w:rFonts w:hint="default"/>
+      </w:rPr>
+    </w:lvl>
+    <w:lvl w:ilvl="1">
       <w:start w:val="1"/>
       <w:numFmt w:val="lowerLetter"/>
       <w:lvlText w:val="%2."/>
@@ -1257,17 +1408,24 @@
       <w:pPr>
         <w:ind w:left="1440" w:hanging="360"/>
       </w:pPr>
-    </w:lvl>
-    <w:lvl w:ilvl="2" w:tplc="14A093EA" w:tentative="1">
-      <w:start w:val="1"/>
-      <w:numFmt w:val="lowerRoman"/>
+      <w:rPr>
+        <w:rFonts w:hint="default"/>
+      </w:rPr>
+    </w:lvl>
+    <w:lvl w:ilvl="2">
+      <w:start w:val="1"/>
+      <w:numFmt w:val="lowerRoman"/>
+      <w:suff w:val="space"/>
       <w:lvlText w:val="%3."/>
       <w:lvlJc w:val="right"/>
       <w:pPr>
         <w:ind w:left="2160" w:hanging="180"/>
       </w:pPr>
-    </w:lvl>
-    <w:lvl w:ilvl="3" w:tplc="0BDA2C66" w:tentative="1">
+      <w:rPr>
+        <w:rFonts w:hint="default"/>
+      </w:rPr>
+    </w:lvl>
+    <w:lvl w:ilvl="3">
       <w:start w:val="1"/>
       <w:numFmt w:val="decimal"/>
       <w:lvlText w:val="%4."/>
@@ -1275,8 +1433,11 @@
       <w:pPr>
         <w:ind w:left="2880" w:hanging="360"/>
       </w:pPr>
-    </w:lvl>
-    <w:lvl w:ilvl="4" w:tplc="C2BC25D6" w:tentative="1">
+      <w:rPr>
+        <w:rFonts w:hint="default"/>
+      </w:rPr>
+    </w:lvl>
+    <w:lvl w:ilvl="4">
       <w:start w:val="1"/>
       <w:numFmt w:val="lowerLetter"/>
       <w:lvlText w:val="%5."/>
@@ -1284,8 +1445,11 @@
       <w:pPr>
         <w:ind w:left="3600" w:hanging="360"/>
       </w:pPr>
-    </w:lvl>
-    <w:lvl w:ilvl="5" w:tplc="D6E47B70" w:tentative="1">
+      <w:rPr>
+        <w:rFonts w:hint="default"/>
+      </w:rPr>
+    </w:lvl>
+    <w:lvl w:ilvl="5">
       <w:start w:val="1"/>
       <w:numFmt w:val="lowerRoman"/>
       <w:lvlText w:val="%6."/>
@@ -1293,8 +1457,11 @@
       <w:pPr>
         <w:ind w:left="4320" w:hanging="180"/>
       </w:pPr>
-    </w:lvl>
-    <w:lvl w:ilvl="6" w:tplc="0278179A" w:tentative="1">
+      <w:rPr>
+        <w:rFonts w:hint="default"/>
+      </w:rPr>
+    </w:lvl>
+    <w:lvl w:ilvl="6">
       <w:start w:val="1"/>
       <w:numFmt w:val="decimal"/>
       <w:lvlText w:val="%7."/>
@@ -1302,8 +1469,11 @@
       <w:pPr>
         <w:ind w:left="5040" w:hanging="360"/>
       </w:pPr>
-    </w:lvl>
-    <w:lvl w:ilvl="7" w:tplc="F6804D98" w:tentative="1">
+      <w:rPr>
+        <w:rFonts w:hint="default"/>
+      </w:rPr>
+    </w:lvl>
+    <w:lvl w:ilvl="7">
       <w:start w:val="1"/>
       <w:numFmt w:val="lowerLetter"/>
       <w:lvlText w:val="%8."/>
@@ -1311,8 +1481,11 @@
       <w:pPr>
         <w:ind w:left="5760" w:hanging="360"/>
       </w:pPr>
-    </w:lvl>
-    <w:lvl w:ilvl="8" w:tplc="20D03472" w:tentative="1">
+      <w:rPr>
+        <w:rFonts w:hint="default"/>
+      </w:rPr>
+    </w:lvl>
+    <w:lvl w:ilvl="8">
       <w:start w:val="1"/>
       <w:numFmt w:val="lowerRoman"/>
       <w:lvlText w:val="%9."/>
@@ -1320,6 +1493,9 @@
       <w:pPr>
         <w:ind w:left="6480" w:hanging="180"/>
       </w:pPr>
+      <w:rPr>
+        <w:rFonts w:hint="default"/>
+      </w:rPr>
     </w:lvl>
   </w:abstractNum>
   <w:num w:numId="1">
@@ -1833,11 +2009,6 @@
     <w:basedOn w:val="a"/>
     <w:qFormat/>
     <w:rsid w:val="00477FD2"/>
-    <w:pPr>
-      <w:numPr>
-        <w:numId w:val="2"/>
-      </w:numPr>
-    </w:pPr>
   </w:style>
   <w:style w:type="paragraph" w:customStyle="1" w:styleId="Num2">
     <w:name w:val="Num2"/>
@@ -2207,7 +2378,7 @@
 </file>
 
 <file path=customXml/itemProps1.xml><?xml version="1.0" encoding="utf-8"?>
-<ds:datastoreItem xmlns:ds="http://schemas.openxmlformats.org/officeDocument/2006/customXml" ds:itemID="{3989CEB3-71EC-4BA7-BCEF-1BC81637974A}">
+<ds:datastoreItem xmlns:ds="http://schemas.openxmlformats.org/officeDocument/2006/customXml" ds:itemID="{26031165-16EA-499C-8A51-71B51BC7F0DD}">
   <ds:schemaRefs>
     <ds:schemaRef ds:uri="http://schemas.openxmlformats.org/officeDocument/2006/bibliography"/>
   </ds:schemaRefs>

</xml_diff>

<commit_message>
Improve bullet (but not fully but well)
</commit_message>
<xml_diff>
--- a/tests/examples/List.docx
+++ b/tests/examples/List.docx
@@ -13,8 +13,6 @@
         <w:spacing w:line="257" w:lineRule="auto"/>
         <w:contextualSpacing/>
       </w:pPr>
-      <w:bookmarkStart w:id="0" w:name="_GoBack"/>
-      <w:bookmarkEnd w:id="0"/>
       <w:proofErr w:type="spellStart"/>
       <w:r>
         <w:rPr>
@@ -311,6 +309,8 @@
         <w:spacing w:line="257" w:lineRule="auto"/>
         <w:contextualSpacing/>
       </w:pPr>
+      <w:bookmarkStart w:id="0" w:name="_GoBack"/>
+      <w:bookmarkEnd w:id="0"/>
       <w:r>
         <w:rPr>
           <w:lang w:val="en-US"/>
@@ -484,7 +484,7 @@
         <v:path o:extrusionok="f" gradientshapeok="t" o:connecttype="rect"/>
         <o:lock v:ext="edit" aspectratio="t"/>
       </v:shapetype>
-      <v:shape id="_x0000_i1030" type="#_x0000_t75" style="width:483.75pt;height:438.75pt" o:bullet="t">
+      <v:shape id="_x0000_i1035" type="#_x0000_t75" style="width:483.75pt;height:438.75pt" o:bullet="t">
         <v:imagedata r:id="rId1" o:title="Red_Apple[1]"/>
       </v:shape>
     </w:pict>
@@ -609,17 +609,17 @@
   <w:abstractNum w:abstractNumId="1" w15:restartNumberingAfterBreak="0">
     <w:nsid w:val="183E357D"/>
     <w:multiLevelType w:val="hybridMultilevel"/>
-    <w:tmpl w:val="F716B9E8"/>
-    <w:lvl w:ilvl="0" w:tplc="04190001">
+    <w:tmpl w:val="432C5B8C"/>
+    <w:lvl w:ilvl="0" w:tplc="0419000B">
       <w:start w:val="1"/>
       <w:numFmt w:val="bullet"/>
-      <w:lvlText w:val=""/>
+      <w:lvlText w:val=""/>
       <w:lvlJc w:val="left"/>
       <w:pPr>
         <w:ind w:left="720" w:hanging="360"/>
       </w:pPr>
       <w:rPr>
-        <w:rFonts w:ascii="Symbol" w:hAnsi="Symbol" w:hint="default"/>
+        <w:rFonts w:ascii="Wingdings" w:hAnsi="Wingdings" w:hint="default"/>
       </w:rPr>
     </w:lvl>
     <w:lvl w:ilvl="1" w:tplc="04190003">
@@ -2378,7 +2378,7 @@
 </file>
 
 <file path=customXml/itemProps1.xml><?xml version="1.0" encoding="utf-8"?>
-<ds:datastoreItem xmlns:ds="http://schemas.openxmlformats.org/officeDocument/2006/customXml" ds:itemID="{26031165-16EA-499C-8A51-71B51BC7F0DD}">
+<ds:datastoreItem xmlns:ds="http://schemas.openxmlformats.org/officeDocument/2006/customXml" ds:itemID="{1C3893DC-4F04-43AB-9575-E2D4DA6840C3}">
   <ds:schemaRefs>
     <ds:schemaRef ds:uri="http://schemas.openxmlformats.org/officeDocument/2006/bibliography"/>
   </ds:schemaRefs>

</xml_diff>

<commit_message>
prepare for pictures 5
</commit_message>
<xml_diff>
--- a/tests/examples/List.docx
+++ b/tests/examples/List.docx
@@ -2,6 +2,69 @@
 <file path=word/document.xml><?xml version="1.0" encoding="utf-8"?>
 <w:document xmlns:wpc="http://schemas.microsoft.com/office/word/2010/wordprocessingCanvas" xmlns:cx="http://schemas.microsoft.com/office/drawing/2014/chartex" xmlns:cx1="http://schemas.microsoft.com/office/drawing/2015/9/8/chartex" xmlns:cx2="http://schemas.microsoft.com/office/drawing/2015/10/21/chartex" xmlns:cx3="http://schemas.microsoft.com/office/drawing/2016/5/9/chartex" xmlns:cx4="http://schemas.microsoft.com/office/drawing/2016/5/10/chartex" xmlns:cx5="http://schemas.microsoft.com/office/drawing/2016/5/11/chartex" xmlns:cx6="http://schemas.microsoft.com/office/drawing/2016/5/12/chartex" xmlns:cx7="http://schemas.microsoft.com/office/drawing/2016/5/13/chartex" xmlns:cx8="http://schemas.microsoft.com/office/drawing/2016/5/14/chartex" xmlns:mc="http://schemas.openxmlformats.org/markup-compatibility/2006" xmlns:aink="http://schemas.microsoft.com/office/drawing/2016/ink" xmlns:am3d="http://schemas.microsoft.com/office/drawing/2017/model3d" xmlns:o="urn:schemas-microsoft-com:office:office" xmlns:r="http://schemas.openxmlformats.org/officeDocument/2006/relationships" xmlns:m="http://schemas.openxmlformats.org/officeDocument/2006/math" xmlns:v="urn:schemas-microsoft-com:vml" xmlns:wp14="http://schemas.microsoft.com/office/word/2010/wordprocessingDrawing" xmlns:wp="http://schemas.openxmlformats.org/drawingml/2006/wordprocessingDrawing" xmlns:w10="urn:schemas-microsoft-com:office:word" xmlns:w="http://schemas.openxmlformats.org/wordprocessingml/2006/main" xmlns:w14="http://schemas.microsoft.com/office/word/2010/wordml" xmlns:w15="http://schemas.microsoft.com/office/word/2012/wordml" xmlns:w16cex="http://schemas.microsoft.com/office/word/2018/wordml/cex" xmlns:w16cid="http://schemas.microsoft.com/office/word/2016/wordml/cid" xmlns:w16="http://schemas.microsoft.com/office/word/2018/wordml" xmlns:w16se="http://schemas.microsoft.com/office/word/2015/wordml/symex" xmlns:wpg="http://schemas.microsoft.com/office/word/2010/wordprocessingGroup" xmlns:wpi="http://schemas.microsoft.com/office/word/2010/wordprocessingInk" xmlns:wne="http://schemas.microsoft.com/office/word/2006/wordml" xmlns:wps="http://schemas.microsoft.com/office/word/2010/wordprocessingShape" mc:Ignorable="w14 w15 w16se w16cid w16 w16cex wp14">
   <w:body>
+    <w:p>
+      <w:pPr>
+        <w:widowControl w:val="0"/>
+        <w:spacing w:line="257" w:lineRule="auto"/>
+        <w:ind w:left="851" w:hanging="284"/>
+        <w:contextualSpacing/>
+      </w:pPr>
+      <w:bookmarkStart w:id="0" w:name="_GoBack"/>
+      <w:r>
+        <w:rPr>
+          <w:noProof/>
+        </w:rPr>
+        <w:drawing>
+          <wp:inline distT="0" distB="0" distL="0" distR="0" wp14:anchorId="3FDF6221" wp14:editId="6F693FE2">
+            <wp:extent cx="838200" cy="180975"/>
+            <wp:effectExtent l="0" t="0" r="0" b="9525"/>
+            <wp:docPr id="1" name="Рисунок 1"/>
+            <wp:cNvGraphicFramePr>
+              <a:graphicFrameLocks xmlns:a="http://schemas.openxmlformats.org/drawingml/2006/main" noChangeAspect="1"/>
+            </wp:cNvGraphicFramePr>
+            <a:graphic xmlns:a="http://schemas.openxmlformats.org/drawingml/2006/main">
+              <a:graphicData uri="http://schemas.openxmlformats.org/drawingml/2006/picture">
+                <pic:pic xmlns:pic="http://schemas.openxmlformats.org/drawingml/2006/picture">
+                  <pic:nvPicPr>
+                    <pic:cNvPr id="0" name="Picture 2"/>
+                    <pic:cNvPicPr>
+                      <a:picLocks noChangeAspect="1" noChangeArrowheads="1"/>
+                    </pic:cNvPicPr>
+                  </pic:nvPicPr>
+                  <pic:blipFill>
+                    <a:blip r:embed="rId6" cstate="print">
+                      <a:extLst>
+                        <a:ext uri="{28A0092B-C50C-407E-A947-70E740481C1C}">
+                          <a14:useLocalDpi xmlns:a14="http://schemas.microsoft.com/office/drawing/2010/main" val="0"/>
+                        </a:ext>
+                      </a:extLst>
+                    </a:blip>
+                    <a:srcRect/>
+                    <a:stretch>
+                      <a:fillRect/>
+                    </a:stretch>
+                  </pic:blipFill>
+                  <pic:spPr bwMode="auto">
+                    <a:xfrm>
+                      <a:off x="0" y="0"/>
+                      <a:ext cx="838200" cy="180975"/>
+                    </a:xfrm>
+                    <a:prstGeom prst="rect">
+                      <a:avLst/>
+                    </a:prstGeom>
+                    <a:noFill/>
+                    <a:ln>
+                      <a:noFill/>
+                    </a:ln>
+                  </pic:spPr>
+                </pic:pic>
+              </a:graphicData>
+            </a:graphic>
+          </wp:inline>
+        </w:drawing>
+      </w:r>
+      <w:bookmarkEnd w:id="0"/>
+    </w:p>
     <w:p>
       <w:pPr>
         <w:pStyle w:val="Num2"/>
@@ -309,8 +372,6 @@
         <w:spacing w:line="257" w:lineRule="auto"/>
         <w:contextualSpacing/>
       </w:pPr>
-      <w:bookmarkStart w:id="0" w:name="_GoBack"/>
-      <w:bookmarkEnd w:id="0"/>
       <w:r>
         <w:rPr>
           <w:lang w:val="en-US"/>
@@ -484,7 +545,7 @@
         <v:path o:extrusionok="f" gradientshapeok="t" o:connecttype="rect"/>
         <o:lock v:ext="edit" aspectratio="t"/>
       </v:shapetype>
-      <v:shape id="_x0000_i1035" type="#_x0000_t75" style="width:483.75pt;height:438.75pt" o:bullet="t">
+      <v:shape id="_x0000_i1027" type="#_x0000_t75" style="width:483.75pt;height:438.75pt" o:bullet="t">
         <v:imagedata r:id="rId1" o:title="Red_Apple[1]"/>
       </v:shape>
     </w:pict>
@@ -2075,6 +2136,36 @@
       </w:tblBorders>
     </w:tblPr>
   </w:style>
+  <w:style w:type="paragraph" w:styleId="a5">
+    <w:name w:val="Balloon Text"/>
+    <w:basedOn w:val="a"/>
+    <w:link w:val="a6"/>
+    <w:uiPriority w:val="99"/>
+    <w:semiHidden/>
+    <w:unhideWhenUsed/>
+    <w:rsid w:val="0049659B"/>
+    <w:pPr>
+      <w:spacing w:after="0" w:line="240" w:lineRule="auto"/>
+    </w:pPr>
+    <w:rPr>
+      <w:rFonts w:ascii="Segoe UI" w:hAnsi="Segoe UI" w:cs="Segoe UI"/>
+      <w:sz w:val="18"/>
+      <w:szCs w:val="18"/>
+    </w:rPr>
+  </w:style>
+  <w:style w:type="character" w:customStyle="1" w:styleId="a6">
+    <w:name w:val="Текст выноски Знак"/>
+    <w:basedOn w:val="a0"/>
+    <w:link w:val="a5"/>
+    <w:uiPriority w:val="99"/>
+    <w:semiHidden/>
+    <w:rsid w:val="0049659B"/>
+    <w:rPr>
+      <w:rFonts w:ascii="Segoe UI" w:hAnsi="Segoe UI" w:cs="Segoe UI"/>
+      <w:sz w:val="18"/>
+      <w:szCs w:val="18"/>
+    </w:rPr>
+  </w:style>
 </w:styles>
 </file>
 
@@ -2378,7 +2469,7 @@
 </file>
 
 <file path=customXml/itemProps1.xml><?xml version="1.0" encoding="utf-8"?>
-<ds:datastoreItem xmlns:ds="http://schemas.openxmlformats.org/officeDocument/2006/customXml" ds:itemID="{1C3893DC-4F04-43AB-9575-E2D4DA6840C3}">
+<ds:datastoreItem xmlns:ds="http://schemas.openxmlformats.org/officeDocument/2006/customXml" ds:itemID="{A59EB240-5A7E-44D9-B411-2BCC13163D9A}">
   <ds:schemaRefs>
     <ds:schemaRef ds:uri="http://schemas.openxmlformats.org/officeDocument/2006/bibliography"/>
   </ds:schemaRefs>

</xml_diff>

<commit_message>
prepare for run content processing
</commit_message>
<xml_diff>
--- a/tests/examples/List.docx
+++ b/tests/examples/List.docx
@@ -9,7 +9,6 @@
         <w:ind w:left="851" w:hanging="284"/>
         <w:contextualSpacing/>
       </w:pPr>
-      <w:bookmarkStart w:id="0" w:name="_GoBack"/>
       <w:r>
         <w:rPr>
           <w:noProof/>
@@ -63,7 +62,6 @@
           </wp:inline>
         </w:drawing>
       </w:r>
-      <w:bookmarkEnd w:id="0"/>
     </w:p>
     <w:p>
       <w:pPr>
@@ -102,6 +100,14 @@
         </w:rPr>
         <w:t>Next</w:t>
       </w:r>
+      <w:r>
+        <w:rPr>
+          <w:lang w:val="en-US"/>
+        </w:rPr>
+        <w:br w:type="textWrapping" w:clear="all"/>
+      </w:r>
+      <w:bookmarkStart w:id="0" w:name="_GoBack"/>
+      <w:bookmarkEnd w:id="0"/>
     </w:p>
     <w:p>
       <w:pPr>
@@ -2469,7 +2475,7 @@
 </file>
 
 <file path=customXml/itemProps1.xml><?xml version="1.0" encoding="utf-8"?>
-<ds:datastoreItem xmlns:ds="http://schemas.openxmlformats.org/officeDocument/2006/customXml" ds:itemID="{A59EB240-5A7E-44D9-B411-2BCC13163D9A}">
+<ds:datastoreItem xmlns:ds="http://schemas.openxmlformats.org/officeDocument/2006/customXml" ds:itemID="{3F5B64F6-6FF2-4D1F-80AC-23246AA0392B}">
   <ds:schemaRefs>
     <ds:schemaRef ds:uri="http://schemas.openxmlformats.org/officeDocument/2006/bibliography"/>
   </ds:schemaRefs>

</xml_diff>

<commit_message>
Add iter over listviews
</commit_message>
<xml_diff>
--- a/tests/examples/List.docx
+++ b/tests/examples/List.docx
@@ -106,8 +106,6 @@
         </w:rPr>
         <w:br w:type="textWrapping" w:clear="all"/>
       </w:r>
-      <w:bookmarkStart w:id="0" w:name="_GoBack"/>
-      <w:bookmarkEnd w:id="0"/>
     </w:p>
     <w:p>
       <w:pPr>
@@ -518,6 +516,494 @@
       </w:tr>
     </w:tbl>
     <w:p/>
+    <w:p/>
+    <w:tbl>
+      <w:tblPr>
+        <w:tblStyle w:val="FirstRowOnlyOuter"/>
+        <w:tblW w:w="0" w:type="auto"/>
+        <w:tblInd w:w="0" w:type="dxa"/>
+        <w:tblLook w:val="01E0" w:firstRow="1" w:lastRow="1" w:firstColumn="1" w:lastColumn="1" w:noHBand="0" w:noVBand="0"/>
+      </w:tblPr>
+      <w:tblGrid>
+        <w:gridCol w:w="3145"/>
+        <w:gridCol w:w="3070"/>
+        <w:gridCol w:w="3130"/>
+      </w:tblGrid>
+      <w:tr>
+        <w:trPr>
+          <w:cnfStyle w:val="100000000000" w:firstRow="1" w:lastRow="0" w:firstColumn="0" w:lastColumn="0" w:oddVBand="0" w:evenVBand="0" w:oddHBand="0" w:evenHBand="0" w:firstRowFirstColumn="0" w:firstRowLastColumn="0" w:lastRowFirstColumn="0" w:lastRowLastColumn="0"/>
+        </w:trPr>
+        <w:tc>
+          <w:tcPr>
+            <w:tcW w:w="3115" w:type="dxa"/>
+            <w:hideMark/>
+          </w:tcPr>
+          <w:p>
+            <w:pPr>
+              <w:rPr>
+                <w:lang w:val="en-US"/>
+              </w:rPr>
+            </w:pPr>
+            <w:r>
+              <w:rPr>
+                <w:lang w:val="en-US"/>
+              </w:rPr>
+              <w:t>1CA</w:t>
+            </w:r>
+            <w:r>
+              <w:rPr>
+                <w:vertAlign w:val="superscript"/>
+                <w:lang w:val="en-US"/>
+              </w:rPr>
+              <w:t>PS</w:t>
+            </w:r>
+          </w:p>
+        </w:tc>
+        <w:tc>
+          <w:tcPr>
+            <w:tcW w:w="3115" w:type="dxa"/>
+            <w:hideMark/>
+          </w:tcPr>
+          <w:p>
+            <w:pPr>
+              <w:rPr>
+                <w:lang w:val="en-US"/>
+              </w:rPr>
+            </w:pPr>
+            <w:r>
+              <w:rPr>
+                <w:lang w:val="en-US"/>
+              </w:rPr>
+              <w:t>2</w:t>
+            </w:r>
+          </w:p>
+        </w:tc>
+        <w:tc>
+          <w:tcPr>
+            <w:tcW w:w="3115" w:type="dxa"/>
+            <w:hideMark/>
+          </w:tcPr>
+          <w:p>
+            <w:pPr>
+              <w:rPr>
+                <w:vertAlign w:val="subscript"/>
+                <w:lang w:val="en-US"/>
+              </w:rPr>
+            </w:pPr>
+            <w:r>
+              <w:rPr>
+                <w:vertAlign w:val="subscript"/>
+                <w:lang w:val="en-US"/>
+              </w:rPr>
+              <w:t>3vdf</w:t>
+            </w:r>
+          </w:p>
+        </w:tc>
+      </w:tr>
+      <w:tr>
+        <w:tc>
+          <w:tcPr>
+            <w:tcW w:w="3115" w:type="dxa"/>
+            <w:hideMark/>
+          </w:tcPr>
+          <w:p>
+            <w:pPr>
+              <w:rPr>
+                <w:lang w:val="en-US"/>
+              </w:rPr>
+            </w:pPr>
+            <w:r>
+              <w:rPr>
+                <w:lang w:val="en-US"/>
+              </w:rPr>
+              <w:t>4</w:t>
+            </w:r>
+          </w:p>
+        </w:tc>
+        <w:tc>
+          <w:tcPr>
+            <w:tcW w:w="3115" w:type="dxa"/>
+            <w:hideMark/>
+          </w:tcPr>
+          <w:p>
+            <w:pPr>
+              <w:rPr>
+                <w:lang w:val="en-US"/>
+              </w:rPr>
+            </w:pPr>
+            <w:r>
+              <w:rPr>
+                <w:lang w:val="en-US"/>
+              </w:rPr>
+              <w:t>5</w:t>
+            </w:r>
+          </w:p>
+        </w:tc>
+        <w:tc>
+          <w:tcPr>
+            <w:tcW w:w="3115" w:type="dxa"/>
+            <w:hideMark/>
+          </w:tcPr>
+          <w:p>
+            <w:pPr>
+              <w:rPr>
+                <w:vertAlign w:val="subscript"/>
+                <w:lang w:val="en-US"/>
+              </w:rPr>
+            </w:pPr>
+            <w:r>
+              <w:rPr>
+                <w:vertAlign w:val="subscript"/>
+                <w:lang w:val="en-US"/>
+              </w:rPr>
+              <w:t>6</w:t>
+            </w:r>
+          </w:p>
+        </w:tc>
+      </w:tr>
+      <w:tr>
+        <w:trPr>
+          <w:cnfStyle w:val="010000000000" w:firstRow="0" w:lastRow="1" w:firstColumn="0" w:lastColumn="0" w:oddVBand="0" w:evenVBand="0" w:oddHBand="0" w:evenHBand="0" w:firstRowFirstColumn="0" w:firstRowLastColumn="0" w:lastRowFirstColumn="0" w:lastRowLastColumn="0"/>
+        </w:trPr>
+        <w:tc>
+          <w:tcPr>
+            <w:tcW w:w="3115" w:type="dxa"/>
+            <w:hideMark/>
+          </w:tcPr>
+          <w:p>
+            <w:pPr>
+              <w:rPr>
+                <w:lang w:val="en-US"/>
+              </w:rPr>
+            </w:pPr>
+            <w:r>
+              <w:rPr>
+                <w:lang w:val="en-US"/>
+              </w:rPr>
+              <w:t>7aaa</w:t>
+            </w:r>
+          </w:p>
+        </w:tc>
+        <w:tc>
+          <w:tcPr>
+            <w:tcW w:w="3115" w:type="dxa"/>
+            <w:hideMark/>
+          </w:tcPr>
+          <w:p>
+            <w:pPr>
+              <w:rPr>
+                <w:lang w:val="en-US"/>
+              </w:rPr>
+            </w:pPr>
+            <w:r>
+              <w:rPr>
+                <w:lang w:val="en-US"/>
+              </w:rPr>
+              <w:t>8bbb</w:t>
+            </w:r>
+          </w:p>
+        </w:tc>
+        <w:tc>
+          <w:tcPr>
+            <w:tcW w:w="3115" w:type="dxa"/>
+            <w:hideMark/>
+          </w:tcPr>
+          <w:p>
+            <w:pPr>
+              <w:rPr>
+                <w:vertAlign w:val="subscript"/>
+                <w:lang w:val="en-US"/>
+              </w:rPr>
+            </w:pPr>
+            <w:r>
+              <w:rPr>
+                <w:vertAlign w:val="subscript"/>
+                <w:lang w:val="en-US"/>
+              </w:rPr>
+              <w:t>9ccc</w:t>
+            </w:r>
+          </w:p>
+        </w:tc>
+      </w:tr>
+    </w:tbl>
+    <w:p/>
+    <w:p/>
+    <w:tbl>
+      <w:tblPr>
+        <w:tblStyle w:val="Scary"/>
+        <w:tblW w:w="0" w:type="auto"/>
+        <w:tblLook w:val="01E0" w:firstRow="1" w:lastRow="1" w:firstColumn="1" w:lastColumn="1" w:noHBand="0" w:noVBand="0"/>
+      </w:tblPr>
+      <w:tblGrid>
+        <w:gridCol w:w="2326"/>
+        <w:gridCol w:w="2326"/>
+        <w:gridCol w:w="2326"/>
+        <w:gridCol w:w="2327"/>
+      </w:tblGrid>
+      <w:tr>
+        <w:tc>
+          <w:tcPr>
+            <w:cnfStyle w:val="000010000000" w:firstRow="0" w:lastRow="0" w:firstColumn="0" w:lastColumn="0" w:oddVBand="1" w:evenVBand="0" w:oddHBand="0" w:evenHBand="0" w:firstRowFirstColumn="0" w:firstRowLastColumn="0" w:lastRowFirstColumn="0" w:lastRowLastColumn="0"/>
+            <w:tcW w:w="2336" w:type="dxa"/>
+          </w:tcPr>
+          <w:p/>
+        </w:tc>
+        <w:tc>
+          <w:tcPr>
+            <w:cnfStyle w:val="000001000000" w:firstRow="0" w:lastRow="0" w:firstColumn="0" w:lastColumn="0" w:oddVBand="0" w:evenVBand="1" w:oddHBand="0" w:evenHBand="0" w:firstRowFirstColumn="0" w:firstRowLastColumn="0" w:lastRowFirstColumn="0" w:lastRowLastColumn="0"/>
+            <w:tcW w:w="2336" w:type="dxa"/>
+          </w:tcPr>
+          <w:p/>
+        </w:tc>
+        <w:tc>
+          <w:tcPr>
+            <w:cnfStyle w:val="000010000000" w:firstRow="0" w:lastRow="0" w:firstColumn="0" w:lastColumn="0" w:oddVBand="1" w:evenVBand="0" w:oddHBand="0" w:evenHBand="0" w:firstRowFirstColumn="0" w:firstRowLastColumn="0" w:lastRowFirstColumn="0" w:lastRowLastColumn="0"/>
+            <w:tcW w:w="2336" w:type="dxa"/>
+          </w:tcPr>
+          <w:p/>
+        </w:tc>
+        <w:tc>
+          <w:tcPr>
+            <w:cnfStyle w:val="000001000000" w:firstRow="0" w:lastRow="0" w:firstColumn="0" w:lastColumn="0" w:oddVBand="0" w:evenVBand="1" w:oddHBand="0" w:evenHBand="0" w:firstRowFirstColumn="0" w:firstRowLastColumn="0" w:lastRowFirstColumn="0" w:lastRowLastColumn="0"/>
+            <w:tcW w:w="2337" w:type="dxa"/>
+          </w:tcPr>
+          <w:p/>
+        </w:tc>
+      </w:tr>
+      <w:tr>
+        <w:trPr>
+          <w:cnfStyle w:val="000000010000" w:firstRow="0" w:lastRow="0" w:firstColumn="0" w:lastColumn="0" w:oddVBand="0" w:evenVBand="0" w:oddHBand="0" w:evenHBand="1" w:firstRowFirstColumn="0" w:firstRowLastColumn="0" w:lastRowFirstColumn="0" w:lastRowLastColumn="0"/>
+        </w:trPr>
+        <w:tc>
+          <w:tcPr>
+            <w:cnfStyle w:val="000010000000" w:firstRow="0" w:lastRow="0" w:firstColumn="0" w:lastColumn="0" w:oddVBand="1" w:evenVBand="0" w:oddHBand="0" w:evenHBand="0" w:firstRowFirstColumn="0" w:firstRowLastColumn="0" w:lastRowFirstColumn="0" w:lastRowLastColumn="0"/>
+            <w:tcW w:w="2336" w:type="dxa"/>
+          </w:tcPr>
+          <w:p/>
+        </w:tc>
+        <w:tc>
+          <w:tcPr>
+            <w:cnfStyle w:val="000001000000" w:firstRow="0" w:lastRow="0" w:firstColumn="0" w:lastColumn="0" w:oddVBand="0" w:evenVBand="1" w:oddHBand="0" w:evenHBand="0" w:firstRowFirstColumn="0" w:firstRowLastColumn="0" w:lastRowFirstColumn="0" w:lastRowLastColumn="0"/>
+            <w:tcW w:w="4672" w:type="dxa"/>
+            <w:gridSpan w:val="2"/>
+            <w:vMerge w:val="restart"/>
+          </w:tcPr>
+          <w:p/>
+        </w:tc>
+        <w:tc>
+          <w:tcPr>
+            <w:cnfStyle w:val="000010000000" w:firstRow="0" w:lastRow="0" w:firstColumn="0" w:lastColumn="0" w:oddVBand="1" w:evenVBand="0" w:oddHBand="0" w:evenHBand="0" w:firstRowFirstColumn="0" w:firstRowLastColumn="0" w:lastRowFirstColumn="0" w:lastRowLastColumn="0"/>
+            <w:tcW w:w="2337" w:type="dxa"/>
+          </w:tcPr>
+          <w:p/>
+        </w:tc>
+      </w:tr>
+      <w:tr>
+        <w:tc>
+          <w:tcPr>
+            <w:cnfStyle w:val="000010000000" w:firstRow="0" w:lastRow="0" w:firstColumn="0" w:lastColumn="0" w:oddVBand="1" w:evenVBand="0" w:oddHBand="0" w:evenHBand="0" w:firstRowFirstColumn="0" w:firstRowLastColumn="0" w:lastRowFirstColumn="0" w:lastRowLastColumn="0"/>
+            <w:tcW w:w="2336" w:type="dxa"/>
+          </w:tcPr>
+          <w:p/>
+        </w:tc>
+        <w:tc>
+          <w:tcPr>
+            <w:cnfStyle w:val="000001000000" w:firstRow="0" w:lastRow="0" w:firstColumn="0" w:lastColumn="0" w:oddVBand="0" w:evenVBand="1" w:oddHBand="0" w:evenHBand="0" w:firstRowFirstColumn="0" w:firstRowLastColumn="0" w:lastRowFirstColumn="0" w:lastRowLastColumn="0"/>
+            <w:tcW w:w="4672" w:type="dxa"/>
+            <w:gridSpan w:val="2"/>
+            <w:vMerge/>
+          </w:tcPr>
+          <w:p/>
+        </w:tc>
+        <w:tc>
+          <w:tcPr>
+            <w:cnfStyle w:val="000010000000" w:firstRow="0" w:lastRow="0" w:firstColumn="0" w:lastColumn="0" w:oddVBand="1" w:evenVBand="0" w:oddHBand="0" w:evenHBand="0" w:firstRowFirstColumn="0" w:firstRowLastColumn="0" w:lastRowFirstColumn="0" w:lastRowLastColumn="0"/>
+            <w:tcW w:w="2337" w:type="dxa"/>
+          </w:tcPr>
+          <w:p/>
+        </w:tc>
+      </w:tr>
+      <w:tr>
+        <w:trPr>
+          <w:cnfStyle w:val="000000010000" w:firstRow="0" w:lastRow="0" w:firstColumn="0" w:lastColumn="0" w:oddVBand="0" w:evenVBand="0" w:oddHBand="0" w:evenHBand="1" w:firstRowFirstColumn="0" w:firstRowLastColumn="0" w:lastRowFirstColumn="0" w:lastRowLastColumn="0"/>
+        </w:trPr>
+        <w:tc>
+          <w:tcPr>
+            <w:cnfStyle w:val="000010000000" w:firstRow="0" w:lastRow="0" w:firstColumn="0" w:lastColumn="0" w:oddVBand="1" w:evenVBand="0" w:oddHBand="0" w:evenHBand="0" w:firstRowFirstColumn="0" w:firstRowLastColumn="0" w:lastRowFirstColumn="0" w:lastRowLastColumn="0"/>
+            <w:tcW w:w="2336" w:type="dxa"/>
+          </w:tcPr>
+          <w:p/>
+        </w:tc>
+        <w:tc>
+          <w:tcPr>
+            <w:cnfStyle w:val="000001000000" w:firstRow="0" w:lastRow="0" w:firstColumn="0" w:lastColumn="0" w:oddVBand="0" w:evenVBand="1" w:oddHBand="0" w:evenHBand="0" w:firstRowFirstColumn="0" w:firstRowLastColumn="0" w:lastRowFirstColumn="0" w:lastRowLastColumn="0"/>
+            <w:tcW w:w="2336" w:type="dxa"/>
+          </w:tcPr>
+          <w:p/>
+        </w:tc>
+        <w:tc>
+          <w:tcPr>
+            <w:cnfStyle w:val="000010000000" w:firstRow="0" w:lastRow="0" w:firstColumn="0" w:lastColumn="0" w:oddVBand="1" w:evenVBand="0" w:oddHBand="0" w:evenHBand="0" w:firstRowFirstColumn="0" w:firstRowLastColumn="0" w:lastRowFirstColumn="0" w:lastRowLastColumn="0"/>
+            <w:tcW w:w="2336" w:type="dxa"/>
+          </w:tcPr>
+          <w:p/>
+        </w:tc>
+        <w:tc>
+          <w:tcPr>
+            <w:cnfStyle w:val="000001000000" w:firstRow="0" w:lastRow="0" w:firstColumn="0" w:lastColumn="0" w:oddVBand="0" w:evenVBand="1" w:oddHBand="0" w:evenHBand="0" w:firstRowFirstColumn="0" w:firstRowLastColumn="0" w:lastRowFirstColumn="0" w:lastRowLastColumn="0"/>
+            <w:tcW w:w="2337" w:type="dxa"/>
+          </w:tcPr>
+          <w:p/>
+        </w:tc>
+      </w:tr>
+    </w:tbl>
+    <w:p/>
+    <w:p/>
+    <w:p>
+      <w:bookmarkStart w:id="0" w:name="_GoBack"/>
+      <w:bookmarkEnd w:id="0"/>
+    </w:p>
+    <w:tbl>
+      <w:tblPr>
+        <w:tblStyle w:val="a4"/>
+        <w:tblW w:w="5000" w:type="pct"/>
+        <w:tblCellSpacing w:w="11" w:type="dxa"/>
+        <w:tblLook w:val="04A0" w:firstRow="1" w:lastRow="0" w:firstColumn="1" w:lastColumn="0" w:noHBand="0" w:noVBand="1"/>
+      </w:tblPr>
+      <w:tblGrid>
+        <w:gridCol w:w="2275"/>
+        <w:gridCol w:w="4099"/>
+        <w:gridCol w:w="2971"/>
+      </w:tblGrid>
+      <w:tr>
+        <w:trPr>
+          <w:tblCellSpacing w:w="11" w:type="dxa"/>
+        </w:trPr>
+        <w:tc>
+          <w:tcPr>
+            <w:tcW w:w="1211" w:type="pct"/>
+          </w:tcPr>
+          <w:p>
+            <w:pPr>
+              <w:rPr>
+                <w:lang w:val="en-US"/>
+              </w:rPr>
+            </w:pPr>
+            <w:r>
+              <w:rPr>
+                <w:lang w:val="en-US"/>
+              </w:rPr>
+              <w:lastRenderedPageBreak/>
+              <w:t>With restart right next</w:t>
+            </w:r>
+          </w:p>
+        </w:tc>
+        <w:tc>
+          <w:tcPr>
+            <w:tcW w:w="1750" w:type="pct"/>
+            <w:vMerge w:val="restart"/>
+          </w:tcPr>
+          <w:p>
+            <w:pPr>
+              <w:rPr>
+                <w:lang w:val="en-US"/>
+              </w:rPr>
+            </w:pPr>
+            <w:r>
+              <w:rPr>
+                <w:lang w:val="en-US"/>
+              </w:rPr>
+              <w:t>Vert merge</w:t>
+            </w:r>
+          </w:p>
+        </w:tc>
+        <w:tc>
+          <w:tcPr>
+            <w:tcW w:w="1587" w:type="pct"/>
+          </w:tcPr>
+          <w:p>
+            <w:pPr>
+              <w:rPr>
+                <w:lang w:val="en-US"/>
+              </w:rPr>
+            </w:pPr>
+          </w:p>
+        </w:tc>
+      </w:tr>
+      <w:tr>
+        <w:trPr>
+          <w:tblCellSpacing w:w="11" w:type="dxa"/>
+        </w:trPr>
+        <w:tc>
+          <w:tcPr>
+            <w:tcW w:w="1211" w:type="pct"/>
+          </w:tcPr>
+          <w:p>
+            <w:pPr>
+              <w:rPr>
+                <w:lang w:val="en-US"/>
+              </w:rPr>
+            </w:pPr>
+            <w:r>
+              <w:rPr>
+                <w:lang w:val="en-US"/>
+              </w:rPr>
+              <w:t>Only one</w:t>
+            </w:r>
+          </w:p>
+        </w:tc>
+        <w:tc>
+          <w:tcPr>
+            <w:tcW w:w="2202" w:type="pct"/>
+            <w:vMerge/>
+          </w:tcPr>
+          <w:p/>
+        </w:tc>
+        <w:tc>
+          <w:tcPr>
+            <w:tcW w:w="1587" w:type="pct"/>
+          </w:tcPr>
+          <w:p/>
+        </w:tc>
+      </w:tr>
+      <w:tr>
+        <w:trPr>
+          <w:tblCellSpacing w:w="11" w:type="dxa"/>
+        </w:trPr>
+        <w:tc>
+          <w:tcPr>
+            <w:tcW w:w="3413" w:type="pct"/>
+            <w:gridSpan w:val="2"/>
+          </w:tcPr>
+          <w:p>
+            <w:pPr>
+              <w:rPr>
+                <w:lang w:val="en-US"/>
+              </w:rPr>
+            </w:pPr>
+            <w:r>
+              <w:rPr>
+                <w:lang w:val="en-US"/>
+              </w:rPr>
+              <w:t>Grid span</w:t>
+            </w:r>
+          </w:p>
+        </w:tc>
+        <w:tc>
+          <w:tcPr>
+            <w:tcW w:w="1587" w:type="pct"/>
+          </w:tcPr>
+          <w:p>
+            <w:pPr>
+              <w:rPr>
+                <w:lang w:val="en-US"/>
+              </w:rPr>
+            </w:pPr>
+          </w:p>
+        </w:tc>
+      </w:tr>
+    </w:tbl>
+    <w:p/>
     <w:sectPr>
       <w:pgSz w:w="11906" w:h="16838"/>
       <w:pgMar w:top="1134" w:right="850" w:bottom="1134" w:left="1701" w:header="708" w:footer="708" w:gutter="0"/>
@@ -551,7 +1037,7 @@
         <v:path o:extrusionok="f" gradientshapeok="t" o:connecttype="rect"/>
         <o:lock v:ext="edit" aspectratio="t"/>
       </v:shapetype>
-      <v:shape id="_x0000_i1027" type="#_x0000_t75" style="width:483.75pt;height:438.75pt" o:bullet="t">
+      <v:shape id="_x0000_i1028" type="#_x0000_t75" style="width:483.75pt;height:438.75pt" o:bullet="t">
         <v:imagedata r:id="rId1" o:title="Red_Apple[1]"/>
       </v:shape>
     </w:pict>
@@ -2172,6 +2658,125 @@
       <w:szCs w:val="18"/>
     </w:rPr>
   </w:style>
+  <w:style w:type="table" w:customStyle="1" w:styleId="FirstRowOnlyOuter">
+    <w:name w:val="FirstRowOnlyOuter"/>
+    <w:basedOn w:val="a1"/>
+    <w:uiPriority w:val="99"/>
+    <w:rsid w:val="008E2AD2"/>
+    <w:pPr>
+      <w:spacing w:after="0" w:line="240" w:lineRule="auto"/>
+    </w:pPr>
+    <w:tblPr>
+      <w:tblCellSpacing w:w="71" w:type="dxa"/>
+      <w:tblInd w:w="0" w:type="nil"/>
+    </w:tblPr>
+    <w:trPr>
+      <w:tblCellSpacing w:w="71" w:type="dxa"/>
+    </w:trPr>
+    <w:tblStylePr w:type="firstRow">
+      <w:rPr>
+        <w:b/>
+        <w:i/>
+        <w:caps/>
+        <w:smallCaps w:val="0"/>
+        <w:u w:val="dashDotHeavy"/>
+      </w:rPr>
+      <w:tblPr/>
+      <w:tcPr>
+        <w:tcBorders>
+          <w:top w:val="single" w:sz="4" w:space="0" w:color="auto"/>
+          <w:left w:val="single" w:sz="4" w:space="0" w:color="auto"/>
+          <w:bottom w:val="single" w:sz="4" w:space="0" w:color="auto"/>
+          <w:right w:val="single" w:sz="4" w:space="0" w:color="auto"/>
+          <w:insideH w:val="nil"/>
+          <w:insideV w:val="nil"/>
+          <w:tl2br w:val="nil"/>
+          <w:tr2bl w:val="nil"/>
+        </w:tcBorders>
+      </w:tcPr>
+    </w:tblStylePr>
+    <w:tblStylePr w:type="lastRow">
+      <w:tblPr/>
+      <w:tcPr>
+        <w:tcBorders>
+          <w:top w:val="single" w:sz="4" w:space="0" w:color="auto"/>
+          <w:left w:val="single" w:sz="4" w:space="0" w:color="auto"/>
+          <w:bottom w:val="single" w:sz="4" w:space="0" w:color="auto"/>
+          <w:right w:val="single" w:sz="4" w:space="0" w:color="auto"/>
+          <w:insideH w:val="nil"/>
+          <w:insideV w:val="nil"/>
+          <w:tl2br w:val="nil"/>
+          <w:tr2bl w:val="nil"/>
+        </w:tcBorders>
+      </w:tcPr>
+    </w:tblStylePr>
+  </w:style>
+  <w:style w:type="table" w:customStyle="1" w:styleId="Scary">
+    <w:name w:val="Scary"/>
+    <w:basedOn w:val="a1"/>
+    <w:uiPriority w:val="99"/>
+    <w:rsid w:val="008E2AD2"/>
+    <w:pPr>
+      <w:spacing w:after="0" w:line="240" w:lineRule="auto"/>
+    </w:pPr>
+    <w:tblPr>
+      <w:tblStyleRowBandSize w:val="1"/>
+      <w:tblStyleColBandSize w:val="1"/>
+      <w:tblBorders>
+        <w:top w:val="single" w:sz="4" w:space="0" w:color="auto"/>
+        <w:left w:val="single" w:sz="4" w:space="0" w:color="auto"/>
+        <w:bottom w:val="single" w:sz="4" w:space="0" w:color="auto"/>
+        <w:right w:val="single" w:sz="4" w:space="0" w:color="auto"/>
+        <w:insideH w:val="single" w:sz="4" w:space="0" w:color="auto"/>
+        <w:insideV w:val="single" w:sz="4" w:space="0" w:color="auto"/>
+      </w:tblBorders>
+    </w:tblPr>
+    <w:tblStylePr w:type="band1Vert">
+      <w:tblPr/>
+      <w:tcPr>
+        <w:tcBorders>
+          <w:top w:val="dashed" w:sz="4" w:space="0" w:color="auto"/>
+          <w:left w:val="dashed" w:sz="4" w:space="0" w:color="auto"/>
+          <w:bottom w:val="dashed" w:sz="4" w:space="0" w:color="auto"/>
+          <w:right w:val="dashed" w:sz="4" w:space="0" w:color="auto"/>
+          <w:insideH w:val="dashed" w:sz="4" w:space="0" w:color="auto"/>
+          <w:insideV w:val="dashed" w:sz="4" w:space="0" w:color="auto"/>
+          <w:tl2br w:val="nil"/>
+          <w:tr2bl w:val="nil"/>
+        </w:tcBorders>
+      </w:tcPr>
+    </w:tblStylePr>
+    <w:tblStylePr w:type="band2Vert">
+      <w:tblPr/>
+      <w:tcPr>
+        <w:tcBorders>
+          <w:top w:val="thinThickSmallGap" w:sz="24" w:space="0" w:color="auto"/>
+          <w:left w:val="thinThickSmallGap" w:sz="24" w:space="0" w:color="auto"/>
+          <w:bottom w:val="thinThickSmallGap" w:sz="24" w:space="0" w:color="auto"/>
+          <w:right w:val="thinThickSmallGap" w:sz="24" w:space="0" w:color="auto"/>
+          <w:insideH w:val="thinThickSmallGap" w:sz="24" w:space="0" w:color="auto"/>
+          <w:insideV w:val="thinThickSmallGap" w:sz="24" w:space="0" w:color="auto"/>
+          <w:tl2br w:val="nil"/>
+          <w:tr2bl w:val="nil"/>
+        </w:tcBorders>
+      </w:tcPr>
+    </w:tblStylePr>
+    <w:tblStylePr w:type="band2Horz">
+      <w:tblPr/>
+      <w:tcPr>
+        <w:tcBorders>
+          <w:top w:val="nil"/>
+          <w:left w:val="nil"/>
+          <w:bottom w:val="nil"/>
+          <w:right w:val="nil"/>
+          <w:insideH w:val="nil"/>
+          <w:insideV w:val="nil"/>
+          <w:tl2br w:val="nil"/>
+          <w:tr2bl w:val="nil"/>
+        </w:tcBorders>
+      </w:tcPr>
+    </w:tblStylePr>
+  </w:style>
 </w:styles>
 </file>
 
@@ -2475,7 +3080,7 @@
 </file>
 
 <file path=customXml/itemProps1.xml><?xml version="1.0" encoding="utf-8"?>
-<ds:datastoreItem xmlns:ds="http://schemas.openxmlformats.org/officeDocument/2006/customXml" ds:itemID="{3F5B64F6-6FF2-4D1F-80AC-23246AA0392B}">
+<ds:datastoreItem xmlns:ds="http://schemas.openxmlformats.org/officeDocument/2006/customXml" ds:itemID="{B61950CE-6CAC-4A11-82EF-D29C42E02D38}">
   <ds:schemaRefs>
     <ds:schemaRef ds:uri="http://schemas.openxmlformats.org/officeDocument/2006/bibliography"/>
   </ds:schemaRefs>

</xml_diff>

<commit_message>
prepare for p content and row changes
</commit_message>
<xml_diff>
--- a/tests/examples/List.docx
+++ b/tests/examples/List.docx
@@ -1,6 +1,6 @@
 
 <file path=word/document.xml><?xml version="1.0" encoding="utf-8"?>
-<w:document xmlns:wpc="http://schemas.microsoft.com/office/word/2010/wordprocessingCanvas" xmlns:cx="http://schemas.microsoft.com/office/drawing/2014/chartex" xmlns:cx1="http://schemas.microsoft.com/office/drawing/2015/9/8/chartex" xmlns:cx2="http://schemas.microsoft.com/office/drawing/2015/10/21/chartex" xmlns:cx3="http://schemas.microsoft.com/office/drawing/2016/5/9/chartex" xmlns:cx4="http://schemas.microsoft.com/office/drawing/2016/5/10/chartex" xmlns:cx5="http://schemas.microsoft.com/office/drawing/2016/5/11/chartex" xmlns:cx6="http://schemas.microsoft.com/office/drawing/2016/5/12/chartex" xmlns:cx7="http://schemas.microsoft.com/office/drawing/2016/5/13/chartex" xmlns:cx8="http://schemas.microsoft.com/office/drawing/2016/5/14/chartex" xmlns:mc="http://schemas.openxmlformats.org/markup-compatibility/2006" xmlns:aink="http://schemas.microsoft.com/office/drawing/2016/ink" xmlns:am3d="http://schemas.microsoft.com/office/drawing/2017/model3d" xmlns:o="urn:schemas-microsoft-com:office:office" xmlns:r="http://schemas.openxmlformats.org/officeDocument/2006/relationships" xmlns:m="http://schemas.openxmlformats.org/officeDocument/2006/math" xmlns:v="urn:schemas-microsoft-com:vml" xmlns:wp14="http://schemas.microsoft.com/office/word/2010/wordprocessingDrawing" xmlns:wp="http://schemas.openxmlformats.org/drawingml/2006/wordprocessingDrawing" xmlns:w10="urn:schemas-microsoft-com:office:word" xmlns:w="http://schemas.openxmlformats.org/wordprocessingml/2006/main" xmlns:w14="http://schemas.microsoft.com/office/word/2010/wordml" xmlns:w15="http://schemas.microsoft.com/office/word/2012/wordml" xmlns:w16cex="http://schemas.microsoft.com/office/word/2018/wordml/cex" xmlns:w16cid="http://schemas.microsoft.com/office/word/2016/wordml/cid" xmlns:w16="http://schemas.microsoft.com/office/word/2018/wordml" xmlns:w16se="http://schemas.microsoft.com/office/word/2015/wordml/symex" xmlns:wpg="http://schemas.microsoft.com/office/word/2010/wordprocessingGroup" xmlns:wpi="http://schemas.microsoft.com/office/word/2010/wordprocessingInk" xmlns:wne="http://schemas.microsoft.com/office/word/2006/wordml" xmlns:wps="http://schemas.microsoft.com/office/word/2010/wordprocessingShape" mc:Ignorable="w14 w15 w16se w16cid w16 w16cex wp14">
+<w:document xmlns:wpc="http://schemas.microsoft.com/office/word/2010/wordprocessingCanvas" xmlns:cx="http://schemas.microsoft.com/office/drawing/2014/chartex" xmlns:cx1="http://schemas.microsoft.com/office/drawing/2015/9/8/chartex" xmlns:cx2="http://schemas.microsoft.com/office/drawing/2015/10/21/chartex" xmlns:cx3="http://schemas.microsoft.com/office/drawing/2016/5/9/chartex" xmlns:cx4="http://schemas.microsoft.com/office/drawing/2016/5/10/chartex" xmlns:cx5="http://schemas.microsoft.com/office/drawing/2016/5/11/chartex" xmlns:cx6="http://schemas.microsoft.com/office/drawing/2016/5/12/chartex" xmlns:cx7="http://schemas.microsoft.com/office/drawing/2016/5/13/chartex" xmlns:cx8="http://schemas.microsoft.com/office/drawing/2016/5/14/chartex" xmlns:mc="http://schemas.openxmlformats.org/markup-compatibility/2006" xmlns:aink="http://schemas.microsoft.com/office/drawing/2016/ink" xmlns:am3d="http://schemas.microsoft.com/office/drawing/2017/model3d" xmlns:o="urn:schemas-microsoft-com:office:office" xmlns:r="http://schemas.openxmlformats.org/officeDocument/2006/relationships" xmlns:m="http://schemas.openxmlformats.org/officeDocument/2006/math" xmlns:v="urn:schemas-microsoft-com:vml" xmlns:wp14="http://schemas.microsoft.com/office/word/2010/wordprocessingDrawing" xmlns:wp="http://schemas.openxmlformats.org/drawingml/2006/wordprocessingDrawing" xmlns:w10="urn:schemas-microsoft-com:office:word" xmlns:w="http://schemas.openxmlformats.org/wordprocessingml/2006/main" xmlns:w14="http://schemas.microsoft.com/office/word/2010/wordml" xmlns:w15="http://schemas.microsoft.com/office/word/2012/wordml" xmlns:w16cex="http://schemas.microsoft.com/office/word/2018/wordml/cex" xmlns:w16cid="http://schemas.microsoft.com/office/word/2016/wordml/cid" xmlns:w16="http://schemas.microsoft.com/office/word/2018/wordml" xmlns:w16sdtdh="http://schemas.microsoft.com/office/word/2020/wordml/sdtdatahash" xmlns:w16se="http://schemas.microsoft.com/office/word/2015/wordml/symex" xmlns:wpg="http://schemas.microsoft.com/office/word/2010/wordprocessingGroup" xmlns:wpi="http://schemas.microsoft.com/office/word/2010/wordprocessingInk" xmlns:wne="http://schemas.microsoft.com/office/word/2006/wordml" xmlns:wps="http://schemas.microsoft.com/office/word/2010/wordprocessingShape" mc:Ignorable="w14 w15 w16se w16cid w16 w16cex w16sdtdh wp14">
   <w:body>
     <w:p>
       <w:pPr>
@@ -73,10 +73,14 @@
         </w:numPr>
         <w:spacing w:line="257" w:lineRule="auto"/>
         <w:contextualSpacing/>
+        <w:rPr>
+          <w:spacing w:val="60"/>
+        </w:rPr>
       </w:pPr>
       <w:proofErr w:type="spellStart"/>
       <w:r>
         <w:rPr>
+          <w:spacing w:val="60"/>
           <w:lang w:val="en-US"/>
         </w:rPr>
         <w:t>fd</w:t>
@@ -683,8 +687,6 @@
               </w:rPr>
               <w:t>fd</w:t>
             </w:r>
-            <w:bookmarkStart w:id="0" w:name="_GoBack"/>
-            <w:bookmarkEnd w:id="0"/>
             <w:proofErr w:type="spellEnd"/>
           </w:p>
         </w:tc>
@@ -1060,7 +1062,7 @@
 </file>
 
 <file path=word/numbering.xml><?xml version="1.0" encoding="utf-8"?>
-<w:numbering xmlns:wpc="http://schemas.microsoft.com/office/word/2010/wordprocessingCanvas" xmlns:cx="http://schemas.microsoft.com/office/drawing/2014/chartex" xmlns:cx1="http://schemas.microsoft.com/office/drawing/2015/9/8/chartex" xmlns:cx2="http://schemas.microsoft.com/office/drawing/2015/10/21/chartex" xmlns:cx3="http://schemas.microsoft.com/office/drawing/2016/5/9/chartex" xmlns:cx4="http://schemas.microsoft.com/office/drawing/2016/5/10/chartex" xmlns:cx5="http://schemas.microsoft.com/office/drawing/2016/5/11/chartex" xmlns:cx6="http://schemas.microsoft.com/office/drawing/2016/5/12/chartex" xmlns:cx7="http://schemas.microsoft.com/office/drawing/2016/5/13/chartex" xmlns:cx8="http://schemas.microsoft.com/office/drawing/2016/5/14/chartex" xmlns:mc="http://schemas.openxmlformats.org/markup-compatibility/2006" xmlns:aink="http://schemas.microsoft.com/office/drawing/2016/ink" xmlns:am3d="http://schemas.microsoft.com/office/drawing/2017/model3d" xmlns:o="urn:schemas-microsoft-com:office:office" xmlns:r="http://schemas.openxmlformats.org/officeDocument/2006/relationships" xmlns:m="http://schemas.openxmlformats.org/officeDocument/2006/math" xmlns:v="urn:schemas-microsoft-com:vml" xmlns:wp14="http://schemas.microsoft.com/office/word/2010/wordprocessingDrawing" xmlns:wp="http://schemas.openxmlformats.org/drawingml/2006/wordprocessingDrawing" xmlns:w10="urn:schemas-microsoft-com:office:word" xmlns:w="http://schemas.openxmlformats.org/wordprocessingml/2006/main" xmlns:w14="http://schemas.microsoft.com/office/word/2010/wordml" xmlns:w15="http://schemas.microsoft.com/office/word/2012/wordml" xmlns:w16cex="http://schemas.microsoft.com/office/word/2018/wordml/cex" xmlns:w16cid="http://schemas.microsoft.com/office/word/2016/wordml/cid" xmlns:w16="http://schemas.microsoft.com/office/word/2018/wordml" xmlns:w16se="http://schemas.microsoft.com/office/word/2015/wordml/symex" xmlns:wpg="http://schemas.microsoft.com/office/word/2010/wordprocessingGroup" xmlns:wpi="http://schemas.microsoft.com/office/word/2010/wordprocessingInk" xmlns:wne="http://schemas.microsoft.com/office/word/2006/wordml" xmlns:wps="http://schemas.microsoft.com/office/word/2010/wordprocessingShape" mc:Ignorable="w14 w15 w16se w16cid w16 w16cex wp14">
+<w:numbering xmlns:wpc="http://schemas.microsoft.com/office/word/2010/wordprocessingCanvas" xmlns:cx="http://schemas.microsoft.com/office/drawing/2014/chartex" xmlns:cx1="http://schemas.microsoft.com/office/drawing/2015/9/8/chartex" xmlns:cx2="http://schemas.microsoft.com/office/drawing/2015/10/21/chartex" xmlns:cx3="http://schemas.microsoft.com/office/drawing/2016/5/9/chartex" xmlns:cx4="http://schemas.microsoft.com/office/drawing/2016/5/10/chartex" xmlns:cx5="http://schemas.microsoft.com/office/drawing/2016/5/11/chartex" xmlns:cx6="http://schemas.microsoft.com/office/drawing/2016/5/12/chartex" xmlns:cx7="http://schemas.microsoft.com/office/drawing/2016/5/13/chartex" xmlns:cx8="http://schemas.microsoft.com/office/drawing/2016/5/14/chartex" xmlns:mc="http://schemas.openxmlformats.org/markup-compatibility/2006" xmlns:aink="http://schemas.microsoft.com/office/drawing/2016/ink" xmlns:am3d="http://schemas.microsoft.com/office/drawing/2017/model3d" xmlns:o="urn:schemas-microsoft-com:office:office" xmlns:r="http://schemas.openxmlformats.org/officeDocument/2006/relationships" xmlns:m="http://schemas.openxmlformats.org/officeDocument/2006/math" xmlns:v="urn:schemas-microsoft-com:vml" xmlns:wp14="http://schemas.microsoft.com/office/word/2010/wordprocessingDrawing" xmlns:wp="http://schemas.openxmlformats.org/drawingml/2006/wordprocessingDrawing" xmlns:w10="urn:schemas-microsoft-com:office:word" xmlns:w="http://schemas.openxmlformats.org/wordprocessingml/2006/main" xmlns:w14="http://schemas.microsoft.com/office/word/2010/wordml" xmlns:w15="http://schemas.microsoft.com/office/word/2012/wordml" xmlns:w16cex="http://schemas.microsoft.com/office/word/2018/wordml/cex" xmlns:w16cid="http://schemas.microsoft.com/office/word/2016/wordml/cid" xmlns:w16="http://schemas.microsoft.com/office/word/2018/wordml" xmlns:w16sdtdh="http://schemas.microsoft.com/office/word/2020/wordml/sdtdatahash" xmlns:w16se="http://schemas.microsoft.com/office/word/2015/wordml/symex" xmlns:wpg="http://schemas.microsoft.com/office/word/2010/wordprocessingGroup" xmlns:wpi="http://schemas.microsoft.com/office/word/2010/wordprocessingInk" xmlns:wne="http://schemas.microsoft.com/office/word/2006/wordml" xmlns:wps="http://schemas.microsoft.com/office/word/2010/wordprocessingShape" mc:Ignorable="w14 w15 w16se w16cid w16 w16cex w16sdtdh wp14">
   <w:numPicBullet w:numPicBulletId="0">
     <w:pict>
       <v:shapetype id="_x0000_t75" coordsize="21600,21600" o:spt="75" o:preferrelative="t" path="m@4@5l@4@11@9@11@9@5xe" filled="f" stroked="f">
@@ -1082,7 +1084,7 @@
         <v:path o:extrusionok="f" gradientshapeok="t" o:connecttype="rect"/>
         <o:lock v:ext="edit" aspectratio="t"/>
       </v:shapetype>
-      <v:shape id="_x0000_i1029" type="#_x0000_t75" style="width:483.75pt;height:438.75pt" o:bullet="t">
+      <v:shape id="_x0000_i1066" type="#_x0000_t75" style="width:483.75pt;height:438.75pt" o:bullet="t">
         <v:imagedata r:id="rId1" o:title="Red_Apple[1]"/>
       </v:shape>
     </w:pict>
@@ -2252,7 +2254,7 @@
 </file>
 
 <file path=word/styles.xml><?xml version="1.0" encoding="utf-8"?>
-<w:styles xmlns:mc="http://schemas.openxmlformats.org/markup-compatibility/2006" xmlns:r="http://schemas.openxmlformats.org/officeDocument/2006/relationships" xmlns:w="http://schemas.openxmlformats.org/wordprocessingml/2006/main" xmlns:w14="http://schemas.microsoft.com/office/word/2010/wordml" xmlns:w15="http://schemas.microsoft.com/office/word/2012/wordml" xmlns:w16cex="http://schemas.microsoft.com/office/word/2018/wordml/cex" xmlns:w16cid="http://schemas.microsoft.com/office/word/2016/wordml/cid" xmlns:w16="http://schemas.microsoft.com/office/word/2018/wordml" xmlns:w16se="http://schemas.microsoft.com/office/word/2015/wordml/symex" mc:Ignorable="w14 w15 w16se w16cid w16 w16cex">
+<w:styles xmlns:mc="http://schemas.openxmlformats.org/markup-compatibility/2006" xmlns:r="http://schemas.openxmlformats.org/officeDocument/2006/relationships" xmlns:w="http://schemas.openxmlformats.org/wordprocessingml/2006/main" xmlns:w14="http://schemas.microsoft.com/office/word/2010/wordml" xmlns:w15="http://schemas.microsoft.com/office/word/2012/wordml" xmlns:w16cex="http://schemas.microsoft.com/office/word/2018/wordml/cex" xmlns:w16cid="http://schemas.microsoft.com/office/word/2016/wordml/cid" xmlns:w16="http://schemas.microsoft.com/office/word/2018/wordml" xmlns:w16sdtdh="http://schemas.microsoft.com/office/word/2020/wordml/sdtdatahash" xmlns:w16se="http://schemas.microsoft.com/office/word/2015/wordml/symex" mc:Ignorable="w14 w15 w16se w16cid w16 w16cex w16sdtdh">
   <w:docDefaults>
     <w:rPrDefault>
       <w:rPr>

</xml_diff>

<commit_message>
prepare for fixes table
</commit_message>
<xml_diff>
--- a/tests/examples/List.docx
+++ b/tests/examples/List.docx
@@ -1,6 +1,6 @@
 
 <file path=word/document.xml><?xml version="1.0" encoding="utf-8"?>
-<w:document xmlns:wpc="http://schemas.microsoft.com/office/word/2010/wordprocessingCanvas" xmlns:cx="http://schemas.microsoft.com/office/drawing/2014/chartex" xmlns:cx1="http://schemas.microsoft.com/office/drawing/2015/9/8/chartex" xmlns:cx2="http://schemas.microsoft.com/office/drawing/2015/10/21/chartex" xmlns:cx3="http://schemas.microsoft.com/office/drawing/2016/5/9/chartex" xmlns:cx4="http://schemas.microsoft.com/office/drawing/2016/5/10/chartex" xmlns:cx5="http://schemas.microsoft.com/office/drawing/2016/5/11/chartex" xmlns:cx6="http://schemas.microsoft.com/office/drawing/2016/5/12/chartex" xmlns:cx7="http://schemas.microsoft.com/office/drawing/2016/5/13/chartex" xmlns:cx8="http://schemas.microsoft.com/office/drawing/2016/5/14/chartex" xmlns:mc="http://schemas.openxmlformats.org/markup-compatibility/2006" xmlns:aink="http://schemas.microsoft.com/office/drawing/2016/ink" xmlns:am3d="http://schemas.microsoft.com/office/drawing/2017/model3d" xmlns:o="urn:schemas-microsoft-com:office:office" xmlns:r="http://schemas.openxmlformats.org/officeDocument/2006/relationships" xmlns:m="http://schemas.openxmlformats.org/officeDocument/2006/math" xmlns:v="urn:schemas-microsoft-com:vml" xmlns:wp14="http://schemas.microsoft.com/office/word/2010/wordprocessingDrawing" xmlns:wp="http://schemas.openxmlformats.org/drawingml/2006/wordprocessingDrawing" xmlns:w10="urn:schemas-microsoft-com:office:word" xmlns:w="http://schemas.openxmlformats.org/wordprocessingml/2006/main" xmlns:w14="http://schemas.microsoft.com/office/word/2010/wordml" xmlns:w15="http://schemas.microsoft.com/office/word/2012/wordml" xmlns:w16cex="http://schemas.microsoft.com/office/word/2018/wordml/cex" xmlns:w16cid="http://schemas.microsoft.com/office/word/2016/wordml/cid" xmlns:w16="http://schemas.microsoft.com/office/word/2018/wordml" xmlns:w16sdtdh="http://schemas.microsoft.com/office/word/2020/wordml/sdtdatahash" xmlns:w16se="http://schemas.microsoft.com/office/word/2015/wordml/symex" xmlns:wpg="http://schemas.microsoft.com/office/word/2010/wordprocessingGroup" xmlns:wpi="http://schemas.microsoft.com/office/word/2010/wordprocessingInk" xmlns:wne="http://schemas.microsoft.com/office/word/2006/wordml" xmlns:wps="http://schemas.microsoft.com/office/word/2010/wordprocessingShape" mc:Ignorable="w14 w15 w16se w16cid w16 w16cex w16sdtdh wp14">
+<w:document xmlns:wpc="http://schemas.microsoft.com/office/word/2010/wordprocessingCanvas" xmlns:cx="http://schemas.microsoft.com/office/drawing/2014/chartex" xmlns:cx1="http://schemas.microsoft.com/office/drawing/2015/9/8/chartex" xmlns:cx2="http://schemas.microsoft.com/office/drawing/2015/10/21/chartex" xmlns:cx3="http://schemas.microsoft.com/office/drawing/2016/5/9/chartex" xmlns:cx4="http://schemas.microsoft.com/office/drawing/2016/5/10/chartex" xmlns:cx5="http://schemas.microsoft.com/office/drawing/2016/5/11/chartex" xmlns:cx6="http://schemas.microsoft.com/office/drawing/2016/5/12/chartex" xmlns:cx7="http://schemas.microsoft.com/office/drawing/2016/5/13/chartex" xmlns:cx8="http://schemas.microsoft.com/office/drawing/2016/5/14/chartex" xmlns:mc="http://schemas.openxmlformats.org/markup-compatibility/2006" xmlns:aink="http://schemas.microsoft.com/office/drawing/2016/ink" xmlns:am3d="http://schemas.microsoft.com/office/drawing/2017/model3d" xmlns:o="urn:schemas-microsoft-com:office:office" xmlns:r="http://schemas.openxmlformats.org/officeDocument/2006/relationships" xmlns:m="http://schemas.openxmlformats.org/officeDocument/2006/math" xmlns:v="urn:schemas-microsoft-com:vml" xmlns:wp14="http://schemas.microsoft.com/office/word/2010/wordprocessingDrawing" xmlns:wp="http://schemas.openxmlformats.org/drawingml/2006/wordprocessingDrawing" xmlns:w10="urn:schemas-microsoft-com:office:word" xmlns:w="http://schemas.openxmlformats.org/wordprocessingml/2006/main" xmlns:w14="http://schemas.microsoft.com/office/word/2010/wordml" xmlns:w15="http://schemas.microsoft.com/office/word/2012/wordml" xmlns:w16cex="http://schemas.microsoft.com/office/word/2018/wordml/cex" xmlns:w16cid="http://schemas.microsoft.com/office/word/2016/wordml/cid" xmlns:w16="http://schemas.microsoft.com/office/word/2018/wordml" xmlns:w16se="http://schemas.microsoft.com/office/word/2015/wordml/symex" xmlns:wpg="http://schemas.microsoft.com/office/word/2010/wordprocessingGroup" xmlns:wpi="http://schemas.microsoft.com/office/word/2010/wordprocessingInk" xmlns:wne="http://schemas.microsoft.com/office/word/2006/wordml" xmlns:wps="http://schemas.microsoft.com/office/word/2010/wordprocessingShape" mc:Ignorable="w14 w15 w16se w16cid w16 w16cex wp14">
   <w:body>
     <w:p>
       <w:pPr>
@@ -995,12 +995,19 @@
             <w:vMerge w:val="restart"/>
           </w:tcPr>
           <w:p>
+            <w:pPr>
+              <w:rPr>
+                <w:lang w:val="en-US"/>
+              </w:rPr>
+            </w:pPr>
             <w:r>
               <w:rPr>
                 <w:lang w:val="en-US"/>
               </w:rPr>
               <w:t>f</w:t>
             </w:r>
+            <w:bookmarkStart w:id="0" w:name="_GoBack"/>
+            <w:bookmarkEnd w:id="0"/>
           </w:p>
         </w:tc>
         <w:tc>
@@ -1663,7 +1670,7 @@
 </file>
 
 <file path=word/numbering.xml><?xml version="1.0" encoding="utf-8"?>
-<w:numbering xmlns:wpc="http://schemas.microsoft.com/office/word/2010/wordprocessingCanvas" xmlns:cx="http://schemas.microsoft.com/office/drawing/2014/chartex" xmlns:cx1="http://schemas.microsoft.com/office/drawing/2015/9/8/chartex" xmlns:cx2="http://schemas.microsoft.com/office/drawing/2015/10/21/chartex" xmlns:cx3="http://schemas.microsoft.com/office/drawing/2016/5/9/chartex" xmlns:cx4="http://schemas.microsoft.com/office/drawing/2016/5/10/chartex" xmlns:cx5="http://schemas.microsoft.com/office/drawing/2016/5/11/chartex" xmlns:cx6="http://schemas.microsoft.com/office/drawing/2016/5/12/chartex" xmlns:cx7="http://schemas.microsoft.com/office/drawing/2016/5/13/chartex" xmlns:cx8="http://schemas.microsoft.com/office/drawing/2016/5/14/chartex" xmlns:mc="http://schemas.openxmlformats.org/markup-compatibility/2006" xmlns:aink="http://schemas.microsoft.com/office/drawing/2016/ink" xmlns:am3d="http://schemas.microsoft.com/office/drawing/2017/model3d" xmlns:o="urn:schemas-microsoft-com:office:office" xmlns:r="http://schemas.openxmlformats.org/officeDocument/2006/relationships" xmlns:m="http://schemas.openxmlformats.org/officeDocument/2006/math" xmlns:v="urn:schemas-microsoft-com:vml" xmlns:wp14="http://schemas.microsoft.com/office/word/2010/wordprocessingDrawing" xmlns:wp="http://schemas.openxmlformats.org/drawingml/2006/wordprocessingDrawing" xmlns:w10="urn:schemas-microsoft-com:office:word" xmlns:w="http://schemas.openxmlformats.org/wordprocessingml/2006/main" xmlns:w14="http://schemas.microsoft.com/office/word/2010/wordml" xmlns:w15="http://schemas.microsoft.com/office/word/2012/wordml" xmlns:w16cex="http://schemas.microsoft.com/office/word/2018/wordml/cex" xmlns:w16cid="http://schemas.microsoft.com/office/word/2016/wordml/cid" xmlns:w16="http://schemas.microsoft.com/office/word/2018/wordml" xmlns:w16sdtdh="http://schemas.microsoft.com/office/word/2020/wordml/sdtdatahash" xmlns:w16se="http://schemas.microsoft.com/office/word/2015/wordml/symex" xmlns:wpg="http://schemas.microsoft.com/office/word/2010/wordprocessingGroup" xmlns:wpi="http://schemas.microsoft.com/office/word/2010/wordprocessingInk" xmlns:wne="http://schemas.microsoft.com/office/word/2006/wordml" xmlns:wps="http://schemas.microsoft.com/office/word/2010/wordprocessingShape" mc:Ignorable="w14 w15 w16se w16cid w16 w16cex w16sdtdh wp14">
+<w:numbering xmlns:wpc="http://schemas.microsoft.com/office/word/2010/wordprocessingCanvas" xmlns:cx="http://schemas.microsoft.com/office/drawing/2014/chartex" xmlns:cx1="http://schemas.microsoft.com/office/drawing/2015/9/8/chartex" xmlns:cx2="http://schemas.microsoft.com/office/drawing/2015/10/21/chartex" xmlns:cx3="http://schemas.microsoft.com/office/drawing/2016/5/9/chartex" xmlns:cx4="http://schemas.microsoft.com/office/drawing/2016/5/10/chartex" xmlns:cx5="http://schemas.microsoft.com/office/drawing/2016/5/11/chartex" xmlns:cx6="http://schemas.microsoft.com/office/drawing/2016/5/12/chartex" xmlns:cx7="http://schemas.microsoft.com/office/drawing/2016/5/13/chartex" xmlns:cx8="http://schemas.microsoft.com/office/drawing/2016/5/14/chartex" xmlns:mc="http://schemas.openxmlformats.org/markup-compatibility/2006" xmlns:aink="http://schemas.microsoft.com/office/drawing/2016/ink" xmlns:am3d="http://schemas.microsoft.com/office/drawing/2017/model3d" xmlns:o="urn:schemas-microsoft-com:office:office" xmlns:r="http://schemas.openxmlformats.org/officeDocument/2006/relationships" xmlns:m="http://schemas.openxmlformats.org/officeDocument/2006/math" xmlns:v="urn:schemas-microsoft-com:vml" xmlns:wp14="http://schemas.microsoft.com/office/word/2010/wordprocessingDrawing" xmlns:wp="http://schemas.openxmlformats.org/drawingml/2006/wordprocessingDrawing" xmlns:w10="urn:schemas-microsoft-com:office:word" xmlns:w="http://schemas.openxmlformats.org/wordprocessingml/2006/main" xmlns:w14="http://schemas.microsoft.com/office/word/2010/wordml" xmlns:w15="http://schemas.microsoft.com/office/word/2012/wordml" xmlns:w16cex="http://schemas.microsoft.com/office/word/2018/wordml/cex" xmlns:w16cid="http://schemas.microsoft.com/office/word/2016/wordml/cid" xmlns:w16="http://schemas.microsoft.com/office/word/2018/wordml" xmlns:w16se="http://schemas.microsoft.com/office/word/2015/wordml/symex" xmlns:wpg="http://schemas.microsoft.com/office/word/2010/wordprocessingGroup" xmlns:wpi="http://schemas.microsoft.com/office/word/2010/wordprocessingInk" xmlns:wne="http://schemas.microsoft.com/office/word/2006/wordml" xmlns:wps="http://schemas.microsoft.com/office/word/2010/wordprocessingShape" mc:Ignorable="w14 w15 w16se w16cid w16 w16cex wp14">
   <w:numPicBullet w:numPicBulletId="0">
     <w:pict>
       <v:shapetype id="_x0000_t75" coordsize="21600,21600" o:spt="75" o:preferrelative="t" path="m@4@5l@4@11@9@11@9@5xe" filled="f" stroked="f">
@@ -1685,7 +1692,7 @@
         <v:path o:extrusionok="f" gradientshapeok="t" o:connecttype="rect"/>
         <o:lock v:ext="edit" aspectratio="t"/>
       </v:shapetype>
-      <v:shape id="_x0000_i1064" type="#_x0000_t75" style="width:483.75pt;height:438.75pt" o:bullet="t">
+      <v:shape id="_x0000_i1031" type="#_x0000_t75" style="width:483.75pt;height:438.75pt" o:bullet="t">
         <v:imagedata r:id="rId1" o:title="Red_Apple[1]"/>
       </v:shape>
     </w:pict>
@@ -2857,7 +2864,7 @@
 </file>
 
 <file path=word/styles.xml><?xml version="1.0" encoding="utf-8"?>
-<w:styles xmlns:mc="http://schemas.openxmlformats.org/markup-compatibility/2006" xmlns:r="http://schemas.openxmlformats.org/officeDocument/2006/relationships" xmlns:w="http://schemas.openxmlformats.org/wordprocessingml/2006/main" xmlns:w14="http://schemas.microsoft.com/office/word/2010/wordml" xmlns:w15="http://schemas.microsoft.com/office/word/2012/wordml" xmlns:w16cex="http://schemas.microsoft.com/office/word/2018/wordml/cex" xmlns:w16cid="http://schemas.microsoft.com/office/word/2016/wordml/cid" xmlns:w16="http://schemas.microsoft.com/office/word/2018/wordml" xmlns:w16sdtdh="http://schemas.microsoft.com/office/word/2020/wordml/sdtdatahash" xmlns:w16se="http://schemas.microsoft.com/office/word/2015/wordml/symex" mc:Ignorable="w14 w15 w16se w16cid w16 w16cex w16sdtdh">
+<w:styles xmlns:mc="http://schemas.openxmlformats.org/markup-compatibility/2006" xmlns:r="http://schemas.openxmlformats.org/officeDocument/2006/relationships" xmlns:w="http://schemas.openxmlformats.org/wordprocessingml/2006/main" xmlns:w14="http://schemas.microsoft.com/office/word/2010/wordml" xmlns:w15="http://schemas.microsoft.com/office/word/2012/wordml" xmlns:w16cex="http://schemas.microsoft.com/office/word/2018/wordml/cex" xmlns:w16cid="http://schemas.microsoft.com/office/word/2016/wordml/cid" xmlns:w16="http://schemas.microsoft.com/office/word/2018/wordml" xmlns:w16se="http://schemas.microsoft.com/office/word/2015/wordml/symex" mc:Ignorable="w14 w15 w16se w16cid w16 w16cex">
   <w:docDefaults>
     <w:rPrDefault>
       <w:rPr>
@@ -3867,7 +3874,7 @@
 </file>
 
 <file path=customXml/itemProps1.xml><?xml version="1.0" encoding="utf-8"?>
-<ds:datastoreItem xmlns:ds="http://schemas.openxmlformats.org/officeDocument/2006/customXml" ds:itemID="{70A19C7B-61CA-4027-99CC-1B6A8431A0A1}">
+<ds:datastoreItem xmlns:ds="http://schemas.openxmlformats.org/officeDocument/2006/customXml" ds:itemID="{CE3CD153-7130-4E95-AB41-D8222A292AFA}">
   <ds:schemaRefs>
     <ds:schemaRef ds:uri="http://schemas.openxmlformats.org/officeDocument/2006/bibliography"/>
   </ds:schemaRefs>

</xml_diff>

<commit_message>
Fix bugs with para direction and refac some funcs
</commit_message>
<xml_diff>
--- a/tests/examples/List.docx
+++ b/tests/examples/List.docx
@@ -102,12 +102,14 @@
         <w:spacing w:after="480" w:line="257" w:lineRule="auto"/>
         <w:contextualSpacing/>
       </w:pPr>
+      <w:proofErr w:type="spellStart"/>
       <w:r>
         <w:rPr>
           <w:lang w:val="en-US"/>
         </w:rPr>
         <w:t>fd</w:t>
       </w:r>
+      <w:proofErr w:type="spellEnd"/>
     </w:p>
     <w:p>
       <w:pPr>
@@ -151,6 +153,7 @@
         </w:rPr>
         <w:br w:type="textWrapping" w:clear="all"/>
       </w:r>
+      <w:proofErr w:type="spellStart"/>
       <w:r>
         <w:rPr>
           <w:spacing w:val="40"/>
@@ -158,6 +161,7 @@
         </w:rPr>
         <w:t>ffff</w:t>
       </w:r>
+      <w:proofErr w:type="spellEnd"/>
     </w:p>
     <w:p>
       <w:pPr>
@@ -200,8 +204,16 @@
         <w:rPr>
           <w:lang w:val="en-US"/>
         </w:rPr>
-        <w:t>next ilvl</w:t>
+        <w:t xml:space="preserve">next </w:t>
       </w:r>
+      <w:proofErr w:type="spellStart"/>
+      <w:r>
+        <w:rPr>
+          <w:lang w:val="en-US"/>
+        </w:rPr>
+        <w:t>ilvl</w:t>
+      </w:r>
+      <w:proofErr w:type="spellEnd"/>
       <w:r>
         <w:rPr>
           <w:lang w:val="en-US"/>
@@ -285,8 +297,16 @@
         <w:rPr>
           <w:lang w:val="en-US"/>
         </w:rPr>
-        <w:t>next ilvl</w:t>
+        <w:t xml:space="preserve">next </w:t>
       </w:r>
+      <w:proofErr w:type="spellStart"/>
+      <w:r>
+        <w:rPr>
+          <w:lang w:val="en-US"/>
+        </w:rPr>
+        <w:t>ilvl</w:t>
+      </w:r>
+      <w:proofErr w:type="spellEnd"/>
     </w:p>
     <w:p>
       <w:pPr>
@@ -299,12 +319,14 @@
         <w:spacing w:line="257" w:lineRule="auto"/>
         <w:contextualSpacing/>
       </w:pPr>
+      <w:proofErr w:type="spellStart"/>
       <w:r>
         <w:rPr>
           <w:lang w:val="en-US"/>
         </w:rPr>
         <w:t>fdf</w:t>
       </w:r>
+      <w:proofErr w:type="spellEnd"/>
     </w:p>
     <w:p>
       <w:pPr>
@@ -317,12 +339,14 @@
         <w:spacing w:line="257" w:lineRule="auto"/>
         <w:contextualSpacing/>
       </w:pPr>
+      <w:proofErr w:type="spellStart"/>
       <w:r>
         <w:rPr>
           <w:lang w:val="en-US"/>
         </w:rPr>
         <w:t>fdf</w:t>
       </w:r>
+      <w:proofErr w:type="spellEnd"/>
     </w:p>
     <w:p>
       <w:pPr>
@@ -353,12 +377,14 @@
         <w:spacing w:line="257" w:lineRule="auto"/>
         <w:contextualSpacing/>
       </w:pPr>
+      <w:proofErr w:type="spellStart"/>
       <w:r>
         <w:rPr>
           <w:lang w:val="en-US"/>
         </w:rPr>
         <w:t>fd</w:t>
       </w:r>
+      <w:proofErr w:type="spellEnd"/>
     </w:p>
     <w:p>
       <w:pPr>
@@ -371,9 +397,11 @@
         <w:spacing w:line="257" w:lineRule="auto"/>
         <w:contextualSpacing/>
       </w:pPr>
+      <w:proofErr w:type="spellStart"/>
       <w:r>
         <w:t>ав</w:t>
       </w:r>
+      <w:proofErr w:type="spellEnd"/>
     </w:p>
     <w:p>
       <w:pPr>
@@ -398,12 +426,14 @@
         <w:spacing w:line="257" w:lineRule="auto"/>
         <w:contextualSpacing/>
       </w:pPr>
+      <w:proofErr w:type="spellStart"/>
       <w:r>
         <w:rPr>
           <w:lang w:val="en-US"/>
         </w:rPr>
         <w:t>fdfd</w:t>
       </w:r>
+      <w:proofErr w:type="spellEnd"/>
     </w:p>
     <w:p>
       <w:pPr>
@@ -470,6 +500,8 @@
         </w:rPr>
         <w:t>f</w:t>
       </w:r>
+      <w:bookmarkStart w:id="0" w:name="_GoBack"/>
+      <w:bookmarkEnd w:id="0"/>
     </w:p>
     <w:p>
       <w:pPr>
@@ -530,12 +562,14 @@
         <w:jc w:val="right"/>
         <w:outlineLvl w:val="9"/>
       </w:pPr>
+      <w:proofErr w:type="spellStart"/>
       <w:r>
         <w:rPr>
           <w:lang w:val="en-US"/>
         </w:rPr>
         <w:t>HaHa</w:t>
       </w:r>
+      <w:proofErr w:type="spellEnd"/>
     </w:p>
     <w:p>
       <w:pPr>
@@ -579,9 +613,11 @@
                 <w:lang w:val="en-US"/>
               </w:rPr>
             </w:pPr>
+            <w:proofErr w:type="spellStart"/>
             <w:r>
               <w:t>ааа</w:t>
             </w:r>
+            <w:proofErr w:type="spellEnd"/>
           </w:p>
         </w:tc>
       </w:tr>
@@ -707,12 +743,14 @@
                 <w:lang w:val="en-US"/>
               </w:rPr>
             </w:pPr>
+            <w:proofErr w:type="spellStart"/>
             <w:r>
               <w:rPr>
                 <w:lang w:val="en-US"/>
               </w:rPr>
               <w:t>fsd</w:t>
             </w:r>
+            <w:proofErr w:type="spellEnd"/>
           </w:p>
           <w:p>
             <w:pPr>
@@ -725,12 +763,14 @@
                 <w:lang w:val="en-US"/>
               </w:rPr>
             </w:pPr>
+            <w:proofErr w:type="spellStart"/>
             <w:r>
               <w:rPr>
                 <w:lang w:val="en-US"/>
               </w:rPr>
               <w:t>fd</w:t>
             </w:r>
+            <w:proofErr w:type="spellEnd"/>
           </w:p>
           <w:p>
             <w:pPr>
@@ -743,12 +783,14 @@
                 <w:lang w:val="en-US"/>
               </w:rPr>
             </w:pPr>
+            <w:proofErr w:type="spellStart"/>
             <w:r>
               <w:rPr>
                 <w:lang w:val="en-US"/>
               </w:rPr>
               <w:t>fd</w:t>
             </w:r>
+            <w:proofErr w:type="spellEnd"/>
           </w:p>
         </w:tc>
         <w:tc>
@@ -876,8 +918,6 @@
               </w:rPr>
               <w:t>no</w:t>
             </w:r>
-            <w:bookmarkStart w:id="0" w:name="_GoBack"/>
-            <w:bookmarkEnd w:id="0"/>
           </w:p>
         </w:tc>
         <w:tc>
@@ -894,9 +934,11 @@
                 <w:lang w:val="en-US"/>
               </w:rPr>
             </w:pPr>
+            <w:proofErr w:type="spellStart"/>
             <w:r>
               <w:t>dstrike</w:t>
             </w:r>
+            <w:proofErr w:type="spellEnd"/>
             <w:r>
               <w:rPr>
                 <w:lang w:val="en-US"/>
@@ -916,6 +958,7 @@
                 <w:lang w:val="en-US"/>
               </w:rPr>
             </w:pPr>
+            <w:proofErr w:type="spellStart"/>
             <w:r>
               <w:rPr>
                 <w:lang w:val="en-US"/>
@@ -928,6 +971,7 @@
               </w:rPr>
               <w:t>_dstrike</w:t>
             </w:r>
+            <w:proofErr w:type="spellEnd"/>
           </w:p>
         </w:tc>
         <w:tc>
@@ -941,6 +985,7 @@
                 <w:lang w:val="en-US"/>
               </w:rPr>
             </w:pPr>
+            <w:proofErr w:type="spellStart"/>
             <w:r>
               <w:rPr>
                 <w:lang w:val="en-US"/>
@@ -953,6 +998,7 @@
               </w:rPr>
               <w:t>_up</w:t>
             </w:r>
+            <w:proofErr w:type="spellEnd"/>
           </w:p>
         </w:tc>
         <w:tc>
@@ -966,6 +1012,7 @@
                 <w:lang w:val="en-US"/>
               </w:rPr>
             </w:pPr>
+            <w:proofErr w:type="spellStart"/>
             <w:r>
               <w:rPr>
                 <w:lang w:val="en-US"/>
@@ -978,6 +1025,7 @@
               </w:rPr>
               <w:t>_dstrike</w:t>
             </w:r>
+            <w:proofErr w:type="spellEnd"/>
           </w:p>
         </w:tc>
         <w:tc>
@@ -991,6 +1039,7 @@
                 <w:lang w:val="en-US"/>
               </w:rPr>
             </w:pPr>
+            <w:proofErr w:type="spellStart"/>
             <w:r>
               <w:rPr>
                 <w:lang w:val="en-US"/>
@@ -1003,6 +1052,7 @@
               </w:rPr>
               <w:t>_up</w:t>
             </w:r>
+            <w:proofErr w:type="spellEnd"/>
           </w:p>
         </w:tc>
       </w:tr>
@@ -1027,9 +1077,11 @@
               </w:rPr>
               <w:t>strike_</w:t>
             </w:r>
+            <w:proofErr w:type="spellStart"/>
             <w:r>
               <w:t>underline</w:t>
             </w:r>
+            <w:proofErr w:type="spellEnd"/>
           </w:p>
         </w:tc>
         <w:tc>
@@ -1045,9 +1097,11 @@
                 <w:lang w:val="en-US"/>
               </w:rPr>
             </w:pPr>
+            <w:proofErr w:type="spellStart"/>
             <w:r>
               <w:t>underline</w:t>
             </w:r>
+            <w:proofErr w:type="spellEnd"/>
             <w:r>
               <w:rPr>
                 <w:lang w:val="en-US"/>
@@ -1067,6 +1121,7 @@
                 <w:lang w:val="en-US"/>
               </w:rPr>
             </w:pPr>
+            <w:proofErr w:type="spellStart"/>
             <w:r>
               <w:rPr>
                 <w:lang w:val="en-US"/>
@@ -1079,6 +1134,7 @@
               </w:rPr>
               <w:t>_underline</w:t>
             </w:r>
+            <w:proofErr w:type="spellEnd"/>
           </w:p>
         </w:tc>
         <w:tc>
@@ -1092,9 +1148,11 @@
                 <w:lang w:val="en-US"/>
               </w:rPr>
             </w:pPr>
+            <w:proofErr w:type="spellStart"/>
             <w:r>
               <w:t>underline</w:t>
             </w:r>
+            <w:proofErr w:type="spellEnd"/>
             <w:r>
               <w:rPr>
                 <w:lang w:val="en-US"/>
@@ -1114,6 +1172,7 @@
                 <w:lang w:val="en-US"/>
               </w:rPr>
             </w:pPr>
+            <w:proofErr w:type="spellStart"/>
             <w:r>
               <w:rPr>
                 <w:lang w:val="en-US"/>
@@ -1126,6 +1185,7 @@
               </w:rPr>
               <w:t>_underline</w:t>
             </w:r>
+            <w:proofErr w:type="spellEnd"/>
           </w:p>
         </w:tc>
       </w:tr>
@@ -1144,6 +1204,7 @@
                 <w:lang w:val="en-US"/>
               </w:rPr>
             </w:pPr>
+            <w:proofErr w:type="spellStart"/>
             <w:r>
               <w:rPr>
                 <w:lang w:val="en-US"/>
@@ -1156,6 +1217,7 @@
               </w:rPr>
               <w:t>italic</w:t>
             </w:r>
+            <w:proofErr w:type="spellEnd"/>
           </w:p>
         </w:tc>
         <w:tc>
@@ -1178,6 +1240,7 @@
                 <w:lang w:val="en-US"/>
               </w:rPr>
             </w:pPr>
+            <w:proofErr w:type="spellStart"/>
             <w:r>
               <w:rPr>
                 <w:lang w:val="en-US"/>
@@ -1190,6 +1253,7 @@
               </w:rPr>
               <w:t>_italic</w:t>
             </w:r>
+            <w:proofErr w:type="spellEnd"/>
           </w:p>
         </w:tc>
         <w:tc>
@@ -1252,9 +1316,11 @@
               </w:rPr>
               <w:t>strike_</w:t>
             </w:r>
+            <w:proofErr w:type="spellStart"/>
             <w:r>
               <w:t>underline</w:t>
             </w:r>
+            <w:proofErr w:type="spellEnd"/>
           </w:p>
         </w:tc>
         <w:tc>
@@ -1268,9 +1334,11 @@
                 <w:lang w:val="en-US"/>
               </w:rPr>
             </w:pPr>
+            <w:proofErr w:type="spellStart"/>
             <w:r>
               <w:t>underline</w:t>
             </w:r>
+            <w:proofErr w:type="spellEnd"/>
             <w:r>
               <w:rPr>
                 <w:lang w:val="en-US"/>
@@ -1290,9 +1358,11 @@
                 <w:lang w:val="en-US"/>
               </w:rPr>
             </w:pPr>
+            <w:proofErr w:type="spellStart"/>
             <w:r>
               <w:t>bold</w:t>
             </w:r>
+            <w:proofErr w:type="spellEnd"/>
             <w:r>
               <w:rPr>
                 <w:lang w:val="en-US"/>
@@ -1312,9 +1382,11 @@
                 <w:lang w:val="en-US"/>
               </w:rPr>
             </w:pPr>
+            <w:proofErr w:type="spellStart"/>
             <w:r>
               <w:t>underline</w:t>
             </w:r>
+            <w:proofErr w:type="spellEnd"/>
             <w:r>
               <w:rPr>
                 <w:lang w:val="en-US"/>
@@ -1334,6 +1406,7 @@
                 <w:lang w:val="en-US"/>
               </w:rPr>
             </w:pPr>
+            <w:proofErr w:type="spellStart"/>
             <w:r>
               <w:rPr>
                 <w:lang w:val="en-US"/>
@@ -1346,6 +1419,7 @@
               </w:rPr>
               <w:t>_underline</w:t>
             </w:r>
+            <w:proofErr w:type="spellEnd"/>
           </w:p>
         </w:tc>
         <w:tc>
@@ -1359,9 +1433,11 @@
                 <w:lang w:val="en-US"/>
               </w:rPr>
             </w:pPr>
+            <w:proofErr w:type="spellStart"/>
             <w:r>
               <w:t>underline</w:t>
             </w:r>
+            <w:proofErr w:type="spellEnd"/>
             <w:r>
               <w:rPr>
                 <w:lang w:val="en-US"/>
@@ -1386,6 +1462,7 @@
                 <w:lang w:val="en-US"/>
               </w:rPr>
             </w:pPr>
+            <w:proofErr w:type="spellStart"/>
             <w:r>
               <w:rPr>
                 <w:lang w:val="en-US"/>
@@ -1398,6 +1475,7 @@
               </w:rPr>
               <w:t>italic</w:t>
             </w:r>
+            <w:proofErr w:type="spellEnd"/>
           </w:p>
         </w:tc>
         <w:tc>
@@ -1411,6 +1489,7 @@
                 <w:lang w:val="en-US"/>
               </w:rPr>
             </w:pPr>
+            <w:proofErr w:type="spellStart"/>
             <w:r>
               <w:rPr>
                 <w:lang w:val="en-US"/>
@@ -1423,6 +1502,7 @@
               </w:rPr>
               <w:t>_up</w:t>
             </w:r>
+            <w:proofErr w:type="spellEnd"/>
           </w:p>
         </w:tc>
         <w:tc>
@@ -1436,6 +1516,7 @@
                 <w:lang w:val="en-US"/>
               </w:rPr>
             </w:pPr>
+            <w:proofErr w:type="spellStart"/>
             <w:r>
               <w:rPr>
                 <w:lang w:val="en-US"/>
@@ -1448,6 +1529,7 @@
               </w:rPr>
               <w:t>_italic</w:t>
             </w:r>
+            <w:proofErr w:type="spellEnd"/>
           </w:p>
         </w:tc>
         <w:tc>
@@ -1461,6 +1543,7 @@
                 <w:lang w:val="en-US"/>
               </w:rPr>
             </w:pPr>
+            <w:proofErr w:type="spellStart"/>
             <w:r>
               <w:rPr>
                 <w:lang w:val="en-US"/>
@@ -1473,6 +1556,7 @@
               </w:rPr>
               <w:t>_up</w:t>
             </w:r>
+            <w:proofErr w:type="spellEnd"/>
           </w:p>
         </w:tc>
         <w:tc>
@@ -1486,6 +1570,7 @@
                 <w:lang w:val="en-US"/>
               </w:rPr>
             </w:pPr>
+            <w:proofErr w:type="spellStart"/>
             <w:r>
               <w:rPr>
                 <w:lang w:val="en-US"/>
@@ -1498,6 +1583,7 @@
               </w:rPr>
               <w:t>_italic</w:t>
             </w:r>
+            <w:proofErr w:type="spellEnd"/>
           </w:p>
         </w:tc>
         <w:tc>
@@ -1511,6 +1597,7 @@
                 <w:lang w:val="en-US"/>
               </w:rPr>
             </w:pPr>
+            <w:proofErr w:type="spellStart"/>
             <w:r>
               <w:rPr>
                 <w:lang w:val="en-US"/>
@@ -1523,6 +1610,7 @@
               </w:rPr>
               <w:t>_up</w:t>
             </w:r>
+            <w:proofErr w:type="spellEnd"/>
           </w:p>
         </w:tc>
       </w:tr>
@@ -1547,9 +1635,11 @@
               </w:rPr>
               <w:t>strike_</w:t>
             </w:r>
+            <w:proofErr w:type="spellStart"/>
             <w:r>
               <w:t>underline</w:t>
             </w:r>
+            <w:proofErr w:type="spellEnd"/>
           </w:p>
         </w:tc>
         <w:tc>
@@ -1563,9 +1653,11 @@
                 <w:lang w:val="en-US"/>
               </w:rPr>
             </w:pPr>
+            <w:proofErr w:type="spellStart"/>
             <w:r>
               <w:t>underline</w:t>
             </w:r>
+            <w:proofErr w:type="spellEnd"/>
             <w:r>
               <w:rPr>
                 <w:lang w:val="en-US"/>
@@ -1585,6 +1677,7 @@
                 <w:lang w:val="en-US"/>
               </w:rPr>
             </w:pPr>
+            <w:proofErr w:type="spellStart"/>
             <w:r>
               <w:rPr>
                 <w:lang w:val="en-US"/>
@@ -1597,6 +1690,7 @@
               </w:rPr>
               <w:t>_underline</w:t>
             </w:r>
+            <w:proofErr w:type="spellEnd"/>
           </w:p>
         </w:tc>
         <w:tc>
@@ -1610,9 +1704,11 @@
                 <w:lang w:val="en-US"/>
               </w:rPr>
             </w:pPr>
+            <w:proofErr w:type="spellStart"/>
             <w:r>
               <w:t>underline</w:t>
             </w:r>
+            <w:proofErr w:type="spellEnd"/>
             <w:r>
               <w:rPr>
                 <w:lang w:val="en-US"/>
@@ -1632,6 +1728,7 @@
                 <w:lang w:val="en-US"/>
               </w:rPr>
             </w:pPr>
+            <w:proofErr w:type="spellStart"/>
             <w:r>
               <w:rPr>
                 <w:lang w:val="en-US"/>
@@ -1644,6 +1741,7 @@
               </w:rPr>
               <w:t>_underline</w:t>
             </w:r>
+            <w:proofErr w:type="spellEnd"/>
           </w:p>
         </w:tc>
         <w:tc>
@@ -1657,9 +1755,11 @@
                 <w:lang w:val="en-US"/>
               </w:rPr>
             </w:pPr>
+            <w:proofErr w:type="spellStart"/>
             <w:r>
               <w:t>underline</w:t>
             </w:r>
+            <w:proofErr w:type="spellEnd"/>
             <w:r>
               <w:rPr>
                 <w:lang w:val="en-US"/>
@@ -1684,6 +1784,7 @@
                 <w:lang w:val="en-US"/>
               </w:rPr>
             </w:pPr>
+            <w:proofErr w:type="spellStart"/>
             <w:r>
               <w:rPr>
                 <w:lang w:val="en-US"/>
@@ -1696,6 +1797,7 @@
               </w:rPr>
               <w:t>italic</w:t>
             </w:r>
+            <w:proofErr w:type="spellEnd"/>
           </w:p>
         </w:tc>
         <w:tc>
@@ -1709,6 +1811,7 @@
                 <w:lang w:val="en-US"/>
               </w:rPr>
             </w:pPr>
+            <w:proofErr w:type="spellStart"/>
             <w:r>
               <w:rPr>
                 <w:lang w:val="en-US"/>
@@ -1721,6 +1824,7 @@
               </w:rPr>
               <w:t>_up</w:t>
             </w:r>
+            <w:proofErr w:type="spellEnd"/>
           </w:p>
         </w:tc>
         <w:tc>
@@ -1734,6 +1838,7 @@
                 <w:lang w:val="en-US"/>
               </w:rPr>
             </w:pPr>
+            <w:proofErr w:type="spellStart"/>
             <w:r>
               <w:rPr>
                 <w:lang w:val="en-US"/>
@@ -1746,6 +1851,7 @@
               </w:rPr>
               <w:t>_italic</w:t>
             </w:r>
+            <w:proofErr w:type="spellEnd"/>
           </w:p>
         </w:tc>
         <w:tc>
@@ -1759,6 +1865,7 @@
                 <w:lang w:val="en-US"/>
               </w:rPr>
             </w:pPr>
+            <w:proofErr w:type="spellStart"/>
             <w:r>
               <w:rPr>
                 <w:lang w:val="en-US"/>
@@ -1771,6 +1878,7 @@
               </w:rPr>
               <w:t>_up</w:t>
             </w:r>
+            <w:proofErr w:type="spellEnd"/>
           </w:p>
         </w:tc>
         <w:tc>
@@ -1784,6 +1892,7 @@
                 <w:lang w:val="en-US"/>
               </w:rPr>
             </w:pPr>
+            <w:proofErr w:type="spellStart"/>
             <w:r>
               <w:rPr>
                 <w:lang w:val="en-US"/>
@@ -1796,6 +1905,7 @@
               </w:rPr>
               <w:t>_italic</w:t>
             </w:r>
+            <w:proofErr w:type="spellEnd"/>
           </w:p>
         </w:tc>
         <w:tc>
@@ -1809,6 +1919,7 @@
                 <w:lang w:val="en-US"/>
               </w:rPr>
             </w:pPr>
+            <w:proofErr w:type="spellStart"/>
             <w:r>
               <w:rPr>
                 <w:lang w:val="en-US"/>
@@ -1821,6 +1932,7 @@
               </w:rPr>
               <w:t>_up</w:t>
             </w:r>
+            <w:proofErr w:type="spellEnd"/>
           </w:p>
         </w:tc>
       </w:tr>
@@ -1866,9 +1978,11 @@
               <w:ind w:left="113" w:right="113"/>
               <w:jc w:val="center"/>
             </w:pPr>
+            <w:proofErr w:type="spellStart"/>
             <w:r>
               <w:t>ыаваы</w:t>
             </w:r>
+            <w:proofErr w:type="spellEnd"/>
           </w:p>
         </w:tc>
         <w:tc>
@@ -1881,9 +1995,11 @@
               <w:ind w:left="113" w:right="113"/>
               <w:jc w:val="right"/>
             </w:pPr>
+            <w:proofErr w:type="spellStart"/>
             <w:r>
               <w:t>аыв</w:t>
             </w:r>
+            <w:proofErr w:type="spellEnd"/>
           </w:p>
         </w:tc>
       </w:tr>
@@ -1902,9 +2018,11 @@
             <w:pPr>
               <w:ind w:left="113" w:right="113"/>
             </w:pPr>
+            <w:proofErr w:type="spellStart"/>
             <w:r>
               <w:t>аыва</w:t>
             </w:r>
+            <w:proofErr w:type="spellEnd"/>
           </w:p>
         </w:tc>
         <w:tc>
@@ -1918,9 +2036,11 @@
               <w:ind w:left="113" w:right="113"/>
               <w:jc w:val="center"/>
             </w:pPr>
+            <w:proofErr w:type="spellStart"/>
             <w:r>
               <w:t>аыв</w:t>
             </w:r>
+            <w:proofErr w:type="spellEnd"/>
           </w:p>
         </w:tc>
         <w:tc>
@@ -1934,9 +2054,11 @@
               <w:ind w:left="113" w:right="113"/>
               <w:jc w:val="right"/>
             </w:pPr>
+            <w:proofErr w:type="spellStart"/>
             <w:r>
               <w:t>аыв</w:t>
             </w:r>
+            <w:proofErr w:type="spellEnd"/>
           </w:p>
         </w:tc>
       </w:tr>
@@ -1955,9 +2077,11 @@
             <w:pPr>
               <w:ind w:left="113" w:right="113"/>
             </w:pPr>
+            <w:proofErr w:type="spellStart"/>
             <w:r>
               <w:t>вфы</w:t>
             </w:r>
+            <w:proofErr w:type="spellEnd"/>
           </w:p>
         </w:tc>
         <w:tc>
@@ -1971,9 +2095,11 @@
               <w:ind w:left="113" w:right="113"/>
               <w:jc w:val="center"/>
             </w:pPr>
+            <w:proofErr w:type="spellStart"/>
             <w:r>
               <w:t>фыв</w:t>
             </w:r>
+            <w:proofErr w:type="spellEnd"/>
           </w:p>
         </w:tc>
         <w:tc>
@@ -1987,9 +2113,11 @@
               <w:ind w:left="113" w:right="113"/>
               <w:jc w:val="right"/>
             </w:pPr>
+            <w:proofErr w:type="spellStart"/>
             <w:r>
               <w:t>аыв</w:t>
             </w:r>
+            <w:proofErr w:type="spellEnd"/>
           </w:p>
         </w:tc>
       </w:tr>
@@ -2169,7 +2297,7 @@
         <v:path o:extrusionok="f" gradientshapeok="t" o:connecttype="rect"/>
         <o:lock v:ext="edit" aspectratio="t"/>
       </v:shapetype>
-      <v:shape id="_x0000_i1050" type="#_x0000_t75" style="width:483.9pt;height:438.55pt" o:bullet="t">
+      <v:shape id="_x0000_i1033" type="#_x0000_t75" style="width:483.75pt;height:438.75pt" o:bullet="t">
         <v:imagedata r:id="rId1" o:title="Red_Apple[1]"/>
       </v:shape>
     </w:pict>
@@ -3885,7 +4013,7 @@
     <w:name w:val="FirstRowOnlyOuter"/>
     <w:basedOn w:val="a1"/>
     <w:uiPriority w:val="99"/>
-    <w:rsid w:val="008E2AD2"/>
+    <w:rsid w:val="005738E7"/>
     <w:pPr>
       <w:spacing w:after="0" w:line="240" w:lineRule="auto"/>
     </w:pPr>
@@ -3897,6 +4025,10 @@
       <w:tblCellSpacing w:w="71" w:type="dxa"/>
     </w:trPr>
     <w:tblStylePr w:type="firstRow">
+      <w:pPr>
+        <w:wordWrap/>
+        <w:jc w:val="right"/>
+      </w:pPr>
       <w:rPr>
         <w:b/>
         <w:i/>
@@ -4378,7 +4510,7 @@
 </file>
 
 <file path=customXml/itemProps1.xml><?xml version="1.0" encoding="utf-8"?>
-<ds:datastoreItem xmlns:ds="http://schemas.openxmlformats.org/officeDocument/2006/customXml" ds:itemID="{D6E1285B-5D45-44AA-A9F3-C66F0E932316}">
+<ds:datastoreItem xmlns:ds="http://schemas.openxmlformats.org/officeDocument/2006/customXml" ds:itemID="{A965C757-F5C9-4034-9D5A-CDC484427150}">
   <ds:schemaRefs>
     <ds:schemaRef ds:uri="http://schemas.openxmlformats.org/officeDocument/2006/bibliography"/>
   </ds:schemaRefs>

</xml_diff>

<commit_message>
add cell margins fix some bugs
</commit_message>
<xml_diff>
--- a/tests/examples/List.docx
+++ b/tests/examples/List.docx
@@ -102,14 +102,12 @@
         <w:spacing w:after="480" w:line="257" w:lineRule="auto"/>
         <w:contextualSpacing/>
       </w:pPr>
-      <w:proofErr w:type="spellStart"/>
       <w:r>
         <w:rPr>
           <w:lang w:val="en-US"/>
         </w:rPr>
         <w:t>fd</w:t>
       </w:r>
-      <w:proofErr w:type="spellEnd"/>
     </w:p>
     <w:p>
       <w:pPr>
@@ -153,7 +151,6 @@
         </w:rPr>
         <w:br w:type="textWrapping" w:clear="all"/>
       </w:r>
-      <w:proofErr w:type="spellStart"/>
       <w:r>
         <w:rPr>
           <w:spacing w:val="40"/>
@@ -161,7 +158,6 @@
         </w:rPr>
         <w:t>ffff</w:t>
       </w:r>
-      <w:proofErr w:type="spellEnd"/>
     </w:p>
     <w:p>
       <w:pPr>
@@ -204,16 +200,8 @@
         <w:rPr>
           <w:lang w:val="en-US"/>
         </w:rPr>
-        <w:t xml:space="preserve">next </w:t>
+        <w:t>next ilvl</w:t>
       </w:r>
-      <w:proofErr w:type="spellStart"/>
-      <w:r>
-        <w:rPr>
-          <w:lang w:val="en-US"/>
-        </w:rPr>
-        <w:t>ilvl</w:t>
-      </w:r>
-      <w:proofErr w:type="spellEnd"/>
       <w:r>
         <w:rPr>
           <w:lang w:val="en-US"/>
@@ -297,16 +285,8 @@
         <w:rPr>
           <w:lang w:val="en-US"/>
         </w:rPr>
-        <w:t xml:space="preserve">next </w:t>
+        <w:t>next ilvl</w:t>
       </w:r>
-      <w:proofErr w:type="spellStart"/>
-      <w:r>
-        <w:rPr>
-          <w:lang w:val="en-US"/>
-        </w:rPr>
-        <w:t>ilvl</w:t>
-      </w:r>
-      <w:proofErr w:type="spellEnd"/>
     </w:p>
     <w:p>
       <w:pPr>
@@ -319,14 +299,12 @@
         <w:spacing w:line="257" w:lineRule="auto"/>
         <w:contextualSpacing/>
       </w:pPr>
-      <w:proofErr w:type="spellStart"/>
       <w:r>
         <w:rPr>
           <w:lang w:val="en-US"/>
         </w:rPr>
         <w:t>fdf</w:t>
       </w:r>
-      <w:proofErr w:type="spellEnd"/>
     </w:p>
     <w:p>
       <w:pPr>
@@ -339,14 +317,12 @@
         <w:spacing w:line="257" w:lineRule="auto"/>
         <w:contextualSpacing/>
       </w:pPr>
-      <w:proofErr w:type="spellStart"/>
       <w:r>
         <w:rPr>
           <w:lang w:val="en-US"/>
         </w:rPr>
         <w:t>fdf</w:t>
       </w:r>
-      <w:proofErr w:type="spellEnd"/>
     </w:p>
     <w:p>
       <w:pPr>
@@ -377,14 +353,12 @@
         <w:spacing w:line="257" w:lineRule="auto"/>
         <w:contextualSpacing/>
       </w:pPr>
-      <w:proofErr w:type="spellStart"/>
       <w:r>
         <w:rPr>
           <w:lang w:val="en-US"/>
         </w:rPr>
         <w:t>fd</w:t>
       </w:r>
-      <w:proofErr w:type="spellEnd"/>
     </w:p>
     <w:p>
       <w:pPr>
@@ -397,11 +371,9 @@
         <w:spacing w:line="257" w:lineRule="auto"/>
         <w:contextualSpacing/>
       </w:pPr>
-      <w:proofErr w:type="spellStart"/>
       <w:r>
         <w:t>ав</w:t>
       </w:r>
-      <w:proofErr w:type="spellEnd"/>
     </w:p>
     <w:p>
       <w:pPr>
@@ -426,14 +398,12 @@
         <w:spacing w:line="257" w:lineRule="auto"/>
         <w:contextualSpacing/>
       </w:pPr>
-      <w:proofErr w:type="spellStart"/>
       <w:r>
         <w:rPr>
           <w:lang w:val="en-US"/>
         </w:rPr>
         <w:t>fdfd</w:t>
       </w:r>
-      <w:proofErr w:type="spellEnd"/>
     </w:p>
     <w:p>
       <w:pPr>
@@ -560,14 +530,12 @@
         <w:jc w:val="right"/>
         <w:outlineLvl w:val="9"/>
       </w:pPr>
-      <w:proofErr w:type="spellStart"/>
       <w:r>
         <w:rPr>
           <w:lang w:val="en-US"/>
         </w:rPr>
         <w:t>HaHa</w:t>
       </w:r>
-      <w:proofErr w:type="spellEnd"/>
     </w:p>
     <w:p>
       <w:pPr>
@@ -611,11 +579,9 @@
                 <w:lang w:val="en-US"/>
               </w:rPr>
             </w:pPr>
-            <w:proofErr w:type="spellStart"/>
             <w:r>
               <w:t>ааа</w:t>
             </w:r>
-            <w:proofErr w:type="spellEnd"/>
           </w:p>
         </w:tc>
       </w:tr>
@@ -630,9 +596,9 @@
         <w:tblLook w:val="01E0" w:firstRow="1" w:lastRow="1" w:firstColumn="1" w:lastColumn="1" w:noHBand="0" w:noVBand="0"/>
       </w:tblPr>
       <w:tblGrid>
-        <w:gridCol w:w="3131"/>
-        <w:gridCol w:w="3099"/>
-        <w:gridCol w:w="3115"/>
+        <w:gridCol w:w="3557"/>
+        <w:gridCol w:w="2918"/>
+        <w:gridCol w:w="2870"/>
       </w:tblGrid>
       <w:tr>
         <w:trPr>
@@ -641,6 +607,12 @@
         <w:tc>
           <w:tcPr>
             <w:tcW w:w="3115" w:type="dxa"/>
+            <w:tcMar>
+              <w:top w:w="567" w:type="dxa"/>
+              <w:left w:w="1134" w:type="dxa"/>
+              <w:bottom w:w="1134" w:type="dxa"/>
+              <w:right w:w="1701" w:type="dxa"/>
+            </w:tcMar>
             <w:hideMark/>
           </w:tcPr>
           <w:p>
@@ -653,6 +625,7 @@
               <w:rPr>
                 <w:lang w:val="en-US"/>
               </w:rPr>
+              <w:lastRenderedPageBreak/>
               <w:t>1CA</w:t>
             </w:r>
             <w:r>
@@ -744,16 +717,12 @@
                 <w:lang w:val="en-US"/>
               </w:rPr>
             </w:pPr>
-            <w:bookmarkStart w:id="0" w:name="_GoBack"/>
-            <w:bookmarkEnd w:id="0"/>
-            <w:proofErr w:type="spellStart"/>
             <w:r>
               <w:rPr>
                 <w:lang w:val="en-US"/>
               </w:rPr>
               <w:t>fsd</w:t>
             </w:r>
-            <w:proofErr w:type="spellEnd"/>
           </w:p>
           <w:p>
             <w:pPr>
@@ -766,14 +735,12 @@
                 <w:lang w:val="en-US"/>
               </w:rPr>
             </w:pPr>
-            <w:proofErr w:type="spellStart"/>
             <w:r>
               <w:rPr>
                 <w:lang w:val="en-US"/>
               </w:rPr>
               <w:t>fd</w:t>
             </w:r>
-            <w:proofErr w:type="spellEnd"/>
           </w:p>
           <w:p>
             <w:pPr>
@@ -786,14 +753,12 @@
                 <w:lang w:val="en-US"/>
               </w:rPr>
             </w:pPr>
-            <w:proofErr w:type="spellStart"/>
             <w:r>
               <w:rPr>
                 <w:lang w:val="en-US"/>
               </w:rPr>
               <w:t>fd</w:t>
             </w:r>
-            <w:proofErr w:type="spellEnd"/>
           </w:p>
         </w:tc>
         <w:tc>
@@ -888,16 +853,22 @@
     <w:tbl>
       <w:tblPr>
         <w:tblStyle w:val="Scary"/>
-        <w:tblW w:w="0" w:type="auto"/>
+        <w:tblW w:w="15046" w:type="dxa"/>
+        <w:tblLayout w:type="fixed"/>
         <w:tblLook w:val="01E0" w:firstRow="1" w:lastRow="1" w:firstColumn="1" w:lastColumn="1" w:noHBand="0" w:noVBand="0"/>
       </w:tblPr>
       <w:tblGrid>
-        <w:gridCol w:w="1681"/>
-        <w:gridCol w:w="1216"/>
-        <w:gridCol w:w="1616"/>
-        <w:gridCol w:w="1614"/>
-        <w:gridCol w:w="1614"/>
-        <w:gridCol w:w="1614"/>
+        <w:gridCol w:w="3606"/>
+        <w:gridCol w:w="850"/>
+        <w:gridCol w:w="1438"/>
+        <w:gridCol w:w="839"/>
+        <w:gridCol w:w="1449"/>
+        <w:gridCol w:w="839"/>
+        <w:gridCol w:w="1449"/>
+        <w:gridCol w:w="839"/>
+        <w:gridCol w:w="1449"/>
+        <w:gridCol w:w="839"/>
+        <w:gridCol w:w="1449"/>
       </w:tblGrid>
       <w:tr>
         <w:trPr>
@@ -906,7 +877,7 @@
         <w:tc>
           <w:tcPr>
             <w:cnfStyle w:val="001000000100" w:firstRow="0" w:lastRow="0" w:firstColumn="1" w:lastColumn="0" w:oddVBand="0" w:evenVBand="0" w:oddHBand="0" w:evenHBand="0" w:firstRowFirstColumn="1" w:firstRowLastColumn="0" w:lastRowFirstColumn="0" w:lastRowLastColumn="0"/>
-            <w:tcW w:w="1524" w:type="dxa"/>
+            <w:tcW w:w="3686" w:type="dxa"/>
           </w:tcPr>
           <w:p>
             <w:pPr>
@@ -915,6 +886,8 @@
                 <w:lang w:val="en-US"/>
               </w:rPr>
             </w:pPr>
+            <w:bookmarkStart w:id="0" w:name="_GoBack"/>
+            <w:bookmarkEnd w:id="0"/>
             <w:r>
               <w:rPr>
                 <w:lang w:val="en-US"/>
@@ -926,7 +899,8 @@
         <w:tc>
           <w:tcPr>
             <w:cnfStyle w:val="000010000000" w:firstRow="0" w:lastRow="0" w:firstColumn="0" w:lastColumn="0" w:oddVBand="1" w:evenVBand="0" w:oddHBand="0" w:evenHBand="0" w:firstRowFirstColumn="0" w:firstRowLastColumn="0" w:lastRowFirstColumn="0" w:lastRowLastColumn="0"/>
-            <w:tcW w:w="1524" w:type="dxa"/>
+            <w:tcW w:w="2288" w:type="dxa"/>
+            <w:gridSpan w:val="2"/>
             <w:tcBorders>
               <w:top w:val="single" w:sz="4" w:space="0" w:color="auto"/>
             </w:tcBorders>
@@ -937,11 +911,9 @@
                 <w:lang w:val="en-US"/>
               </w:rPr>
             </w:pPr>
-            <w:proofErr w:type="spellStart"/>
             <w:r>
               <w:t>dstrike</w:t>
             </w:r>
-            <w:proofErr w:type="spellEnd"/>
             <w:r>
               <w:rPr>
                 <w:lang w:val="en-US"/>
@@ -953,15 +925,15 @@
         <w:tc>
           <w:tcPr>
             <w:cnfStyle w:val="000001000000" w:firstRow="0" w:lastRow="0" w:firstColumn="0" w:lastColumn="0" w:oddVBand="0" w:evenVBand="1" w:oddHBand="0" w:evenHBand="0" w:firstRowFirstColumn="0" w:firstRowLastColumn="0" w:lastRowFirstColumn="0" w:lastRowLastColumn="0"/>
-            <w:tcW w:w="1619" w:type="dxa"/>
-          </w:tcPr>
-          <w:p>
-            <w:pPr>
-              <w:rPr>
-                <w:lang w:val="en-US"/>
-              </w:rPr>
-            </w:pPr>
-            <w:proofErr w:type="spellStart"/>
+            <w:tcW w:w="2268" w:type="dxa"/>
+            <w:gridSpan w:val="2"/>
+          </w:tcPr>
+          <w:p>
+            <w:pPr>
+              <w:rPr>
+                <w:lang w:val="en-US"/>
+              </w:rPr>
+            </w:pPr>
             <w:r>
               <w:rPr>
                 <w:lang w:val="en-US"/>
@@ -974,21 +946,20 @@
               </w:rPr>
               <w:t>_dstrike</w:t>
             </w:r>
-            <w:proofErr w:type="spellEnd"/>
           </w:p>
         </w:tc>
         <w:tc>
           <w:tcPr>
             <w:cnfStyle w:val="000010000000" w:firstRow="0" w:lastRow="0" w:firstColumn="0" w:lastColumn="0" w:oddVBand="1" w:evenVBand="0" w:oddHBand="0" w:evenHBand="0" w:firstRowFirstColumn="0" w:firstRowLastColumn="0" w:lastRowFirstColumn="0" w:lastRowLastColumn="0"/>
-            <w:tcW w:w="1600" w:type="dxa"/>
-          </w:tcPr>
-          <w:p>
-            <w:pPr>
-              <w:rPr>
-                <w:lang w:val="en-US"/>
-              </w:rPr>
-            </w:pPr>
-            <w:proofErr w:type="spellStart"/>
+            <w:tcW w:w="2268" w:type="dxa"/>
+            <w:gridSpan w:val="2"/>
+          </w:tcPr>
+          <w:p>
+            <w:pPr>
+              <w:rPr>
+                <w:lang w:val="en-US"/>
+              </w:rPr>
+            </w:pPr>
             <w:r>
               <w:rPr>
                 <w:lang w:val="en-US"/>
@@ -1001,21 +972,20 @@
               </w:rPr>
               <w:t>_up</w:t>
             </w:r>
-            <w:proofErr w:type="spellEnd"/>
           </w:p>
         </w:tc>
         <w:tc>
           <w:tcPr>
             <w:cnfStyle w:val="000001000000" w:firstRow="0" w:lastRow="0" w:firstColumn="0" w:lastColumn="0" w:oddVBand="0" w:evenVBand="1" w:oddHBand="0" w:evenHBand="0" w:firstRowFirstColumn="0" w:firstRowLastColumn="0" w:lastRowFirstColumn="0" w:lastRowLastColumn="0"/>
-            <w:tcW w:w="1588" w:type="dxa"/>
-          </w:tcPr>
-          <w:p>
-            <w:pPr>
-              <w:rPr>
-                <w:lang w:val="en-US"/>
-              </w:rPr>
-            </w:pPr>
-            <w:proofErr w:type="spellStart"/>
+            <w:tcW w:w="2268" w:type="dxa"/>
+            <w:gridSpan w:val="2"/>
+          </w:tcPr>
+          <w:p>
+            <w:pPr>
+              <w:rPr>
+                <w:lang w:val="en-US"/>
+              </w:rPr>
+            </w:pPr>
             <w:r>
               <w:rPr>
                 <w:lang w:val="en-US"/>
@@ -1028,21 +998,20 @@
               </w:rPr>
               <w:t>_dstrike</w:t>
             </w:r>
-            <w:proofErr w:type="spellEnd"/>
           </w:p>
         </w:tc>
         <w:tc>
           <w:tcPr>
             <w:cnfStyle w:val="000010000000" w:firstRow="0" w:lastRow="0" w:firstColumn="0" w:lastColumn="0" w:oddVBand="1" w:evenVBand="0" w:oddHBand="0" w:evenHBand="0" w:firstRowFirstColumn="0" w:firstRowLastColumn="0" w:lastRowFirstColumn="0" w:lastRowLastColumn="0"/>
-            <w:tcW w:w="1500" w:type="dxa"/>
-          </w:tcPr>
-          <w:p>
-            <w:pPr>
-              <w:rPr>
-                <w:lang w:val="en-US"/>
-              </w:rPr>
-            </w:pPr>
-            <w:proofErr w:type="spellStart"/>
+            <w:tcW w:w="2268" w:type="dxa"/>
+            <w:gridSpan w:val="2"/>
+          </w:tcPr>
+          <w:p>
+            <w:pPr>
+              <w:rPr>
+                <w:lang w:val="en-US"/>
+              </w:rPr>
+            </w:pPr>
             <w:r>
               <w:rPr>
                 <w:lang w:val="en-US"/>
@@ -1055,18 +1024,19 @@
               </w:rPr>
               <w:t>_up</w:t>
             </w:r>
-            <w:proofErr w:type="spellEnd"/>
           </w:p>
         </w:tc>
       </w:tr>
       <w:tr>
         <w:trPr>
+          <w:gridAfter w:val="1"/>
           <w:cnfStyle w:val="000000100000" w:firstRow="0" w:lastRow="0" w:firstColumn="0" w:lastColumn="0" w:oddVBand="0" w:evenVBand="0" w:oddHBand="1" w:evenHBand="0" w:firstRowFirstColumn="0" w:firstRowLastColumn="0" w:lastRowFirstColumn="0" w:lastRowLastColumn="0"/>
+          <w:wAfter w:w="1438" w:type="dxa"/>
         </w:trPr>
         <w:tc>
           <w:tcPr>
             <w:cnfStyle w:val="001000000000" w:firstRow="0" w:lastRow="0" w:firstColumn="1" w:lastColumn="0" w:oddVBand="0" w:evenVBand="0" w:oddHBand="0" w:evenHBand="0" w:firstRowFirstColumn="0" w:firstRowLastColumn="0" w:lastRowFirstColumn="0" w:lastRowLastColumn="0"/>
-            <w:tcW w:w="1524" w:type="dxa"/>
+            <w:tcW w:w="3686" w:type="dxa"/>
           </w:tcPr>
           <w:p>
             <w:pPr>
@@ -1080,31 +1050,76 @@
               </w:rPr>
               <w:t>strike_</w:t>
             </w:r>
-            <w:proofErr w:type="spellStart"/>
             <w:r>
               <w:t>underline</w:t>
             </w:r>
-            <w:proofErr w:type="spellEnd"/>
           </w:p>
         </w:tc>
         <w:tc>
           <w:tcPr>
             <w:cnfStyle w:val="000010000000" w:firstRow="0" w:lastRow="0" w:firstColumn="0" w:lastColumn="0" w:oddVBand="1" w:evenVBand="0" w:oddHBand="0" w:evenHBand="0" w:firstRowFirstColumn="0" w:firstRowLastColumn="0" w:lastRowFirstColumn="0" w:lastRowLastColumn="0"/>
-            <w:tcW w:w="3143" w:type="dxa"/>
+            <w:tcW w:w="3118" w:type="dxa"/>
+            <w:gridSpan w:val="3"/>
+            <w:vMerge w:val="restart"/>
+          </w:tcPr>
+          <w:p>
+            <w:pPr>
+              <w:rPr>
+                <w:lang w:val="en-US"/>
+              </w:rPr>
+            </w:pPr>
+            <w:r>
+              <w:t>underline</w:t>
+            </w:r>
+            <w:r>
+              <w:rPr>
+                <w:lang w:val="en-US"/>
+              </w:rPr>
+              <w:t>_up</w:t>
+            </w:r>
+          </w:p>
+        </w:tc>
+        <w:tc>
+          <w:tcPr>
+            <w:cnfStyle w:val="000001000000" w:firstRow="0" w:lastRow="0" w:firstColumn="0" w:lastColumn="0" w:oddVBand="0" w:evenVBand="1" w:oddHBand="0" w:evenHBand="0" w:firstRowFirstColumn="0" w:firstRowLastColumn="0" w:lastRowFirstColumn="0" w:lastRowLastColumn="0"/>
+            <w:tcW w:w="2268" w:type="dxa"/>
             <w:gridSpan w:val="2"/>
-            <w:vMerge w:val="restart"/>
-          </w:tcPr>
-          <w:p>
-            <w:pPr>
-              <w:rPr>
-                <w:lang w:val="en-US"/>
-              </w:rPr>
-            </w:pPr>
-            <w:proofErr w:type="spellStart"/>
+          </w:tcPr>
+          <w:p>
+            <w:pPr>
+              <w:rPr>
+                <w:lang w:val="en-US"/>
+              </w:rPr>
+            </w:pPr>
+            <w:r>
+              <w:rPr>
+                <w:lang w:val="en-US"/>
+              </w:rPr>
+              <w:t>bold</w:t>
+            </w:r>
+            <w:r>
+              <w:rPr>
+                <w:lang w:val="en-US"/>
+              </w:rPr>
+              <w:t>_underline</w:t>
+            </w:r>
+          </w:p>
+        </w:tc>
+        <w:tc>
+          <w:tcPr>
+            <w:cnfStyle w:val="000010000000" w:firstRow="0" w:lastRow="0" w:firstColumn="0" w:lastColumn="0" w:oddVBand="1" w:evenVBand="0" w:oddHBand="0" w:evenHBand="0" w:firstRowFirstColumn="0" w:firstRowLastColumn="0" w:lastRowFirstColumn="0" w:lastRowLastColumn="0"/>
+            <w:tcW w:w="2268" w:type="dxa"/>
+            <w:gridSpan w:val="2"/>
+          </w:tcPr>
+          <w:p>
+            <w:pPr>
+              <w:rPr>
+                <w:lang w:val="en-US"/>
+              </w:rPr>
+            </w:pPr>
             <w:r>
               <w:t>underline</w:t>
             </w:r>
-            <w:proofErr w:type="spellEnd"/>
             <w:r>
               <w:rPr>
                 <w:lang w:val="en-US"/>
@@ -1116,15 +1131,15 @@
         <w:tc>
           <w:tcPr>
             <w:cnfStyle w:val="000001000000" w:firstRow="0" w:lastRow="0" w:firstColumn="0" w:lastColumn="0" w:oddVBand="0" w:evenVBand="1" w:oddHBand="0" w:evenHBand="0" w:firstRowFirstColumn="0" w:firstRowLastColumn="0" w:lastRowFirstColumn="0" w:lastRowLastColumn="0"/>
-            <w:tcW w:w="1600" w:type="dxa"/>
-          </w:tcPr>
-          <w:p>
-            <w:pPr>
-              <w:rPr>
-                <w:lang w:val="en-US"/>
-              </w:rPr>
-            </w:pPr>
-            <w:proofErr w:type="spellStart"/>
+            <w:tcW w:w="2268" w:type="dxa"/>
+            <w:gridSpan w:val="2"/>
+          </w:tcPr>
+          <w:p>
+            <w:pPr>
+              <w:rPr>
+                <w:lang w:val="en-US"/>
+              </w:rPr>
+            </w:pPr>
             <w:r>
               <w:rPr>
                 <w:lang w:val="en-US"/>
@@ -1137,77 +1152,26 @@
               </w:rPr>
               <w:t>_underline</w:t>
             </w:r>
-            <w:proofErr w:type="spellEnd"/>
-          </w:p>
-        </w:tc>
-        <w:tc>
-          <w:tcPr>
-            <w:cnfStyle w:val="000010000000" w:firstRow="0" w:lastRow="0" w:firstColumn="0" w:lastColumn="0" w:oddVBand="1" w:evenVBand="0" w:oddHBand="0" w:evenHBand="0" w:firstRowFirstColumn="0" w:firstRowLastColumn="0" w:lastRowFirstColumn="0" w:lastRowLastColumn="0"/>
-            <w:tcW w:w="1588" w:type="dxa"/>
-          </w:tcPr>
-          <w:p>
-            <w:pPr>
-              <w:rPr>
-                <w:lang w:val="en-US"/>
-              </w:rPr>
-            </w:pPr>
-            <w:proofErr w:type="spellStart"/>
-            <w:r>
-              <w:t>underline</w:t>
-            </w:r>
-            <w:proofErr w:type="spellEnd"/>
-            <w:r>
-              <w:rPr>
-                <w:lang w:val="en-US"/>
-              </w:rPr>
-              <w:t>_up</w:t>
-            </w:r>
-          </w:p>
-        </w:tc>
-        <w:tc>
-          <w:tcPr>
-            <w:cnfStyle w:val="000001000000" w:firstRow="0" w:lastRow="0" w:firstColumn="0" w:lastColumn="0" w:oddVBand="0" w:evenVBand="1" w:oddHBand="0" w:evenHBand="0" w:firstRowFirstColumn="0" w:firstRowLastColumn="0" w:lastRowFirstColumn="0" w:lastRowLastColumn="0"/>
-            <w:tcW w:w="1500" w:type="dxa"/>
-          </w:tcPr>
-          <w:p>
-            <w:pPr>
-              <w:rPr>
-                <w:lang w:val="en-US"/>
-              </w:rPr>
-            </w:pPr>
-            <w:proofErr w:type="spellStart"/>
-            <w:r>
-              <w:rPr>
-                <w:lang w:val="en-US"/>
-              </w:rPr>
-              <w:t>bold</w:t>
-            </w:r>
-            <w:r>
-              <w:rPr>
-                <w:lang w:val="en-US"/>
-              </w:rPr>
-              <w:t>_underline</w:t>
-            </w:r>
-            <w:proofErr w:type="spellEnd"/>
           </w:p>
         </w:tc>
       </w:tr>
       <w:tr>
         <w:trPr>
+          <w:gridAfter w:val="1"/>
           <w:cnfStyle w:val="000000010000" w:firstRow="0" w:lastRow="0" w:firstColumn="0" w:lastColumn="0" w:oddVBand="0" w:evenVBand="0" w:oddHBand="0" w:evenHBand="1" w:firstRowFirstColumn="0" w:firstRowLastColumn="0" w:lastRowFirstColumn="0" w:lastRowLastColumn="0"/>
+          <w:wAfter w:w="1438" w:type="dxa"/>
         </w:trPr>
         <w:tc>
           <w:tcPr>
             <w:cnfStyle w:val="001000000000" w:firstRow="0" w:lastRow="0" w:firstColumn="1" w:lastColumn="0" w:oddVBand="0" w:evenVBand="0" w:oddHBand="0" w:evenHBand="0" w:firstRowFirstColumn="0" w:firstRowLastColumn="0" w:lastRowFirstColumn="0" w:lastRowLastColumn="0"/>
-            <w:tcW w:w="1524" w:type="dxa"/>
-          </w:tcPr>
-          <w:p>
-            <w:pPr>
-              <w:rPr>
-                <w:lang w:val="en-US"/>
-              </w:rPr>
-            </w:pPr>
-            <w:proofErr w:type="spellStart"/>
+            <w:tcW w:w="3686" w:type="dxa"/>
+          </w:tcPr>
+          <w:p>
+            <w:pPr>
+              <w:rPr>
+                <w:lang w:val="en-US"/>
+              </w:rPr>
+            </w:pPr>
             <w:r>
               <w:rPr>
                 <w:lang w:val="en-US"/>
@@ -1220,68 +1184,68 @@
               </w:rPr>
               <w:t>italic</w:t>
             </w:r>
-            <w:proofErr w:type="spellEnd"/>
           </w:p>
         </w:tc>
         <w:tc>
           <w:tcPr>
             <w:cnfStyle w:val="000010000000" w:firstRow="0" w:lastRow="0" w:firstColumn="0" w:lastColumn="0" w:oddVBand="1" w:evenVBand="0" w:oddHBand="0" w:evenHBand="0" w:firstRowFirstColumn="0" w:firstRowLastColumn="0" w:lastRowFirstColumn="0" w:lastRowLastColumn="0"/>
-            <w:tcW w:w="3143" w:type="dxa"/>
+            <w:tcW w:w="3118" w:type="dxa"/>
+            <w:gridSpan w:val="3"/>
+            <w:vMerge/>
+          </w:tcPr>
+          <w:p/>
+        </w:tc>
+        <w:tc>
+          <w:tcPr>
+            <w:cnfStyle w:val="000001000000" w:firstRow="0" w:lastRow="0" w:firstColumn="0" w:lastColumn="0" w:oddVBand="0" w:evenVBand="1" w:oddHBand="0" w:evenHBand="0" w:firstRowFirstColumn="0" w:firstRowLastColumn="0" w:lastRowFirstColumn="0" w:lastRowLastColumn="0"/>
+            <w:tcW w:w="2268" w:type="dxa"/>
             <w:gridSpan w:val="2"/>
-            <w:vMerge/>
-          </w:tcPr>
-          <w:p/>
+          </w:tcPr>
+          <w:p>
+            <w:pPr>
+              <w:rPr>
+                <w:lang w:val="en-US"/>
+              </w:rPr>
+            </w:pPr>
+            <w:r>
+              <w:rPr>
+                <w:lang w:val="en-US"/>
+              </w:rPr>
+              <w:t>bold</w:t>
+            </w:r>
+            <w:r>
+              <w:rPr>
+                <w:lang w:val="en-US"/>
+              </w:rPr>
+              <w:t>_italic</w:t>
+            </w:r>
+          </w:p>
+        </w:tc>
+        <w:tc>
+          <w:tcPr>
+            <w:cnfStyle w:val="000010000000" w:firstRow="0" w:lastRow="0" w:firstColumn="0" w:lastColumn="0" w:oddVBand="1" w:evenVBand="0" w:oddHBand="0" w:evenHBand="0" w:firstRowFirstColumn="0" w:firstRowLastColumn="0" w:lastRowFirstColumn="0" w:lastRowLastColumn="0"/>
+            <w:tcW w:w="2268" w:type="dxa"/>
+            <w:gridSpan w:val="2"/>
+          </w:tcPr>
+          <w:p>
+            <w:pPr>
+              <w:rPr>
+                <w:lang w:val="en-US"/>
+              </w:rPr>
+            </w:pPr>
+            <w:r>
+              <w:rPr>
+                <w:lang w:val="en-US"/>
+              </w:rPr>
+              <w:t>up</w:t>
+            </w:r>
+          </w:p>
         </w:tc>
         <w:tc>
           <w:tcPr>
             <w:cnfStyle w:val="000001000000" w:firstRow="0" w:lastRow="0" w:firstColumn="0" w:lastColumn="0" w:oddVBand="0" w:evenVBand="1" w:oddHBand="0" w:evenHBand="0" w:firstRowFirstColumn="0" w:firstRowLastColumn="0" w:lastRowFirstColumn="0" w:lastRowLastColumn="0"/>
-            <w:tcW w:w="1600" w:type="dxa"/>
-          </w:tcPr>
-          <w:p>
-            <w:pPr>
-              <w:rPr>
-                <w:lang w:val="en-US"/>
-              </w:rPr>
-            </w:pPr>
-            <w:proofErr w:type="spellStart"/>
-            <w:r>
-              <w:rPr>
-                <w:lang w:val="en-US"/>
-              </w:rPr>
-              <w:t>bold</w:t>
-            </w:r>
-            <w:r>
-              <w:rPr>
-                <w:lang w:val="en-US"/>
-              </w:rPr>
-              <w:t>_italic</w:t>
-            </w:r>
-            <w:proofErr w:type="spellEnd"/>
-          </w:p>
-        </w:tc>
-        <w:tc>
-          <w:tcPr>
-            <w:cnfStyle w:val="000010000000" w:firstRow="0" w:lastRow="0" w:firstColumn="0" w:lastColumn="0" w:oddVBand="1" w:evenVBand="0" w:oddHBand="0" w:evenHBand="0" w:firstRowFirstColumn="0" w:firstRowLastColumn="0" w:lastRowFirstColumn="0" w:lastRowLastColumn="0"/>
-            <w:tcW w:w="1588" w:type="dxa"/>
-          </w:tcPr>
-          <w:p>
-            <w:pPr>
-              <w:rPr>
-                <w:lang w:val="en-US"/>
-              </w:rPr>
-            </w:pPr>
-            <w:r>
-              <w:rPr>
-                <w:lang w:val="en-US"/>
-              </w:rPr>
-              <w:t>up</w:t>
-            </w:r>
-          </w:p>
-        </w:tc>
-        <w:tc>
-          <w:tcPr>
-            <w:cnfStyle w:val="000001000000" w:firstRow="0" w:lastRow="0" w:firstColumn="0" w:lastColumn="0" w:oddVBand="0" w:evenVBand="1" w:oddHBand="0" w:evenHBand="0" w:firstRowFirstColumn="0" w:firstRowLastColumn="0" w:lastRowFirstColumn="0" w:lastRowLastColumn="0"/>
-            <w:tcW w:w="1500" w:type="dxa"/>
+            <w:tcW w:w="2268" w:type="dxa"/>
+            <w:gridSpan w:val="2"/>
           </w:tcPr>
           <w:p>
             <w:pPr>
@@ -1300,12 +1264,14 @@
       </w:tr>
       <w:tr>
         <w:trPr>
+          <w:gridAfter w:val="1"/>
           <w:cnfStyle w:val="000000100000" w:firstRow="0" w:lastRow="0" w:firstColumn="0" w:lastColumn="0" w:oddVBand="0" w:evenVBand="0" w:oddHBand="1" w:evenHBand="0" w:firstRowFirstColumn="0" w:firstRowLastColumn="0" w:lastRowFirstColumn="0" w:lastRowLastColumn="0"/>
+          <w:wAfter w:w="1438" w:type="dxa"/>
         </w:trPr>
         <w:tc>
           <w:tcPr>
             <w:cnfStyle w:val="001000000000" w:firstRow="0" w:lastRow="0" w:firstColumn="1" w:lastColumn="0" w:oddVBand="0" w:evenVBand="0" w:oddHBand="0" w:evenHBand="0" w:firstRowFirstColumn="0" w:firstRowLastColumn="0" w:lastRowFirstColumn="0" w:lastRowLastColumn="0"/>
-            <w:tcW w:w="1524" w:type="dxa"/>
+            <w:tcW w:w="3686" w:type="dxa"/>
           </w:tcPr>
           <w:p>
             <w:pPr>
@@ -1319,29 +1285,25 @@
               </w:rPr>
               <w:t>strike_</w:t>
             </w:r>
-            <w:proofErr w:type="spellStart"/>
             <w:r>
               <w:t>underline</w:t>
             </w:r>
-            <w:proofErr w:type="spellEnd"/>
           </w:p>
         </w:tc>
         <w:tc>
           <w:tcPr>
             <w:cnfStyle w:val="000010000000" w:firstRow="0" w:lastRow="0" w:firstColumn="0" w:lastColumn="0" w:oddVBand="1" w:evenVBand="0" w:oddHBand="0" w:evenHBand="0" w:firstRowFirstColumn="0" w:firstRowLastColumn="0" w:lastRowFirstColumn="0" w:lastRowLastColumn="0"/>
-            <w:tcW w:w="1524" w:type="dxa"/>
-          </w:tcPr>
-          <w:p>
-            <w:pPr>
-              <w:rPr>
-                <w:lang w:val="en-US"/>
-              </w:rPr>
-            </w:pPr>
-            <w:proofErr w:type="spellStart"/>
+            <w:tcW w:w="850" w:type="dxa"/>
+          </w:tcPr>
+          <w:p>
+            <w:pPr>
+              <w:rPr>
+                <w:lang w:val="en-US"/>
+              </w:rPr>
+            </w:pPr>
             <w:r>
               <w:t>underline</w:t>
             </w:r>
-            <w:proofErr w:type="spellEnd"/>
             <w:r>
               <w:rPr>
                 <w:lang w:val="en-US"/>
@@ -1353,19 +1315,18 @@
         <w:tc>
           <w:tcPr>
             <w:cnfStyle w:val="000001000000" w:firstRow="0" w:lastRow="0" w:firstColumn="0" w:lastColumn="0" w:oddVBand="0" w:evenVBand="1" w:oddHBand="0" w:evenHBand="0" w:firstRowFirstColumn="0" w:firstRowLastColumn="0" w:lastRowFirstColumn="0" w:lastRowLastColumn="0"/>
-            <w:tcW w:w="1619" w:type="dxa"/>
-          </w:tcPr>
-          <w:p>
-            <w:pPr>
-              <w:rPr>
-                <w:lang w:val="en-US"/>
-              </w:rPr>
-            </w:pPr>
-            <w:proofErr w:type="spellStart"/>
+            <w:tcW w:w="2268" w:type="dxa"/>
+            <w:gridSpan w:val="2"/>
+          </w:tcPr>
+          <w:p>
+            <w:pPr>
+              <w:rPr>
+                <w:lang w:val="en-US"/>
+              </w:rPr>
+            </w:pPr>
             <w:r>
               <w:t>bold</w:t>
             </w:r>
-            <w:proofErr w:type="spellEnd"/>
             <w:r>
               <w:rPr>
                 <w:lang w:val="en-US"/>
@@ -1377,19 +1338,18 @@
         <w:tc>
           <w:tcPr>
             <w:cnfStyle w:val="000010000000" w:firstRow="0" w:lastRow="0" w:firstColumn="0" w:lastColumn="0" w:oddVBand="1" w:evenVBand="0" w:oddHBand="0" w:evenHBand="0" w:firstRowFirstColumn="0" w:firstRowLastColumn="0" w:lastRowFirstColumn="0" w:lastRowLastColumn="0"/>
-            <w:tcW w:w="1600" w:type="dxa"/>
-          </w:tcPr>
-          <w:p>
-            <w:pPr>
-              <w:rPr>
-                <w:lang w:val="en-US"/>
-              </w:rPr>
-            </w:pPr>
-            <w:proofErr w:type="spellStart"/>
+            <w:tcW w:w="2268" w:type="dxa"/>
+            <w:gridSpan w:val="2"/>
+          </w:tcPr>
+          <w:p>
+            <w:pPr>
+              <w:rPr>
+                <w:lang w:val="en-US"/>
+              </w:rPr>
+            </w:pPr>
             <w:r>
               <w:t>underline</w:t>
             </w:r>
-            <w:proofErr w:type="spellEnd"/>
             <w:r>
               <w:rPr>
                 <w:lang w:val="en-US"/>
@@ -1401,15 +1361,15 @@
         <w:tc>
           <w:tcPr>
             <w:cnfStyle w:val="000001000000" w:firstRow="0" w:lastRow="0" w:firstColumn="0" w:lastColumn="0" w:oddVBand="0" w:evenVBand="1" w:oddHBand="0" w:evenHBand="0" w:firstRowFirstColumn="0" w:firstRowLastColumn="0" w:lastRowFirstColumn="0" w:lastRowLastColumn="0"/>
-            <w:tcW w:w="1588" w:type="dxa"/>
-          </w:tcPr>
-          <w:p>
-            <w:pPr>
-              <w:rPr>
-                <w:lang w:val="en-US"/>
-              </w:rPr>
-            </w:pPr>
-            <w:proofErr w:type="spellStart"/>
+            <w:tcW w:w="2268" w:type="dxa"/>
+            <w:gridSpan w:val="2"/>
+          </w:tcPr>
+          <w:p>
+            <w:pPr>
+              <w:rPr>
+                <w:lang w:val="en-US"/>
+              </w:rPr>
+            </w:pPr>
             <w:r>
               <w:rPr>
                 <w:lang w:val="en-US"/>
@@ -1422,25 +1382,23 @@
               </w:rPr>
               <w:t>_underline</w:t>
             </w:r>
-            <w:proofErr w:type="spellEnd"/>
           </w:p>
         </w:tc>
         <w:tc>
           <w:tcPr>
             <w:cnfStyle w:val="000010000000" w:firstRow="0" w:lastRow="0" w:firstColumn="0" w:lastColumn="0" w:oddVBand="1" w:evenVBand="0" w:oddHBand="0" w:evenHBand="0" w:firstRowFirstColumn="0" w:firstRowLastColumn="0" w:lastRowFirstColumn="0" w:lastRowLastColumn="0"/>
-            <w:tcW w:w="1500" w:type="dxa"/>
-          </w:tcPr>
-          <w:p>
-            <w:pPr>
-              <w:rPr>
-                <w:lang w:val="en-US"/>
-              </w:rPr>
-            </w:pPr>
-            <w:proofErr w:type="spellStart"/>
+            <w:tcW w:w="2268" w:type="dxa"/>
+            <w:gridSpan w:val="2"/>
+          </w:tcPr>
+          <w:p>
+            <w:pPr>
+              <w:rPr>
+                <w:lang w:val="en-US"/>
+              </w:rPr>
+            </w:pPr>
             <w:r>
               <w:t>underline</w:t>
             </w:r>
-            <w:proofErr w:type="spellEnd"/>
             <w:r>
               <w:rPr>
                 <w:lang w:val="en-US"/>
@@ -1452,20 +1410,21 @@
       </w:tr>
       <w:tr>
         <w:trPr>
+          <w:gridAfter w:val="1"/>
           <w:cnfStyle w:val="000000010000" w:firstRow="0" w:lastRow="0" w:firstColumn="0" w:lastColumn="0" w:oddVBand="0" w:evenVBand="0" w:oddHBand="0" w:evenHBand="1" w:firstRowFirstColumn="0" w:firstRowLastColumn="0" w:lastRowFirstColumn="0" w:lastRowLastColumn="0"/>
+          <w:wAfter w:w="1438" w:type="dxa"/>
         </w:trPr>
         <w:tc>
           <w:tcPr>
             <w:cnfStyle w:val="001000000000" w:firstRow="0" w:lastRow="0" w:firstColumn="1" w:lastColumn="0" w:oddVBand="0" w:evenVBand="0" w:oddHBand="0" w:evenHBand="0" w:firstRowFirstColumn="0" w:firstRowLastColumn="0" w:lastRowFirstColumn="0" w:lastRowLastColumn="0"/>
-            <w:tcW w:w="1524" w:type="dxa"/>
-          </w:tcPr>
-          <w:p>
-            <w:pPr>
-              <w:rPr>
-                <w:lang w:val="en-US"/>
-              </w:rPr>
-            </w:pPr>
-            <w:proofErr w:type="spellStart"/>
+            <w:tcW w:w="3686" w:type="dxa"/>
+          </w:tcPr>
+          <w:p>
+            <w:pPr>
+              <w:rPr>
+                <w:lang w:val="en-US"/>
+              </w:rPr>
+            </w:pPr>
             <w:r>
               <w:rPr>
                 <w:lang w:val="en-US"/>
@@ -1478,21 +1437,19 @@
               </w:rPr>
               <w:t>italic</w:t>
             </w:r>
-            <w:proofErr w:type="spellEnd"/>
           </w:p>
         </w:tc>
         <w:tc>
           <w:tcPr>
             <w:cnfStyle w:val="000010000000" w:firstRow="0" w:lastRow="0" w:firstColumn="0" w:lastColumn="0" w:oddVBand="1" w:evenVBand="0" w:oddHBand="0" w:evenHBand="0" w:firstRowFirstColumn="0" w:firstRowLastColumn="0" w:lastRowFirstColumn="0" w:lastRowLastColumn="0"/>
-            <w:tcW w:w="1524" w:type="dxa"/>
-          </w:tcPr>
-          <w:p>
-            <w:pPr>
-              <w:rPr>
-                <w:lang w:val="en-US"/>
-              </w:rPr>
-            </w:pPr>
-            <w:proofErr w:type="spellStart"/>
+            <w:tcW w:w="850" w:type="dxa"/>
+          </w:tcPr>
+          <w:p>
+            <w:pPr>
+              <w:rPr>
+                <w:lang w:val="en-US"/>
+              </w:rPr>
+            </w:pPr>
             <w:r>
               <w:rPr>
                 <w:lang w:val="en-US"/>
@@ -1505,21 +1462,20 @@
               </w:rPr>
               <w:t>_up</w:t>
             </w:r>
-            <w:proofErr w:type="spellEnd"/>
           </w:p>
         </w:tc>
         <w:tc>
           <w:tcPr>
             <w:cnfStyle w:val="000001000000" w:firstRow="0" w:lastRow="0" w:firstColumn="0" w:lastColumn="0" w:oddVBand="0" w:evenVBand="1" w:oddHBand="0" w:evenHBand="0" w:firstRowFirstColumn="0" w:firstRowLastColumn="0" w:lastRowFirstColumn="0" w:lastRowLastColumn="0"/>
-            <w:tcW w:w="1619" w:type="dxa"/>
-          </w:tcPr>
-          <w:p>
-            <w:pPr>
-              <w:rPr>
-                <w:lang w:val="en-US"/>
-              </w:rPr>
-            </w:pPr>
-            <w:proofErr w:type="spellStart"/>
+            <w:tcW w:w="2268" w:type="dxa"/>
+            <w:gridSpan w:val="2"/>
+          </w:tcPr>
+          <w:p>
+            <w:pPr>
+              <w:rPr>
+                <w:lang w:val="en-US"/>
+              </w:rPr>
+            </w:pPr>
             <w:r>
               <w:rPr>
                 <w:lang w:val="en-US"/>
@@ -1532,21 +1488,20 @@
               </w:rPr>
               <w:t>_italic</w:t>
             </w:r>
-            <w:proofErr w:type="spellEnd"/>
           </w:p>
         </w:tc>
         <w:tc>
           <w:tcPr>
             <w:cnfStyle w:val="000010000000" w:firstRow="0" w:lastRow="0" w:firstColumn="0" w:lastColumn="0" w:oddVBand="1" w:evenVBand="0" w:oddHBand="0" w:evenHBand="0" w:firstRowFirstColumn="0" w:firstRowLastColumn="0" w:lastRowFirstColumn="0" w:lastRowLastColumn="0"/>
-            <w:tcW w:w="1600" w:type="dxa"/>
-          </w:tcPr>
-          <w:p>
-            <w:pPr>
-              <w:rPr>
-                <w:lang w:val="en-US"/>
-              </w:rPr>
-            </w:pPr>
-            <w:proofErr w:type="spellStart"/>
+            <w:tcW w:w="2268" w:type="dxa"/>
+            <w:gridSpan w:val="2"/>
+          </w:tcPr>
+          <w:p>
+            <w:pPr>
+              <w:rPr>
+                <w:lang w:val="en-US"/>
+              </w:rPr>
+            </w:pPr>
             <w:r>
               <w:rPr>
                 <w:lang w:val="en-US"/>
@@ -1559,21 +1514,20 @@
               </w:rPr>
               <w:t>_up</w:t>
             </w:r>
-            <w:proofErr w:type="spellEnd"/>
           </w:p>
         </w:tc>
         <w:tc>
           <w:tcPr>
             <w:cnfStyle w:val="000001000000" w:firstRow="0" w:lastRow="0" w:firstColumn="0" w:lastColumn="0" w:oddVBand="0" w:evenVBand="1" w:oddHBand="0" w:evenHBand="0" w:firstRowFirstColumn="0" w:firstRowLastColumn="0" w:lastRowFirstColumn="0" w:lastRowLastColumn="0"/>
-            <w:tcW w:w="1588" w:type="dxa"/>
-          </w:tcPr>
-          <w:p>
-            <w:pPr>
-              <w:rPr>
-                <w:lang w:val="en-US"/>
-              </w:rPr>
-            </w:pPr>
-            <w:proofErr w:type="spellStart"/>
+            <w:tcW w:w="2268" w:type="dxa"/>
+            <w:gridSpan w:val="2"/>
+          </w:tcPr>
+          <w:p>
+            <w:pPr>
+              <w:rPr>
+                <w:lang w:val="en-US"/>
+              </w:rPr>
+            </w:pPr>
             <w:r>
               <w:rPr>
                 <w:lang w:val="en-US"/>
@@ -1586,21 +1540,20 @@
               </w:rPr>
               <w:t>_italic</w:t>
             </w:r>
-            <w:proofErr w:type="spellEnd"/>
           </w:p>
         </w:tc>
         <w:tc>
           <w:tcPr>
             <w:cnfStyle w:val="000010000000" w:firstRow="0" w:lastRow="0" w:firstColumn="0" w:lastColumn="0" w:oddVBand="1" w:evenVBand="0" w:oddHBand="0" w:evenHBand="0" w:firstRowFirstColumn="0" w:firstRowLastColumn="0" w:lastRowFirstColumn="0" w:lastRowLastColumn="0"/>
-            <w:tcW w:w="1500" w:type="dxa"/>
-          </w:tcPr>
-          <w:p>
-            <w:pPr>
-              <w:rPr>
-                <w:lang w:val="en-US"/>
-              </w:rPr>
-            </w:pPr>
-            <w:proofErr w:type="spellStart"/>
+            <w:tcW w:w="2268" w:type="dxa"/>
+            <w:gridSpan w:val="2"/>
+          </w:tcPr>
+          <w:p>
+            <w:pPr>
+              <w:rPr>
+                <w:lang w:val="en-US"/>
+              </w:rPr>
+            </w:pPr>
             <w:r>
               <w:rPr>
                 <w:lang w:val="en-US"/>
@@ -1613,18 +1566,19 @@
               </w:rPr>
               <w:t>_up</w:t>
             </w:r>
-            <w:proofErr w:type="spellEnd"/>
           </w:p>
         </w:tc>
       </w:tr>
       <w:tr>
         <w:trPr>
+          <w:gridAfter w:val="1"/>
           <w:cnfStyle w:val="000000100000" w:firstRow="0" w:lastRow="0" w:firstColumn="0" w:lastColumn="0" w:oddVBand="0" w:evenVBand="0" w:oddHBand="1" w:evenHBand="0" w:firstRowFirstColumn="0" w:firstRowLastColumn="0" w:lastRowFirstColumn="0" w:lastRowLastColumn="0"/>
+          <w:wAfter w:w="1438" w:type="dxa"/>
         </w:trPr>
         <w:tc>
           <w:tcPr>
             <w:cnfStyle w:val="001000000000" w:firstRow="0" w:lastRow="0" w:firstColumn="1" w:lastColumn="0" w:oddVBand="0" w:evenVBand="0" w:oddHBand="0" w:evenHBand="0" w:firstRowFirstColumn="0" w:firstRowLastColumn="0" w:lastRowFirstColumn="0" w:lastRowLastColumn="0"/>
-            <w:tcW w:w="1524" w:type="dxa"/>
+            <w:tcW w:w="3686" w:type="dxa"/>
           </w:tcPr>
           <w:p>
             <w:pPr>
@@ -1638,29 +1592,25 @@
               </w:rPr>
               <w:t>strike_</w:t>
             </w:r>
-            <w:proofErr w:type="spellStart"/>
             <w:r>
               <w:t>underline</w:t>
             </w:r>
-            <w:proofErr w:type="spellEnd"/>
           </w:p>
         </w:tc>
         <w:tc>
           <w:tcPr>
             <w:cnfStyle w:val="000010000000" w:firstRow="0" w:lastRow="0" w:firstColumn="0" w:lastColumn="0" w:oddVBand="1" w:evenVBand="0" w:oddHBand="0" w:evenHBand="0" w:firstRowFirstColumn="0" w:firstRowLastColumn="0" w:lastRowFirstColumn="0" w:lastRowLastColumn="0"/>
-            <w:tcW w:w="1524" w:type="dxa"/>
-          </w:tcPr>
-          <w:p>
-            <w:pPr>
-              <w:rPr>
-                <w:lang w:val="en-US"/>
-              </w:rPr>
-            </w:pPr>
-            <w:proofErr w:type="spellStart"/>
+            <w:tcW w:w="850" w:type="dxa"/>
+          </w:tcPr>
+          <w:p>
+            <w:pPr>
+              <w:rPr>
+                <w:lang w:val="en-US"/>
+              </w:rPr>
+            </w:pPr>
             <w:r>
               <w:t>underline</w:t>
             </w:r>
-            <w:proofErr w:type="spellEnd"/>
             <w:r>
               <w:rPr>
                 <w:lang w:val="en-US"/>
@@ -1672,15 +1622,15 @@
         <w:tc>
           <w:tcPr>
             <w:cnfStyle w:val="000001000000" w:firstRow="0" w:lastRow="0" w:firstColumn="0" w:lastColumn="0" w:oddVBand="0" w:evenVBand="1" w:oddHBand="0" w:evenHBand="0" w:firstRowFirstColumn="0" w:firstRowLastColumn="0" w:lastRowFirstColumn="0" w:lastRowLastColumn="0"/>
-            <w:tcW w:w="1619" w:type="dxa"/>
-          </w:tcPr>
-          <w:p>
-            <w:pPr>
-              <w:rPr>
-                <w:lang w:val="en-US"/>
-              </w:rPr>
-            </w:pPr>
-            <w:proofErr w:type="spellStart"/>
+            <w:tcW w:w="2268" w:type="dxa"/>
+            <w:gridSpan w:val="2"/>
+          </w:tcPr>
+          <w:p>
+            <w:pPr>
+              <w:rPr>
+                <w:lang w:val="en-US"/>
+              </w:rPr>
+            </w:pPr>
             <w:r>
               <w:rPr>
                 <w:lang w:val="en-US"/>
@@ -1693,25 +1643,23 @@
               </w:rPr>
               <w:t>_underline</w:t>
             </w:r>
-            <w:proofErr w:type="spellEnd"/>
           </w:p>
         </w:tc>
         <w:tc>
           <w:tcPr>
             <w:cnfStyle w:val="000010000000" w:firstRow="0" w:lastRow="0" w:firstColumn="0" w:lastColumn="0" w:oddVBand="1" w:evenVBand="0" w:oddHBand="0" w:evenHBand="0" w:firstRowFirstColumn="0" w:firstRowLastColumn="0" w:lastRowFirstColumn="0" w:lastRowLastColumn="0"/>
-            <w:tcW w:w="1600" w:type="dxa"/>
-          </w:tcPr>
-          <w:p>
-            <w:pPr>
-              <w:rPr>
-                <w:lang w:val="en-US"/>
-              </w:rPr>
-            </w:pPr>
-            <w:proofErr w:type="spellStart"/>
+            <w:tcW w:w="2268" w:type="dxa"/>
+            <w:gridSpan w:val="2"/>
+          </w:tcPr>
+          <w:p>
+            <w:pPr>
+              <w:rPr>
+                <w:lang w:val="en-US"/>
+              </w:rPr>
+            </w:pPr>
             <w:r>
               <w:t>underline</w:t>
             </w:r>
-            <w:proofErr w:type="spellEnd"/>
             <w:r>
               <w:rPr>
                 <w:lang w:val="en-US"/>
@@ -1723,15 +1671,15 @@
         <w:tc>
           <w:tcPr>
             <w:cnfStyle w:val="000001000000" w:firstRow="0" w:lastRow="0" w:firstColumn="0" w:lastColumn="0" w:oddVBand="0" w:evenVBand="1" w:oddHBand="0" w:evenHBand="0" w:firstRowFirstColumn="0" w:firstRowLastColumn="0" w:lastRowFirstColumn="0" w:lastRowLastColumn="0"/>
-            <w:tcW w:w="1588" w:type="dxa"/>
-          </w:tcPr>
-          <w:p>
-            <w:pPr>
-              <w:rPr>
-                <w:lang w:val="en-US"/>
-              </w:rPr>
-            </w:pPr>
-            <w:proofErr w:type="spellStart"/>
+            <w:tcW w:w="2268" w:type="dxa"/>
+            <w:gridSpan w:val="2"/>
+          </w:tcPr>
+          <w:p>
+            <w:pPr>
+              <w:rPr>
+                <w:lang w:val="en-US"/>
+              </w:rPr>
+            </w:pPr>
             <w:r>
               <w:rPr>
                 <w:lang w:val="en-US"/>
@@ -1744,25 +1692,23 @@
               </w:rPr>
               <w:t>_underline</w:t>
             </w:r>
-            <w:proofErr w:type="spellEnd"/>
           </w:p>
         </w:tc>
         <w:tc>
           <w:tcPr>
             <w:cnfStyle w:val="000010000000" w:firstRow="0" w:lastRow="0" w:firstColumn="0" w:lastColumn="0" w:oddVBand="1" w:evenVBand="0" w:oddHBand="0" w:evenHBand="0" w:firstRowFirstColumn="0" w:firstRowLastColumn="0" w:lastRowFirstColumn="0" w:lastRowLastColumn="0"/>
-            <w:tcW w:w="1500" w:type="dxa"/>
-          </w:tcPr>
-          <w:p>
-            <w:pPr>
-              <w:rPr>
-                <w:lang w:val="en-US"/>
-              </w:rPr>
-            </w:pPr>
-            <w:proofErr w:type="spellStart"/>
+            <w:tcW w:w="2268" w:type="dxa"/>
+            <w:gridSpan w:val="2"/>
+          </w:tcPr>
+          <w:p>
+            <w:pPr>
+              <w:rPr>
+                <w:lang w:val="en-US"/>
+              </w:rPr>
+            </w:pPr>
             <w:r>
               <w:t>underline</w:t>
             </w:r>
-            <w:proofErr w:type="spellEnd"/>
             <w:r>
               <w:rPr>
                 <w:lang w:val="en-US"/>
@@ -1774,20 +1720,21 @@
       </w:tr>
       <w:tr>
         <w:trPr>
+          <w:gridAfter w:val="1"/>
           <w:cnfStyle w:val="000000010000" w:firstRow="0" w:lastRow="0" w:firstColumn="0" w:lastColumn="0" w:oddVBand="0" w:evenVBand="0" w:oddHBand="0" w:evenHBand="1" w:firstRowFirstColumn="0" w:firstRowLastColumn="0" w:lastRowFirstColumn="0" w:lastRowLastColumn="0"/>
+          <w:wAfter w:w="1438" w:type="dxa"/>
         </w:trPr>
         <w:tc>
           <w:tcPr>
             <w:cnfStyle w:val="001000000000" w:firstRow="0" w:lastRow="0" w:firstColumn="1" w:lastColumn="0" w:oddVBand="0" w:evenVBand="0" w:oddHBand="0" w:evenHBand="0" w:firstRowFirstColumn="0" w:firstRowLastColumn="0" w:lastRowFirstColumn="0" w:lastRowLastColumn="0"/>
-            <w:tcW w:w="1524" w:type="dxa"/>
-          </w:tcPr>
-          <w:p>
-            <w:pPr>
-              <w:rPr>
-                <w:lang w:val="en-US"/>
-              </w:rPr>
-            </w:pPr>
-            <w:proofErr w:type="spellStart"/>
+            <w:tcW w:w="3686" w:type="dxa"/>
+          </w:tcPr>
+          <w:p>
+            <w:pPr>
+              <w:rPr>
+                <w:lang w:val="en-US"/>
+              </w:rPr>
+            </w:pPr>
             <w:r>
               <w:rPr>
                 <w:lang w:val="en-US"/>
@@ -1800,21 +1747,19 @@
               </w:rPr>
               <w:t>italic</w:t>
             </w:r>
-            <w:proofErr w:type="spellEnd"/>
           </w:p>
         </w:tc>
         <w:tc>
           <w:tcPr>
             <w:cnfStyle w:val="000010000000" w:firstRow="0" w:lastRow="0" w:firstColumn="0" w:lastColumn="0" w:oddVBand="1" w:evenVBand="0" w:oddHBand="0" w:evenHBand="0" w:firstRowFirstColumn="0" w:firstRowLastColumn="0" w:lastRowFirstColumn="0" w:lastRowLastColumn="0"/>
-            <w:tcW w:w="1524" w:type="dxa"/>
-          </w:tcPr>
-          <w:p>
-            <w:pPr>
-              <w:rPr>
-                <w:lang w:val="en-US"/>
-              </w:rPr>
-            </w:pPr>
-            <w:proofErr w:type="spellStart"/>
+            <w:tcW w:w="850" w:type="dxa"/>
+          </w:tcPr>
+          <w:p>
+            <w:pPr>
+              <w:rPr>
+                <w:lang w:val="en-US"/>
+              </w:rPr>
+            </w:pPr>
             <w:r>
               <w:rPr>
                 <w:lang w:val="en-US"/>
@@ -1827,21 +1772,20 @@
               </w:rPr>
               <w:t>_up</w:t>
             </w:r>
-            <w:proofErr w:type="spellEnd"/>
           </w:p>
         </w:tc>
         <w:tc>
           <w:tcPr>
             <w:cnfStyle w:val="000001000000" w:firstRow="0" w:lastRow="0" w:firstColumn="0" w:lastColumn="0" w:oddVBand="0" w:evenVBand="1" w:oddHBand="0" w:evenHBand="0" w:firstRowFirstColumn="0" w:firstRowLastColumn="0" w:lastRowFirstColumn="0" w:lastRowLastColumn="0"/>
-            <w:tcW w:w="1619" w:type="dxa"/>
-          </w:tcPr>
-          <w:p>
-            <w:pPr>
-              <w:rPr>
-                <w:lang w:val="en-US"/>
-              </w:rPr>
-            </w:pPr>
-            <w:proofErr w:type="spellStart"/>
+            <w:tcW w:w="2268" w:type="dxa"/>
+            <w:gridSpan w:val="2"/>
+          </w:tcPr>
+          <w:p>
+            <w:pPr>
+              <w:rPr>
+                <w:lang w:val="en-US"/>
+              </w:rPr>
+            </w:pPr>
             <w:r>
               <w:rPr>
                 <w:lang w:val="en-US"/>
@@ -1854,21 +1798,20 @@
               </w:rPr>
               <w:t>_italic</w:t>
             </w:r>
-            <w:proofErr w:type="spellEnd"/>
           </w:p>
         </w:tc>
         <w:tc>
           <w:tcPr>
             <w:cnfStyle w:val="000010000000" w:firstRow="0" w:lastRow="0" w:firstColumn="0" w:lastColumn="0" w:oddVBand="1" w:evenVBand="0" w:oddHBand="0" w:evenHBand="0" w:firstRowFirstColumn="0" w:firstRowLastColumn="0" w:lastRowFirstColumn="0" w:lastRowLastColumn="0"/>
-            <w:tcW w:w="1600" w:type="dxa"/>
-          </w:tcPr>
-          <w:p>
-            <w:pPr>
-              <w:rPr>
-                <w:lang w:val="en-US"/>
-              </w:rPr>
-            </w:pPr>
-            <w:proofErr w:type="spellStart"/>
+            <w:tcW w:w="2268" w:type="dxa"/>
+            <w:gridSpan w:val="2"/>
+          </w:tcPr>
+          <w:p>
+            <w:pPr>
+              <w:rPr>
+                <w:lang w:val="en-US"/>
+              </w:rPr>
+            </w:pPr>
             <w:r>
               <w:rPr>
                 <w:lang w:val="en-US"/>
@@ -1881,21 +1824,20 @@
               </w:rPr>
               <w:t>_up</w:t>
             </w:r>
-            <w:proofErr w:type="spellEnd"/>
           </w:p>
         </w:tc>
         <w:tc>
           <w:tcPr>
             <w:cnfStyle w:val="000001000000" w:firstRow="0" w:lastRow="0" w:firstColumn="0" w:lastColumn="0" w:oddVBand="0" w:evenVBand="1" w:oddHBand="0" w:evenHBand="0" w:firstRowFirstColumn="0" w:firstRowLastColumn="0" w:lastRowFirstColumn="0" w:lastRowLastColumn="0"/>
-            <w:tcW w:w="1588" w:type="dxa"/>
-          </w:tcPr>
-          <w:p>
-            <w:pPr>
-              <w:rPr>
-                <w:lang w:val="en-US"/>
-              </w:rPr>
-            </w:pPr>
-            <w:proofErr w:type="spellStart"/>
+            <w:tcW w:w="2268" w:type="dxa"/>
+            <w:gridSpan w:val="2"/>
+          </w:tcPr>
+          <w:p>
+            <w:pPr>
+              <w:rPr>
+                <w:lang w:val="en-US"/>
+              </w:rPr>
+            </w:pPr>
             <w:r>
               <w:rPr>
                 <w:lang w:val="en-US"/>
@@ -1908,21 +1850,20 @@
               </w:rPr>
               <w:t>_italic</w:t>
             </w:r>
-            <w:proofErr w:type="spellEnd"/>
           </w:p>
         </w:tc>
         <w:tc>
           <w:tcPr>
             <w:cnfStyle w:val="000010000000" w:firstRow="0" w:lastRow="0" w:firstColumn="0" w:lastColumn="0" w:oddVBand="1" w:evenVBand="0" w:oddHBand="0" w:evenHBand="0" w:firstRowFirstColumn="0" w:firstRowLastColumn="0" w:lastRowFirstColumn="0" w:lastRowLastColumn="0"/>
-            <w:tcW w:w="1500" w:type="dxa"/>
-          </w:tcPr>
-          <w:p>
-            <w:pPr>
-              <w:rPr>
-                <w:lang w:val="en-US"/>
-              </w:rPr>
-            </w:pPr>
-            <w:proofErr w:type="spellStart"/>
+            <w:tcW w:w="2268" w:type="dxa"/>
+            <w:gridSpan w:val="2"/>
+          </w:tcPr>
+          <w:p>
+            <w:pPr>
+              <w:rPr>
+                <w:lang w:val="en-US"/>
+              </w:rPr>
+            </w:pPr>
             <w:r>
               <w:rPr>
                 <w:lang w:val="en-US"/>
@@ -1935,7 +1876,6 @@
               </w:rPr>
               <w:t>_up</w:t>
             </w:r>
-            <w:proofErr w:type="spellEnd"/>
           </w:p>
         </w:tc>
       </w:tr>
@@ -1967,6 +1907,7 @@
               <w:ind w:left="113" w:right="113"/>
             </w:pPr>
             <w:r>
+              <w:lastRenderedPageBreak/>
               <w:t>и</w:t>
             </w:r>
           </w:p>
@@ -1981,11 +1922,9 @@
               <w:ind w:left="113" w:right="113"/>
               <w:jc w:val="center"/>
             </w:pPr>
-            <w:proofErr w:type="spellStart"/>
             <w:r>
               <w:t>ыаваы</w:t>
             </w:r>
-            <w:proofErr w:type="spellEnd"/>
           </w:p>
         </w:tc>
         <w:tc>
@@ -1998,11 +1937,9 @@
               <w:ind w:left="113" w:right="113"/>
               <w:jc w:val="right"/>
             </w:pPr>
-            <w:proofErr w:type="spellStart"/>
             <w:r>
               <w:t>аыв</w:t>
             </w:r>
-            <w:proofErr w:type="spellEnd"/>
           </w:p>
         </w:tc>
       </w:tr>
@@ -2021,11 +1958,9 @@
             <w:pPr>
               <w:ind w:left="113" w:right="113"/>
             </w:pPr>
-            <w:proofErr w:type="spellStart"/>
             <w:r>
               <w:t>аыва</w:t>
             </w:r>
-            <w:proofErr w:type="spellEnd"/>
           </w:p>
         </w:tc>
         <w:tc>
@@ -2039,11 +1974,9 @@
               <w:ind w:left="113" w:right="113"/>
               <w:jc w:val="center"/>
             </w:pPr>
-            <w:proofErr w:type="spellStart"/>
             <w:r>
               <w:t>аыв</w:t>
             </w:r>
-            <w:proofErr w:type="spellEnd"/>
           </w:p>
         </w:tc>
         <w:tc>
@@ -2057,11 +1990,9 @@
               <w:ind w:left="113" w:right="113"/>
               <w:jc w:val="right"/>
             </w:pPr>
-            <w:proofErr w:type="spellStart"/>
             <w:r>
               <w:t>аыв</w:t>
             </w:r>
-            <w:proofErr w:type="spellEnd"/>
           </w:p>
         </w:tc>
       </w:tr>
@@ -2080,11 +2011,9 @@
             <w:pPr>
               <w:ind w:left="113" w:right="113"/>
             </w:pPr>
-            <w:proofErr w:type="spellStart"/>
             <w:r>
               <w:t>вфы</w:t>
             </w:r>
-            <w:proofErr w:type="spellEnd"/>
           </w:p>
         </w:tc>
         <w:tc>
@@ -2098,11 +2027,9 @@
               <w:ind w:left="113" w:right="113"/>
               <w:jc w:val="center"/>
             </w:pPr>
-            <w:proofErr w:type="spellStart"/>
             <w:r>
               <w:t>фыв</w:t>
             </w:r>
-            <w:proofErr w:type="spellEnd"/>
           </w:p>
         </w:tc>
         <w:tc>
@@ -2116,11 +2043,9 @@
               <w:ind w:left="113" w:right="113"/>
               <w:jc w:val="right"/>
             </w:pPr>
-            <w:proofErr w:type="spellStart"/>
             <w:r>
               <w:t>аыв</w:t>
             </w:r>
-            <w:proofErr w:type="spellEnd"/>
           </w:p>
         </w:tc>
       </w:tr>
@@ -4080,7 +4005,7 @@
     <w:name w:val="Scary"/>
     <w:basedOn w:val="a1"/>
     <w:uiPriority w:val="99"/>
-    <w:rsid w:val="005E40DD"/>
+    <w:rsid w:val="00853A67"/>
     <w:pPr>
       <w:spacing w:after="0" w:line="240" w:lineRule="auto"/>
     </w:pPr>
@@ -4113,6 +4038,12 @@
           <w:tl2br w:val="nil"/>
           <w:tr2bl w:val="nil"/>
         </w:tcBorders>
+        <w:tcMar>
+          <w:top w:w="1134" w:type="dxa"/>
+          <w:left w:w="1134" w:type="dxa"/>
+          <w:bottom w:w="1134" w:type="dxa"/>
+          <w:right w:w="1134" w:type="dxa"/>
+        </w:tcMar>
       </w:tcPr>
     </w:tblStylePr>
     <w:tblStylePr w:type="firstCol">
@@ -4520,7 +4451,7 @@
 </file>
 
 <file path=customXml/itemProps1.xml><?xml version="1.0" encoding="utf-8"?>
-<ds:datastoreItem xmlns:ds="http://schemas.openxmlformats.org/officeDocument/2006/customXml" ds:itemID="{F56024AF-6166-48AD-9CB1-1371D29738F8}">
+<ds:datastoreItem xmlns:ds="http://schemas.openxmlformats.org/officeDocument/2006/customXml" ds:itemID="{25C575AB-0134-4997-8204-AB1E22CF04DC}">
   <ds:schemaRefs>
     <ds:schemaRef ds:uri="http://schemas.openxmlformats.org/officeDocument/2006/bibliography"/>
   </ds:schemaRefs>

</xml_diff>

<commit_message>
refac some colors etc.
</commit_message>
<xml_diff>
--- a/tests/examples/List.docx
+++ b/tests/examples/List.docx
@@ -600,6 +600,9 @@
         <w:tc>
           <w:tcPr>
             <w:tcW w:w="9345" w:type="dxa"/>
+            <w:tcBorders>
+              <w:left w:val="single" w:sz="4" w:space="0" w:color="00B050"/>
+            </w:tcBorders>
             <w:textDirection w:val="tbRl"/>
             <w:vAlign w:val="center"/>
           </w:tcPr>
@@ -659,6 +662,7 @@
               <w:rPr>
                 <w:lang w:val="en-US"/>
               </w:rPr>
+              <w:lastRenderedPageBreak/>
               <w:t>1CA</w:t>
             </w:r>
             <w:r>
@@ -892,31 +896,31 @@
     <w:tbl>
       <w:tblPr>
         <w:tblStyle w:val="Scary"/>
-        <w:tblW w:w="15046" w:type="dxa"/>
+        <w:tblW w:w="9324" w:type="dxa"/>
         <w:tblLayout w:type="fixed"/>
         <w:tblLook w:val="01E0" w:firstRow="1" w:lastRow="1" w:firstColumn="1" w:lastColumn="1" w:noHBand="0" w:noVBand="0"/>
       </w:tblPr>
       <w:tblGrid>
-        <w:gridCol w:w="3606"/>
-        <w:gridCol w:w="850"/>
-        <w:gridCol w:w="1438"/>
-        <w:gridCol w:w="839"/>
-        <w:gridCol w:w="1449"/>
-        <w:gridCol w:w="839"/>
-        <w:gridCol w:w="1449"/>
-        <w:gridCol w:w="839"/>
-        <w:gridCol w:w="1449"/>
-        <w:gridCol w:w="839"/>
-        <w:gridCol w:w="1449"/>
+        <w:gridCol w:w="2545"/>
+        <w:gridCol w:w="717"/>
+        <w:gridCol w:w="1008"/>
+        <w:gridCol w:w="600"/>
+        <w:gridCol w:w="1024"/>
+        <w:gridCol w:w="584"/>
+        <w:gridCol w:w="1006"/>
+        <w:gridCol w:w="602"/>
+        <w:gridCol w:w="1002"/>
+        <w:gridCol w:w="236"/>
       </w:tblGrid>
       <w:tr>
         <w:trPr>
           <w:cnfStyle w:val="100000000000" w:firstRow="1" w:lastRow="0" w:firstColumn="0" w:lastColumn="0" w:oddVBand="0" w:evenVBand="0" w:oddHBand="0" w:evenHBand="0" w:firstRowFirstColumn="0" w:firstRowLastColumn="0" w:lastRowFirstColumn="0" w:lastRowLastColumn="0"/>
+          <w:trHeight w:val="546"/>
         </w:trPr>
         <w:tc>
           <w:tcPr>
             <w:cnfStyle w:val="001000000100" w:firstRow="0" w:lastRow="0" w:firstColumn="1" w:lastColumn="0" w:oddVBand="0" w:evenVBand="0" w:oddHBand="0" w:evenHBand="0" w:firstRowFirstColumn="1" w:firstRowLastColumn="0" w:lastRowFirstColumn="0" w:lastRowLastColumn="0"/>
-            <w:tcW w:w="3686" w:type="dxa"/>
+            <w:tcW w:w="2563" w:type="dxa"/>
           </w:tcPr>
           <w:p>
             <w:pPr>
@@ -936,7 +940,7 @@
         <w:tc>
           <w:tcPr>
             <w:cnfStyle w:val="000010000000" w:firstRow="0" w:lastRow="0" w:firstColumn="0" w:lastColumn="0" w:oddVBand="1" w:evenVBand="0" w:oddHBand="0" w:evenHBand="0" w:firstRowFirstColumn="0" w:firstRowLastColumn="0" w:lastRowFirstColumn="0" w:lastRowLastColumn="0"/>
-            <w:tcW w:w="2288" w:type="dxa"/>
+            <w:tcW w:w="1736" w:type="dxa"/>
             <w:gridSpan w:val="2"/>
             <w:tcBorders>
               <w:top w:val="single" w:sz="4" w:space="0" w:color="auto"/>
@@ -964,7 +968,7 @@
         <w:tc>
           <w:tcPr>
             <w:cnfStyle w:val="000001000000" w:firstRow="0" w:lastRow="0" w:firstColumn="0" w:lastColumn="0" w:oddVBand="0" w:evenVBand="1" w:oddHBand="0" w:evenHBand="0" w:firstRowFirstColumn="0" w:firstRowLastColumn="0" w:lastRowFirstColumn="0" w:lastRowLastColumn="0"/>
-            <w:tcW w:w="2268" w:type="dxa"/>
+            <w:tcW w:w="1635" w:type="dxa"/>
             <w:gridSpan w:val="2"/>
           </w:tcPr>
           <w:p>
@@ -992,7 +996,7 @@
         <w:tc>
           <w:tcPr>
             <w:cnfStyle w:val="000010000000" w:firstRow="0" w:lastRow="0" w:firstColumn="0" w:lastColumn="0" w:oddVBand="1" w:evenVBand="0" w:oddHBand="0" w:evenHBand="0" w:firstRowFirstColumn="0" w:firstRowLastColumn="0" w:lastRowFirstColumn="0" w:lastRowLastColumn="0"/>
-            <w:tcW w:w="2268" w:type="dxa"/>
+            <w:tcW w:w="1601" w:type="dxa"/>
             <w:gridSpan w:val="2"/>
           </w:tcPr>
           <w:p>
@@ -1020,7 +1024,7 @@
         <w:tc>
           <w:tcPr>
             <w:cnfStyle w:val="000001000000" w:firstRow="0" w:lastRow="0" w:firstColumn="0" w:lastColumn="0" w:oddVBand="0" w:evenVBand="1" w:oddHBand="0" w:evenHBand="0" w:firstRowFirstColumn="0" w:firstRowLastColumn="0" w:lastRowFirstColumn="0" w:lastRowLastColumn="0"/>
-            <w:tcW w:w="2268" w:type="dxa"/>
+            <w:tcW w:w="1615" w:type="dxa"/>
             <w:gridSpan w:val="2"/>
           </w:tcPr>
           <w:p>
@@ -1048,12 +1052,11 @@
         <w:tc>
           <w:tcPr>
             <w:cnfStyle w:val="000010000000" w:firstRow="0" w:lastRow="0" w:firstColumn="0" w:lastColumn="0" w:oddVBand="1" w:evenVBand="0" w:oddHBand="0" w:evenHBand="0" w:firstRowFirstColumn="0" w:firstRowLastColumn="0" w:lastRowFirstColumn="0" w:lastRowLastColumn="0"/>
-            <w:tcW w:w="2268" w:type="dxa"/>
-            <w:gridSpan w:val="2"/>
-          </w:tcPr>
-          <w:p>
-            <w:pPr>
-              <w:ind w:left="-779"/>
+            <w:tcW w:w="173" w:type="dxa"/>
+          </w:tcPr>
+          <w:p>
+            <w:pPr>
+              <w:ind w:left="-779" w:right="339"/>
               <w:rPr>
                 <w:lang w:val="en-US"/>
               </w:rPr>
@@ -1076,23 +1079,17 @@
         </w:tc>
       </w:tr>
       <w:tr>
-        <w:tblPrEx>
-          <w:tblCellMar>
-            <w:top w:w="0" w:type="dxa"/>
-            <w:left w:w="108" w:type="dxa"/>
-            <w:bottom w:w="0" w:type="dxa"/>
-            <w:right w:w="108" w:type="dxa"/>
-          </w:tblCellMar>
-        </w:tblPrEx>
         <w:trPr>
-          <w:gridAfter w:val="1"/>
           <w:cnfStyle w:val="000000100000" w:firstRow="0" w:lastRow="0" w:firstColumn="0" w:lastColumn="0" w:oddVBand="0" w:evenVBand="0" w:oddHBand="1" w:evenHBand="0" w:firstRowFirstColumn="0" w:firstRowLastColumn="0" w:lastRowFirstColumn="0" w:lastRowLastColumn="0"/>
-          <w:wAfter w:w="1438" w:type="dxa"/>
+          <w:trHeight w:val="546"/>
         </w:trPr>
         <w:tc>
           <w:tcPr>
             <w:cnfStyle w:val="001000000000" w:firstRow="0" w:lastRow="0" w:firstColumn="1" w:lastColumn="0" w:oddVBand="0" w:evenVBand="0" w:oddHBand="0" w:evenHBand="0" w:firstRowFirstColumn="0" w:firstRowLastColumn="0" w:lastRowFirstColumn="0" w:lastRowLastColumn="0"/>
-            <w:tcW w:w="3686" w:type="dxa"/>
+            <w:tcW w:w="2563" w:type="dxa"/>
+            <w:tcBorders>
+              <w:right w:val="single" w:sz="4" w:space="0" w:color="00B050"/>
+            </w:tcBorders>
           </w:tcPr>
           <w:p>
             <w:pPr>
@@ -1116,9 +1113,12 @@
         <w:tc>
           <w:tcPr>
             <w:cnfStyle w:val="000010000000" w:firstRow="0" w:lastRow="0" w:firstColumn="0" w:lastColumn="0" w:oddVBand="1" w:evenVBand="0" w:oddHBand="0" w:evenHBand="0" w:firstRowFirstColumn="0" w:firstRowLastColumn="0" w:lastRowFirstColumn="0" w:lastRowLastColumn="0"/>
-            <w:tcW w:w="3118" w:type="dxa"/>
+            <w:tcW w:w="2340" w:type="dxa"/>
             <w:gridSpan w:val="3"/>
             <w:vMerge w:val="restart"/>
+            <w:tcBorders>
+              <w:left w:val="single" w:sz="4" w:space="0" w:color="00B050"/>
+            </w:tcBorders>
           </w:tcPr>
           <w:p>
             <w:pPr>
@@ -1142,7 +1142,7 @@
         <w:tc>
           <w:tcPr>
             <w:cnfStyle w:val="000001000000" w:firstRow="0" w:lastRow="0" w:firstColumn="0" w:lastColumn="0" w:oddVBand="0" w:evenVBand="1" w:oddHBand="0" w:evenHBand="0" w:firstRowFirstColumn="0" w:firstRowLastColumn="0" w:lastRowFirstColumn="0" w:lastRowLastColumn="0"/>
-            <w:tcW w:w="2268" w:type="dxa"/>
+            <w:tcW w:w="1619" w:type="dxa"/>
             <w:gridSpan w:val="2"/>
           </w:tcPr>
           <w:p>
@@ -1170,7 +1170,7 @@
         <w:tc>
           <w:tcPr>
             <w:cnfStyle w:val="000010000000" w:firstRow="0" w:lastRow="0" w:firstColumn="0" w:lastColumn="0" w:oddVBand="1" w:evenVBand="0" w:oddHBand="0" w:evenHBand="0" w:firstRowFirstColumn="0" w:firstRowLastColumn="0" w:lastRowFirstColumn="0" w:lastRowLastColumn="0"/>
-            <w:tcW w:w="2268" w:type="dxa"/>
+            <w:tcW w:w="1619" w:type="dxa"/>
             <w:gridSpan w:val="2"/>
           </w:tcPr>
           <w:p>
@@ -1195,7 +1195,7 @@
         <w:tc>
           <w:tcPr>
             <w:cnfStyle w:val="000001000000" w:firstRow="0" w:lastRow="0" w:firstColumn="0" w:lastColumn="0" w:oddVBand="0" w:evenVBand="1" w:oddHBand="0" w:evenHBand="0" w:firstRowFirstColumn="0" w:firstRowLastColumn="0" w:lastRowFirstColumn="0" w:lastRowLastColumn="0"/>
-            <w:tcW w:w="2268" w:type="dxa"/>
+            <w:tcW w:w="1183" w:type="dxa"/>
             <w:gridSpan w:val="2"/>
           </w:tcPr>
           <w:p>
@@ -1222,23 +1222,17 @@
         </w:tc>
       </w:tr>
       <w:tr>
-        <w:tblPrEx>
-          <w:tblCellMar>
-            <w:top w:w="0" w:type="dxa"/>
-            <w:left w:w="108" w:type="dxa"/>
-            <w:bottom w:w="0" w:type="dxa"/>
-            <w:right w:w="108" w:type="dxa"/>
-          </w:tblCellMar>
-        </w:tblPrEx>
         <w:trPr>
-          <w:gridAfter w:val="1"/>
           <w:cnfStyle w:val="000000010000" w:firstRow="0" w:lastRow="0" w:firstColumn="0" w:lastColumn="0" w:oddVBand="0" w:evenVBand="0" w:oddHBand="0" w:evenHBand="1" w:firstRowFirstColumn="0" w:firstRowLastColumn="0" w:lastRowFirstColumn="0" w:lastRowLastColumn="0"/>
-          <w:wAfter w:w="1438" w:type="dxa"/>
+          <w:trHeight w:val="273"/>
         </w:trPr>
         <w:tc>
           <w:tcPr>
             <w:cnfStyle w:val="001000000000" w:firstRow="0" w:lastRow="0" w:firstColumn="1" w:lastColumn="0" w:oddVBand="0" w:evenVBand="0" w:oddHBand="0" w:evenHBand="0" w:firstRowFirstColumn="0" w:firstRowLastColumn="0" w:lastRowFirstColumn="0" w:lastRowLastColumn="0"/>
-            <w:tcW w:w="3686" w:type="dxa"/>
+            <w:tcW w:w="2563" w:type="dxa"/>
+            <w:tcBorders>
+              <w:right w:val="single" w:sz="4" w:space="0" w:color="00B050"/>
+            </w:tcBorders>
           </w:tcPr>
           <w:p>
             <w:pPr>
@@ -1265,16 +1259,19 @@
         <w:tc>
           <w:tcPr>
             <w:cnfStyle w:val="000010000000" w:firstRow="0" w:lastRow="0" w:firstColumn="0" w:lastColumn="0" w:oddVBand="1" w:evenVBand="0" w:oddHBand="0" w:evenHBand="0" w:firstRowFirstColumn="0" w:firstRowLastColumn="0" w:lastRowFirstColumn="0" w:lastRowLastColumn="0"/>
-            <w:tcW w:w="3118" w:type="dxa"/>
+            <w:tcW w:w="2340" w:type="dxa"/>
             <w:gridSpan w:val="3"/>
             <w:vMerge/>
+            <w:tcBorders>
+              <w:left w:val="single" w:sz="4" w:space="0" w:color="00B050"/>
+            </w:tcBorders>
           </w:tcPr>
           <w:p/>
         </w:tc>
         <w:tc>
           <w:tcPr>
             <w:cnfStyle w:val="000001000000" w:firstRow="0" w:lastRow="0" w:firstColumn="0" w:lastColumn="0" w:oddVBand="0" w:evenVBand="1" w:oddHBand="0" w:evenHBand="0" w:firstRowFirstColumn="0" w:firstRowLastColumn="0" w:lastRowFirstColumn="0" w:lastRowLastColumn="0"/>
-            <w:tcW w:w="2268" w:type="dxa"/>
+            <w:tcW w:w="1619" w:type="dxa"/>
             <w:gridSpan w:val="2"/>
           </w:tcPr>
           <w:p>
@@ -1302,7 +1299,7 @@
         <w:tc>
           <w:tcPr>
             <w:cnfStyle w:val="000010000000" w:firstRow="0" w:lastRow="0" w:firstColumn="0" w:lastColumn="0" w:oddVBand="1" w:evenVBand="0" w:oddHBand="0" w:evenHBand="0" w:firstRowFirstColumn="0" w:firstRowLastColumn="0" w:lastRowFirstColumn="0" w:lastRowLastColumn="0"/>
-            <w:tcW w:w="2268" w:type="dxa"/>
+            <w:tcW w:w="1619" w:type="dxa"/>
             <w:gridSpan w:val="2"/>
           </w:tcPr>
           <w:p>
@@ -1322,7 +1319,7 @@
         <w:tc>
           <w:tcPr>
             <w:cnfStyle w:val="000001000000" w:firstRow="0" w:lastRow="0" w:firstColumn="0" w:lastColumn="0" w:oddVBand="0" w:evenVBand="1" w:oddHBand="0" w:evenHBand="0" w:firstRowFirstColumn="0" w:firstRowLastColumn="0" w:lastRowFirstColumn="0" w:lastRowLastColumn="0"/>
-            <w:tcW w:w="2268" w:type="dxa"/>
+            <w:tcW w:w="1183" w:type="dxa"/>
             <w:gridSpan w:val="2"/>
           </w:tcPr>
           <w:p>
@@ -1341,23 +1338,17 @@
         </w:tc>
       </w:tr>
       <w:tr>
-        <w:tblPrEx>
-          <w:tblCellMar>
-            <w:top w:w="0" w:type="dxa"/>
-            <w:left w:w="108" w:type="dxa"/>
-            <w:bottom w:w="0" w:type="dxa"/>
-            <w:right w:w="108" w:type="dxa"/>
-          </w:tblCellMar>
-        </w:tblPrEx>
         <w:trPr>
-          <w:gridAfter w:val="1"/>
           <w:cnfStyle w:val="000000100000" w:firstRow="0" w:lastRow="0" w:firstColumn="0" w:lastColumn="0" w:oddVBand="0" w:evenVBand="0" w:oddHBand="1" w:evenHBand="0" w:firstRowFirstColumn="0" w:firstRowLastColumn="0" w:lastRowFirstColumn="0" w:lastRowLastColumn="0"/>
-          <w:wAfter w:w="1438" w:type="dxa"/>
+          <w:trHeight w:val="273"/>
         </w:trPr>
         <w:tc>
           <w:tcPr>
             <w:cnfStyle w:val="001000000000" w:firstRow="0" w:lastRow="0" w:firstColumn="1" w:lastColumn="0" w:oddVBand="0" w:evenVBand="0" w:oddHBand="0" w:evenHBand="0" w:firstRowFirstColumn="0" w:firstRowLastColumn="0" w:lastRowFirstColumn="0" w:lastRowLastColumn="0"/>
-            <w:tcW w:w="3686" w:type="dxa"/>
+            <w:tcW w:w="2563" w:type="dxa"/>
+            <w:tcBorders>
+              <w:right w:val="single" w:sz="4" w:space="0" w:color="00B050"/>
+            </w:tcBorders>
           </w:tcPr>
           <w:p>
             <w:pPr>
@@ -1381,7 +1372,10 @@
         <w:tc>
           <w:tcPr>
             <w:cnfStyle w:val="000010000000" w:firstRow="0" w:lastRow="0" w:firstColumn="0" w:lastColumn="0" w:oddVBand="1" w:evenVBand="0" w:oddHBand="0" w:evenHBand="0" w:firstRowFirstColumn="0" w:firstRowLastColumn="0" w:lastRowFirstColumn="0" w:lastRowLastColumn="0"/>
-            <w:tcW w:w="850" w:type="dxa"/>
+            <w:tcW w:w="721" w:type="dxa"/>
+            <w:tcBorders>
+              <w:left w:val="single" w:sz="4" w:space="0" w:color="00B050"/>
+            </w:tcBorders>
           </w:tcPr>
           <w:p>
             <w:pPr>
@@ -1405,7 +1399,7 @@
         <w:tc>
           <w:tcPr>
             <w:cnfStyle w:val="000001000000" w:firstRow="0" w:lastRow="0" w:firstColumn="0" w:lastColumn="0" w:oddVBand="0" w:evenVBand="1" w:oddHBand="0" w:evenHBand="0" w:firstRowFirstColumn="0" w:firstRowLastColumn="0" w:lastRowFirstColumn="0" w:lastRowLastColumn="0"/>
-            <w:tcW w:w="2268" w:type="dxa"/>
+            <w:tcW w:w="1618" w:type="dxa"/>
             <w:gridSpan w:val="2"/>
           </w:tcPr>
           <w:p>
@@ -1430,7 +1424,7 @@
         <w:tc>
           <w:tcPr>
             <w:cnfStyle w:val="000010000000" w:firstRow="0" w:lastRow="0" w:firstColumn="0" w:lastColumn="0" w:oddVBand="1" w:evenVBand="0" w:oddHBand="0" w:evenHBand="0" w:firstRowFirstColumn="0" w:firstRowLastColumn="0" w:lastRowFirstColumn="0" w:lastRowLastColumn="0"/>
-            <w:tcW w:w="2268" w:type="dxa"/>
+            <w:tcW w:w="1619" w:type="dxa"/>
             <w:gridSpan w:val="2"/>
           </w:tcPr>
           <w:p>
@@ -1455,7 +1449,7 @@
         <w:tc>
           <w:tcPr>
             <w:cnfStyle w:val="000001000000" w:firstRow="0" w:lastRow="0" w:firstColumn="0" w:lastColumn="0" w:oddVBand="0" w:evenVBand="1" w:oddHBand="0" w:evenHBand="0" w:firstRowFirstColumn="0" w:firstRowLastColumn="0" w:lastRowFirstColumn="0" w:lastRowLastColumn="0"/>
-            <w:tcW w:w="2268" w:type="dxa"/>
+            <w:tcW w:w="1619" w:type="dxa"/>
             <w:gridSpan w:val="2"/>
           </w:tcPr>
           <w:p>
@@ -1483,7 +1477,7 @@
         <w:tc>
           <w:tcPr>
             <w:cnfStyle w:val="000010000000" w:firstRow="0" w:lastRow="0" w:firstColumn="0" w:lastColumn="0" w:oddVBand="1" w:evenVBand="0" w:oddHBand="0" w:evenHBand="0" w:firstRowFirstColumn="0" w:firstRowLastColumn="0" w:lastRowFirstColumn="0" w:lastRowLastColumn="0"/>
-            <w:tcW w:w="2268" w:type="dxa"/>
+            <w:tcW w:w="1183" w:type="dxa"/>
             <w:gridSpan w:val="2"/>
           </w:tcPr>
           <w:p>
@@ -1507,23 +1501,17 @@
         </w:tc>
       </w:tr>
       <w:tr>
-        <w:tblPrEx>
-          <w:tblCellMar>
-            <w:top w:w="0" w:type="dxa"/>
-            <w:left w:w="108" w:type="dxa"/>
-            <w:bottom w:w="0" w:type="dxa"/>
-            <w:right w:w="108" w:type="dxa"/>
-          </w:tblCellMar>
-        </w:tblPrEx>
         <w:trPr>
-          <w:gridAfter w:val="1"/>
           <w:cnfStyle w:val="000000010000" w:firstRow="0" w:lastRow="0" w:firstColumn="0" w:lastColumn="0" w:oddVBand="0" w:evenVBand="0" w:oddHBand="0" w:evenHBand="1" w:firstRowFirstColumn="0" w:firstRowLastColumn="0" w:lastRowFirstColumn="0" w:lastRowLastColumn="0"/>
-          <w:wAfter w:w="1438" w:type="dxa"/>
+          <w:trHeight w:val="273"/>
         </w:trPr>
         <w:tc>
           <w:tcPr>
             <w:cnfStyle w:val="001000000000" w:firstRow="0" w:lastRow="0" w:firstColumn="1" w:lastColumn="0" w:oddVBand="0" w:evenVBand="0" w:oddHBand="0" w:evenHBand="0" w:firstRowFirstColumn="0" w:firstRowLastColumn="0" w:lastRowFirstColumn="0" w:lastRowLastColumn="0"/>
-            <w:tcW w:w="3686" w:type="dxa"/>
+            <w:tcW w:w="2563" w:type="dxa"/>
+            <w:tcBorders>
+              <w:right w:val="single" w:sz="4" w:space="0" w:color="00B050"/>
+            </w:tcBorders>
           </w:tcPr>
           <w:p>
             <w:pPr>
@@ -1550,7 +1538,10 @@
         <w:tc>
           <w:tcPr>
             <w:cnfStyle w:val="000010000000" w:firstRow="0" w:lastRow="0" w:firstColumn="0" w:lastColumn="0" w:oddVBand="1" w:evenVBand="0" w:oddHBand="0" w:evenHBand="0" w:firstRowFirstColumn="0" w:firstRowLastColumn="0" w:lastRowFirstColumn="0" w:lastRowLastColumn="0"/>
-            <w:tcW w:w="850" w:type="dxa"/>
+            <w:tcW w:w="721" w:type="dxa"/>
+            <w:tcBorders>
+              <w:left w:val="single" w:sz="4" w:space="0" w:color="00B050"/>
+            </w:tcBorders>
           </w:tcPr>
           <w:p>
             <w:pPr>
@@ -1577,7 +1568,7 @@
         <w:tc>
           <w:tcPr>
             <w:cnfStyle w:val="000001000000" w:firstRow="0" w:lastRow="0" w:firstColumn="0" w:lastColumn="0" w:oddVBand="0" w:evenVBand="1" w:oddHBand="0" w:evenHBand="0" w:firstRowFirstColumn="0" w:firstRowLastColumn="0" w:lastRowFirstColumn="0" w:lastRowLastColumn="0"/>
-            <w:tcW w:w="2268" w:type="dxa"/>
+            <w:tcW w:w="1618" w:type="dxa"/>
             <w:gridSpan w:val="2"/>
           </w:tcPr>
           <w:p>
@@ -1605,7 +1596,7 @@
         <w:tc>
           <w:tcPr>
             <w:cnfStyle w:val="000010000000" w:firstRow="0" w:lastRow="0" w:firstColumn="0" w:lastColumn="0" w:oddVBand="1" w:evenVBand="0" w:oddHBand="0" w:evenHBand="0" w:firstRowFirstColumn="0" w:firstRowLastColumn="0" w:lastRowFirstColumn="0" w:lastRowLastColumn="0"/>
-            <w:tcW w:w="2268" w:type="dxa"/>
+            <w:tcW w:w="1619" w:type="dxa"/>
             <w:gridSpan w:val="2"/>
           </w:tcPr>
           <w:p>
@@ -1633,7 +1624,7 @@
         <w:tc>
           <w:tcPr>
             <w:cnfStyle w:val="000001000000" w:firstRow="0" w:lastRow="0" w:firstColumn="0" w:lastColumn="0" w:oddVBand="0" w:evenVBand="1" w:oddHBand="0" w:evenHBand="0" w:firstRowFirstColumn="0" w:firstRowLastColumn="0" w:lastRowFirstColumn="0" w:lastRowLastColumn="0"/>
-            <w:tcW w:w="2268" w:type="dxa"/>
+            <w:tcW w:w="1619" w:type="dxa"/>
             <w:gridSpan w:val="2"/>
           </w:tcPr>
           <w:p>
@@ -1661,7 +1652,7 @@
         <w:tc>
           <w:tcPr>
             <w:cnfStyle w:val="000010000000" w:firstRow="0" w:lastRow="0" w:firstColumn="0" w:lastColumn="0" w:oddVBand="1" w:evenVBand="0" w:oddHBand="0" w:evenHBand="0" w:firstRowFirstColumn="0" w:firstRowLastColumn="0" w:lastRowFirstColumn="0" w:lastRowLastColumn="0"/>
-            <w:tcW w:w="2268" w:type="dxa"/>
+            <w:tcW w:w="1183" w:type="dxa"/>
             <w:gridSpan w:val="2"/>
           </w:tcPr>
           <w:p>
@@ -1688,23 +1679,17 @@
         </w:tc>
       </w:tr>
       <w:tr>
-        <w:tblPrEx>
-          <w:tblCellMar>
-            <w:top w:w="0" w:type="dxa"/>
-            <w:left w:w="108" w:type="dxa"/>
-            <w:bottom w:w="0" w:type="dxa"/>
-            <w:right w:w="108" w:type="dxa"/>
-          </w:tblCellMar>
-        </w:tblPrEx>
         <w:trPr>
-          <w:gridAfter w:val="1"/>
           <w:cnfStyle w:val="000000100000" w:firstRow="0" w:lastRow="0" w:firstColumn="0" w:lastColumn="0" w:oddVBand="0" w:evenVBand="0" w:oddHBand="1" w:evenHBand="0" w:firstRowFirstColumn="0" w:firstRowLastColumn="0" w:lastRowFirstColumn="0" w:lastRowLastColumn="0"/>
-          <w:wAfter w:w="1438" w:type="dxa"/>
+          <w:trHeight w:val="273"/>
         </w:trPr>
         <w:tc>
           <w:tcPr>
             <w:cnfStyle w:val="001000000000" w:firstRow="0" w:lastRow="0" w:firstColumn="1" w:lastColumn="0" w:oddVBand="0" w:evenVBand="0" w:oddHBand="0" w:evenHBand="0" w:firstRowFirstColumn="0" w:firstRowLastColumn="0" w:lastRowFirstColumn="0" w:lastRowLastColumn="0"/>
-            <w:tcW w:w="3686" w:type="dxa"/>
+            <w:tcW w:w="2563" w:type="dxa"/>
+            <w:tcBorders>
+              <w:right w:val="single" w:sz="4" w:space="0" w:color="00B050"/>
+            </w:tcBorders>
           </w:tcPr>
           <w:p>
             <w:pPr>
@@ -1728,7 +1713,10 @@
         <w:tc>
           <w:tcPr>
             <w:cnfStyle w:val="000010000000" w:firstRow="0" w:lastRow="0" w:firstColumn="0" w:lastColumn="0" w:oddVBand="1" w:evenVBand="0" w:oddHBand="0" w:evenHBand="0" w:firstRowFirstColumn="0" w:firstRowLastColumn="0" w:lastRowFirstColumn="0" w:lastRowLastColumn="0"/>
-            <w:tcW w:w="850" w:type="dxa"/>
+            <w:tcW w:w="721" w:type="dxa"/>
+            <w:tcBorders>
+              <w:left w:val="single" w:sz="4" w:space="0" w:color="00B050"/>
+            </w:tcBorders>
           </w:tcPr>
           <w:p>
             <w:pPr>
@@ -1752,7 +1740,7 @@
         <w:tc>
           <w:tcPr>
             <w:cnfStyle w:val="000001000000" w:firstRow="0" w:lastRow="0" w:firstColumn="0" w:lastColumn="0" w:oddVBand="0" w:evenVBand="1" w:oddHBand="0" w:evenHBand="0" w:firstRowFirstColumn="0" w:firstRowLastColumn="0" w:lastRowFirstColumn="0" w:lastRowLastColumn="0"/>
-            <w:tcW w:w="2268" w:type="dxa"/>
+            <w:tcW w:w="1618" w:type="dxa"/>
             <w:gridSpan w:val="2"/>
           </w:tcPr>
           <w:p>
@@ -1780,7 +1768,7 @@
         <w:tc>
           <w:tcPr>
             <w:cnfStyle w:val="000010000000" w:firstRow="0" w:lastRow="0" w:firstColumn="0" w:lastColumn="0" w:oddVBand="1" w:evenVBand="0" w:oddHBand="0" w:evenHBand="0" w:firstRowFirstColumn="0" w:firstRowLastColumn="0" w:lastRowFirstColumn="0" w:lastRowLastColumn="0"/>
-            <w:tcW w:w="2268" w:type="dxa"/>
+            <w:tcW w:w="1619" w:type="dxa"/>
             <w:gridSpan w:val="2"/>
           </w:tcPr>
           <w:p>
@@ -1805,7 +1793,7 @@
         <w:tc>
           <w:tcPr>
             <w:cnfStyle w:val="000001000000" w:firstRow="0" w:lastRow="0" w:firstColumn="0" w:lastColumn="0" w:oddVBand="0" w:evenVBand="1" w:oddHBand="0" w:evenHBand="0" w:firstRowFirstColumn="0" w:firstRowLastColumn="0" w:lastRowFirstColumn="0" w:lastRowLastColumn="0"/>
-            <w:tcW w:w="2268" w:type="dxa"/>
+            <w:tcW w:w="1619" w:type="dxa"/>
             <w:gridSpan w:val="2"/>
           </w:tcPr>
           <w:p>
@@ -1833,7 +1821,7 @@
         <w:tc>
           <w:tcPr>
             <w:cnfStyle w:val="000010000000" w:firstRow="0" w:lastRow="0" w:firstColumn="0" w:lastColumn="0" w:oddVBand="1" w:evenVBand="0" w:oddHBand="0" w:evenHBand="0" w:firstRowFirstColumn="0" w:firstRowLastColumn="0" w:lastRowFirstColumn="0" w:lastRowLastColumn="0"/>
-            <w:tcW w:w="2268" w:type="dxa"/>
+            <w:tcW w:w="1183" w:type="dxa"/>
             <w:gridSpan w:val="2"/>
           </w:tcPr>
           <w:p>
@@ -1857,23 +1845,17 @@
         </w:tc>
       </w:tr>
       <w:tr>
-        <w:tblPrEx>
-          <w:tblCellMar>
-            <w:top w:w="0" w:type="dxa"/>
-            <w:left w:w="108" w:type="dxa"/>
-            <w:bottom w:w="0" w:type="dxa"/>
-            <w:right w:w="108" w:type="dxa"/>
-          </w:tblCellMar>
-        </w:tblPrEx>
         <w:trPr>
-          <w:gridAfter w:val="1"/>
           <w:cnfStyle w:val="000000010000" w:firstRow="0" w:lastRow="0" w:firstColumn="0" w:lastColumn="0" w:oddVBand="0" w:evenVBand="0" w:oddHBand="0" w:evenHBand="1" w:firstRowFirstColumn="0" w:firstRowLastColumn="0" w:lastRowFirstColumn="0" w:lastRowLastColumn="0"/>
-          <w:wAfter w:w="1438" w:type="dxa"/>
+          <w:trHeight w:val="287"/>
         </w:trPr>
         <w:tc>
           <w:tcPr>
             <w:cnfStyle w:val="001000000000" w:firstRow="0" w:lastRow="0" w:firstColumn="1" w:lastColumn="0" w:oddVBand="0" w:evenVBand="0" w:oddHBand="0" w:evenHBand="0" w:firstRowFirstColumn="0" w:firstRowLastColumn="0" w:lastRowFirstColumn="0" w:lastRowLastColumn="0"/>
-            <w:tcW w:w="3686" w:type="dxa"/>
+            <w:tcW w:w="2563" w:type="dxa"/>
+            <w:tcBorders>
+              <w:right w:val="single" w:sz="4" w:space="0" w:color="00B050"/>
+            </w:tcBorders>
           </w:tcPr>
           <w:p>
             <w:pPr>
@@ -1900,7 +1882,10 @@
         <w:tc>
           <w:tcPr>
             <w:cnfStyle w:val="000010000000" w:firstRow="0" w:lastRow="0" w:firstColumn="0" w:lastColumn="0" w:oddVBand="1" w:evenVBand="0" w:oddHBand="0" w:evenHBand="0" w:firstRowFirstColumn="0" w:firstRowLastColumn="0" w:lastRowFirstColumn="0" w:lastRowLastColumn="0"/>
-            <w:tcW w:w="850" w:type="dxa"/>
+            <w:tcW w:w="721" w:type="dxa"/>
+            <w:tcBorders>
+              <w:left w:val="single" w:sz="4" w:space="0" w:color="00B050"/>
+            </w:tcBorders>
           </w:tcPr>
           <w:p>
             <w:pPr>
@@ -1927,7 +1912,7 @@
         <w:tc>
           <w:tcPr>
             <w:cnfStyle w:val="000001000000" w:firstRow="0" w:lastRow="0" w:firstColumn="0" w:lastColumn="0" w:oddVBand="0" w:evenVBand="1" w:oddHBand="0" w:evenHBand="0" w:firstRowFirstColumn="0" w:firstRowLastColumn="0" w:lastRowFirstColumn="0" w:lastRowLastColumn="0"/>
-            <w:tcW w:w="2268" w:type="dxa"/>
+            <w:tcW w:w="1618" w:type="dxa"/>
             <w:gridSpan w:val="2"/>
           </w:tcPr>
           <w:p>
@@ -1955,7 +1940,7 @@
         <w:tc>
           <w:tcPr>
             <w:cnfStyle w:val="000010000000" w:firstRow="0" w:lastRow="0" w:firstColumn="0" w:lastColumn="0" w:oddVBand="1" w:evenVBand="0" w:oddHBand="0" w:evenHBand="0" w:firstRowFirstColumn="0" w:firstRowLastColumn="0" w:lastRowFirstColumn="0" w:lastRowLastColumn="0"/>
-            <w:tcW w:w="2268" w:type="dxa"/>
+            <w:tcW w:w="1619" w:type="dxa"/>
             <w:gridSpan w:val="2"/>
           </w:tcPr>
           <w:p>
@@ -1983,7 +1968,7 @@
         <w:tc>
           <w:tcPr>
             <w:cnfStyle w:val="000001000000" w:firstRow="0" w:lastRow="0" w:firstColumn="0" w:lastColumn="0" w:oddVBand="0" w:evenVBand="1" w:oddHBand="0" w:evenHBand="0" w:firstRowFirstColumn="0" w:firstRowLastColumn="0" w:lastRowFirstColumn="0" w:lastRowLastColumn="0"/>
-            <w:tcW w:w="2268" w:type="dxa"/>
+            <w:tcW w:w="1619" w:type="dxa"/>
             <w:gridSpan w:val="2"/>
           </w:tcPr>
           <w:p>
@@ -2011,7 +1996,7 @@
         <w:tc>
           <w:tcPr>
             <w:cnfStyle w:val="000010000000" w:firstRow="0" w:lastRow="0" w:firstColumn="0" w:lastColumn="0" w:oddVBand="1" w:evenVBand="0" w:oddHBand="0" w:evenHBand="0" w:firstRowFirstColumn="0" w:firstRowLastColumn="0" w:lastRowFirstColumn="0" w:lastRowLastColumn="0"/>
-            <w:tcW w:w="2268" w:type="dxa"/>
+            <w:tcW w:w="1183" w:type="dxa"/>
             <w:gridSpan w:val="2"/>
           </w:tcPr>
           <w:p>
@@ -2228,14 +2213,14 @@
     <w:tbl>
       <w:tblPr>
         <w:tblStyle w:val="a4"/>
-        <w:tblW w:w="5000" w:type="pct"/>
+        <w:tblW w:w="3465" w:type="pct"/>
         <w:tblCellSpacing w:w="11" w:type="dxa"/>
         <w:tblLook w:val="04A0" w:firstRow="1" w:lastRow="0" w:firstColumn="1" w:lastColumn="0" w:noHBand="0" w:noVBand="1"/>
       </w:tblPr>
       <w:tblGrid>
-        <w:gridCol w:w="2275"/>
-        <w:gridCol w:w="4099"/>
-        <w:gridCol w:w="2971"/>
+        <w:gridCol w:w="2261"/>
+        <w:gridCol w:w="2526"/>
+        <w:gridCol w:w="1689"/>
       </w:tblGrid>
       <w:tr>
         <w:trPr>
@@ -2243,7 +2228,7 @@
         </w:trPr>
         <w:tc>
           <w:tcPr>
-            <w:tcW w:w="1211" w:type="pct"/>
+            <w:tcW w:w="1738" w:type="pct"/>
           </w:tcPr>
           <w:p>
             <w:pPr>
@@ -2261,7 +2246,7 @@
         </w:tc>
         <w:tc>
           <w:tcPr>
-            <w:tcW w:w="1750" w:type="pct"/>
+            <w:tcW w:w="1947" w:type="pct"/>
             <w:vMerge w:val="restart"/>
           </w:tcPr>
           <w:p>
@@ -2280,10 +2265,11 @@
         </w:tc>
         <w:tc>
           <w:tcPr>
-            <w:tcW w:w="1587" w:type="pct"/>
-          </w:tcPr>
-          <w:p>
-            <w:pPr>
+            <w:tcW w:w="1292" w:type="pct"/>
+          </w:tcPr>
+          <w:p>
+            <w:pPr>
+              <w:ind w:right="3398"/>
               <w:rPr>
                 <w:lang w:val="en-US"/>
               </w:rPr>
@@ -2297,7 +2283,7 @@
         </w:trPr>
         <w:tc>
           <w:tcPr>
-            <w:tcW w:w="1211" w:type="pct"/>
+            <w:tcW w:w="1738" w:type="pct"/>
           </w:tcPr>
           <w:p>
             <w:pPr>
@@ -2315,14 +2301,14 @@
         </w:tc>
         <w:tc>
           <w:tcPr>
-            <w:tcW w:w="2202" w:type="pct"/>
+            <w:tcW w:w="1947" w:type="pct"/>
             <w:vMerge/>
           </w:tcPr>
           <w:p/>
         </w:tc>
         <w:tc>
           <w:tcPr>
-            <w:tcW w:w="1587" w:type="pct"/>
+            <w:tcW w:w="1292" w:type="pct"/>
           </w:tcPr>
           <w:p/>
         </w:tc>
@@ -2333,7 +2319,7 @@
         </w:trPr>
         <w:tc>
           <w:tcPr>
-            <w:tcW w:w="3413" w:type="pct"/>
+            <w:tcW w:w="3691" w:type="pct"/>
             <w:gridSpan w:val="2"/>
           </w:tcPr>
           <w:p>
@@ -2352,7 +2338,7 @@
         </w:tc>
         <w:tc>
           <w:tcPr>
-            <w:tcW w:w="1587" w:type="pct"/>
+            <w:tcW w:w="1292" w:type="pct"/>
           </w:tcPr>
           <w:p>
             <w:pPr>
@@ -2398,7 +2384,7 @@
         <v:path o:extrusionok="f" gradientshapeok="t" o:connecttype="rect"/>
         <o:lock v:ext="edit" aspectratio="t"/>
       </v:shapetype>
-      <v:shape id="_x0000_i1069" type="#_x0000_t75" style="width:483.75pt;height:438.75pt" o:bullet="t">
+      <v:shape id="_x0000_i1056" type="#_x0000_t75" style="width:483.75pt;height:438.75pt" o:bullet="t">
         <v:imagedata r:id="rId1" o:title="Red_Apple[1]"/>
       </v:shape>
     </w:pict>
@@ -4199,6 +4185,7 @@
         <w:strike w:val="0"/>
         <w:dstrike/>
       </w:rPr>
+      <w:tblPr/>
       <w:tcPr>
         <w:tcBorders>
           <w:top w:val="nil"/>

</xml_diff>

<commit_message>
Fix numeration for lists, do not forget about list item in transform
</commit_message>
<xml_diff>
--- a/tests/examples/List.docx
+++ b/tests/examples/List.docx
@@ -246,18 +246,26 @@
       <w:pPr>
         <w:pStyle w:val="a3"/>
         <w:numPr>
-          <w:ilvl w:val="3"/>
+          <w:ilvl w:val="4"/>
           <w:numId w:val="14"/>
         </w:numPr>
       </w:pPr>
+      <w:bookmarkStart w:id="0" w:name="_GoBack"/>
+      <w:bookmarkEnd w:id="0"/>
       <w:r>
         <w:t>4.?.?.2</w:t>
       </w:r>
     </w:p>
     <w:p>
-      <w:bookmarkStart w:id="0" w:name="_GoBack"/>
-      <w:bookmarkEnd w:id="0"/>
+      <w:pPr>
+        <w:pStyle w:val="a3"/>
+        <w:numPr>
+          <w:ilvl w:val="3"/>
+          <w:numId w:val="14"/>
+        </w:numPr>
+      </w:pPr>
     </w:p>
+    <w:p/>
     <w:sectPr>
       <w:pgSz w:w="11906" w:h="16838"/>
       <w:pgMar w:top="1134" w:right="850" w:bottom="1134" w:left="1701" w:header="708" w:footer="708" w:gutter="0"/>
@@ -291,7 +299,7 @@
         <v:path o:extrusionok="f" gradientshapeok="t" o:connecttype="rect"/>
         <o:lock v:ext="edit" aspectratio="t"/>
       </v:shapetype>
-      <v:shape id="_x0000_i1031" type="#_x0000_t75" style="width:483.85pt;height:438.35pt" o:bullet="t">
+      <v:shape id="_x0000_i1027" type="#_x0000_t75" style="width:484pt;height:438.5pt" o:bullet="t">
         <v:imagedata r:id="rId1" o:title="Red_Apple[1]"/>
       </v:shape>
     </w:pict>
@@ -2629,7 +2637,7 @@
 </file>
 
 <file path=customXml/itemProps1.xml><?xml version="1.0" encoding="utf-8"?>
-<ds:datastoreItem xmlns:ds="http://schemas.openxmlformats.org/officeDocument/2006/customXml" ds:itemID="{043CB9A3-0964-4703-8167-19E8493F770B}">
+<ds:datastoreItem xmlns:ds="http://schemas.openxmlformats.org/officeDocument/2006/customXml" ds:itemID="{AD33F709-EA0D-4F35-8474-A6F0895ACB9C}">
   <ds:schemaRefs>
     <ds:schemaRef ds:uri="http://schemas.openxmlformats.org/officeDocument/2006/bibliography"/>
   </ds:schemaRefs>

</xml_diff>